<commit_message>
Deduplicate common prayers in Crusade prayers 7-day docs
Link the per-day documents to the shared common-prayers and crusade-and-daily-prayers docs instead of repeating the daily prayers in full. Drop the 14 extracted page images from the booklet, which came out blank, and regenerate the for-printing DOCX files.
</commit_message>
<xml_diff>
--- a/for-printing/crusade-prayers/crusade-and-daily-prayers.docx
+++ b/for-printing/crusade-prayers/crusade-and-daily-prayers.docx
@@ -87,23 +87,6 @@
           <w:sz w:val="22"/>
           <w:szCs w:val="22"/>
         </w:rPr>
-        <w:t xml:space="preserve">Sourcing &amp; Editorial Scope</w:t>
-      </w:r>
-    </w:p>
-    <w:p>
-      <w:pPr>
-        <w:spacing w:after="40" w:before="80"/>
-        <w:ind w:left="360"/>
-      </w:pPr>
-      <w:r>
-        <w:rPr>
-          <w:rFonts w:ascii="Calibri" w:cs="Calibri" w:eastAsia="Calibri" w:hAnsi="Calibri"/>
-          <w:b/>
-          <w:bCs/>
-          <w:color w:val="1F3864"/>
-          <w:sz w:val="22"/>
-          <w:szCs w:val="22"/>
-        </w:rPr>
         <w:t xml:space="preserve">Part I: Opening Prayers</w:t>
       </w:r>
     </w:p>
@@ -1351,902 +1334,6 @@
     <w:p>
       <w:r>
         <w:br w:type="page"/>
-      </w:r>
-    </w:p>
-    <w:p>
-      <w:pPr>
-        <w:pBdr>
-          <w:bottom w:val="single" w:color="B4C6E7" w:sz="1"/>
-        </w:pBdr>
-        <w:spacing w:after="200" w:before="200"/>
-      </w:pPr>
-    </w:p>
-    <w:p>
-      <w:pPr>
-        <w:pStyle w:val="Heading2"/>
-        <w:spacing w:after="120" w:before="360"/>
-      </w:pPr>
-      <w:r>
-        <w:rPr>
-          <w:rFonts w:ascii="Calibri" w:cs="Calibri" w:eastAsia="Calibri" w:hAnsi="Calibri"/>
-          <w:b/>
-          <w:bCs/>
-          <w:color w:val="1F3864"/>
-          <w:sz w:val="32"/>
-          <w:szCs w:val="32"/>
-        </w:rPr>
-        <w:t xml:space="preserve">Sourcing &amp; Editorial Scope</w:t>
-      </w:r>
-    </w:p>
-    <w:p>
-      <w:pPr>
-        <w:spacing w:after="40" w:before="40"/>
-        <w:ind w:left="720"/>
-      </w:pPr>
-      <w:r>
-        <w:rPr>
-          <w:rFonts w:ascii="Calibri" w:cs="Calibri" w:eastAsia="Calibri" w:hAnsi="Calibri"/>
-          <w:sz w:val="22"/>
-          <w:szCs w:val="22"/>
-        </w:rPr>
-        <w:t xml:space="preserve">•  </w:t>
-      </w:r>
-      <w:r>
-        <w:rPr>
-          <w:rFonts w:ascii="Calibri" w:cs="Calibri" w:eastAsia="Calibri" w:hAnsi="Calibri"/>
-          <w:b/>
-          <w:bCs/>
-          <w:i w:val="false"/>
-          <w:iCs w:val="false"/>
-          <w:sz w:val="22"/>
-          <w:szCs w:val="22"/>
-        </w:rPr>
-        <w:t xml:space="preserve">Source Document:</w:t>
-      </w:r>
-      <w:r>
-        <w:rPr>
-          <w:rFonts w:ascii="Calibri" w:cs="Calibri" w:eastAsia="Calibri" w:hAnsi="Calibri"/>
-          <w:b w:val="false"/>
-          <w:bCs w:val="false"/>
-          <w:i w:val="false"/>
-          <w:iCs w:val="false"/>
-          <w:sz w:val="22"/>
-          <w:szCs w:val="22"/>
-        </w:rPr>
-        <w:t xml:space="preserve"> the promoter booklet </w:t>
-      </w:r>
-      <w:r>
-        <w:rPr>
-          <w:rFonts w:ascii="Calibri" w:cs="Calibri" w:eastAsia="Calibri" w:hAnsi="Calibri"/>
-          <w:b w:val="false"/>
-          <w:bCs w:val="false"/>
-          <w:i/>
-          <w:iCs/>
-          <w:color w:val="2E75B6"/>
-          <w:sz w:val="22"/>
-          <w:szCs w:val="22"/>
-          <w:u w:val="single"/>
-        </w:rPr>
-        <w:t xml:space="preserve">cp-2015-regularsize-8x11.docx</w:t>
-      </w:r>
-      <w:r>
-        <w:rPr>
-          <w:rFonts w:ascii="Calibri" w:cs="Calibri" w:eastAsia="Calibri" w:hAnsi="Calibri"/>
-          <w:b w:val="false"/>
-          <w:bCs w:val="false"/>
-          <w:i w:val="false"/>
-          <w:iCs w:val="false"/>
-          <w:sz w:val="22"/>
-          <w:szCs w:val="22"/>
-        </w:rPr>
-        <w:t xml:space="preserve"> (Version 01.22.15.b – 6.5 x 9.25).</w:t>
-      </w:r>
-    </w:p>
-    <w:p>
-      <w:pPr>
-        <w:spacing w:after="40" w:before="40"/>
-        <w:ind w:left="720"/>
-      </w:pPr>
-      <w:r>
-        <w:rPr>
-          <w:rFonts w:ascii="Calibri" w:cs="Calibri" w:eastAsia="Calibri" w:hAnsi="Calibri"/>
-          <w:sz w:val="22"/>
-          <w:szCs w:val="22"/>
-        </w:rPr>
-        <w:t xml:space="preserve">•  </w:t>
-      </w:r>
-      <w:r>
-        <w:rPr>
-          <w:rFonts w:ascii="Calibri" w:cs="Calibri" w:eastAsia="Calibri" w:hAnsi="Calibri"/>
-          <w:b/>
-          <w:bCs/>
-          <w:i w:val="false"/>
-          <w:iCs w:val="false"/>
-          <w:sz w:val="22"/>
-          <w:szCs w:val="22"/>
-        </w:rPr>
-        <w:t xml:space="preserve">Booklet Notice:</w:t>
-      </w:r>
-      <w:r>
-        <w:rPr>
-          <w:rFonts w:ascii="Calibri" w:cs="Calibri" w:eastAsia="Calibri" w:hAnsi="Calibri"/>
-          <w:b w:val="false"/>
-          <w:bCs w:val="false"/>
-          <w:i w:val="false"/>
-          <w:iCs w:val="false"/>
-          <w:sz w:val="22"/>
-          <w:szCs w:val="22"/>
-        </w:rPr>
-        <w:t xml:space="preserve"> On page 1, the compiler explicitly notes: </w:t>
-      </w:r>
-      <w:r>
-        <w:rPr>
-          <w:rFonts w:ascii="Consolas" w:cs="Consolas" w:eastAsia="Consolas" w:hAnsi="Consolas"/>
-          <w:b w:val="false"/>
-          <w:bCs w:val="false"/>
-          <w:sz w:val="20"/>
-          <w:szCs w:val="20"/>
-          <w:shd w:fill="F5F5F5" w:color="F5F5F5" w:val="solid"/>
-        </w:rPr>
-        <w:t xml:space="preserve">(Prayers that should be said daily are in red text)</w:t>
-      </w:r>
-      <w:r>
-        <w:rPr>
-          <w:rFonts w:ascii="Calibri" w:cs="Calibri" w:eastAsia="Calibri" w:hAnsi="Calibri"/>
-          <w:b w:val="false"/>
-          <w:bCs w:val="false"/>
-          <w:i w:val="false"/>
-          <w:iCs w:val="false"/>
-          <w:sz w:val="22"/>
-          <w:szCs w:val="22"/>
-        </w:rPr>
-        <w:t xml:space="preserve">.</w:t>
-      </w:r>
-    </w:p>
-    <w:p>
-      <w:pPr>
-        <w:spacing w:after="40" w:before="40"/>
-        <w:ind w:left="720"/>
-      </w:pPr>
-      <w:r>
-        <w:rPr>
-          <w:rFonts w:ascii="Calibri" w:cs="Calibri" w:eastAsia="Calibri" w:hAnsi="Calibri"/>
-          <w:sz w:val="22"/>
-          <w:szCs w:val="22"/>
-        </w:rPr>
-        <w:t xml:space="preserve">•  </w:t>
-      </w:r>
-      <w:r>
-        <w:rPr>
-          <w:rFonts w:ascii="Calibri" w:cs="Calibri" w:eastAsia="Calibri" w:hAnsi="Calibri"/>
-          <w:b/>
-          <w:bCs/>
-          <w:i w:val="false"/>
-          <w:iCs w:val="false"/>
-          <w:sz w:val="22"/>
-          <w:szCs w:val="22"/>
-        </w:rPr>
-        <w:t xml:space="preserve">Editorial Selection:</w:t>
-      </w:r>
-      <w:r>
-        <w:rPr>
-          <w:rFonts w:ascii="Calibri" w:cs="Calibri" w:eastAsia="Calibri" w:hAnsi="Calibri"/>
-          <w:b w:val="false"/>
-          <w:bCs w:val="false"/>
-          <w:i w:val="false"/>
-          <w:iCs w:val="false"/>
-          <w:sz w:val="22"/>
-          <w:szCs w:val="22"/>
-        </w:rPr>
-        <w:t xml:space="preserve"> In accordance with this directive, this document provides the complete preparatory devotions (Opening Prayers, Divine Mercy Chaplet, Holy Rosary and Fatima Prayers, Litany Prayers 1–6, and the "Other Prayers Received" appendix) while </w:t>
-      </w:r>
-      <w:r>
-        <w:rPr>
-          <w:rFonts w:ascii="Calibri" w:cs="Calibri" w:eastAsia="Calibri" w:hAnsi="Calibri"/>
-          <w:b/>
-          <w:bCs/>
-          <w:i w:val="false"/>
-          <w:iCs w:val="false"/>
-          <w:sz w:val="22"/>
-          <w:szCs w:val="22"/>
-        </w:rPr>
-        <w:t xml:space="preserve">filtering the main numbered Crusade Prayers (1–170) exclusively to those highlighted in red text for daily recitation</w:t>
-      </w:r>
-      <w:r>
-        <w:rPr>
-          <w:rFonts w:ascii="Calibri" w:cs="Calibri" w:eastAsia="Calibri" w:hAnsi="Calibri"/>
-          <w:b w:val="false"/>
-          <w:bCs w:val="false"/>
-          <w:i w:val="false"/>
-          <w:iCs w:val="false"/>
-          <w:sz w:val="22"/>
-          <w:szCs w:val="22"/>
-        </w:rPr>
-        <w:t xml:space="preserve">.</w:t>
-      </w:r>
-    </w:p>
-    <w:p>
-      <w:pPr>
-        <w:spacing w:after="40" w:before="40"/>
-        <w:ind w:left="720"/>
-      </w:pPr>
-      <w:r>
-        <w:rPr>
-          <w:rFonts w:ascii="Calibri" w:cs="Calibri" w:eastAsia="Calibri" w:hAnsi="Calibri"/>
-          <w:sz w:val="22"/>
-          <w:szCs w:val="22"/>
-        </w:rPr>
-        <w:t xml:space="preserve">•  </w:t>
-      </w:r>
-      <w:r>
-        <w:rPr>
-          <w:rFonts w:ascii="Calibri" w:cs="Calibri" w:eastAsia="Calibri" w:hAnsi="Calibri"/>
-          <w:b/>
-          <w:bCs/>
-          <w:i w:val="false"/>
-          <w:iCs w:val="false"/>
-          <w:sz w:val="22"/>
-          <w:szCs w:val="22"/>
-        </w:rPr>
-        <w:t xml:space="preserve">Daily Crusade Prayers Included (17 in total):</w:t>
-      </w:r>
-    </w:p>
-    <w:p>
-      <w:pPr>
-        <w:spacing w:after="40" w:before="40"/>
-        <w:ind w:left="1080"/>
-      </w:pPr>
-      <w:r>
-        <w:rPr>
-          <w:rFonts w:ascii="Calibri" w:cs="Calibri" w:eastAsia="Calibri" w:hAnsi="Calibri"/>
-          <w:sz w:val="22"/>
-          <w:szCs w:val="22"/>
-        </w:rPr>
-        <w:t xml:space="preserve">•  </w:t>
-      </w:r>
-      <w:r>
-        <w:rPr>
-          <w:rFonts w:ascii="Calibri" w:cs="Calibri" w:eastAsia="Calibri" w:hAnsi="Calibri"/>
-          <w:b w:val="false"/>
-          <w:bCs w:val="false"/>
-          <w:i w:val="false"/>
-          <w:iCs w:val="false"/>
-          <w:sz w:val="22"/>
-          <w:szCs w:val="22"/>
-        </w:rPr>
-        <w:t xml:space="preserve">Crusade of Prayer (1): </w:t>
-      </w:r>
-      <w:r>
-        <w:rPr>
-          <w:rFonts w:ascii="Calibri" w:cs="Calibri" w:eastAsia="Calibri" w:hAnsi="Calibri"/>
-          <w:b w:val="false"/>
-          <w:bCs w:val="false"/>
-          <w:i/>
-          <w:iCs/>
-          <w:sz w:val="22"/>
-          <w:szCs w:val="22"/>
-        </w:rPr>
-        <w:t xml:space="preserve">“My Gift to Jesus to Save Souls”</w:t>
-      </w:r>
-    </w:p>
-    <w:p>
-      <w:pPr>
-        <w:spacing w:after="40" w:before="40"/>
-        <w:ind w:left="1080"/>
-      </w:pPr>
-      <w:r>
-        <w:rPr>
-          <w:rFonts w:ascii="Calibri" w:cs="Calibri" w:eastAsia="Calibri" w:hAnsi="Calibri"/>
-          <w:sz w:val="22"/>
-          <w:szCs w:val="22"/>
-        </w:rPr>
-        <w:t xml:space="preserve">•  </w:t>
-      </w:r>
-      <w:r>
-        <w:rPr>
-          <w:rFonts w:ascii="Calibri" w:cs="Calibri" w:eastAsia="Calibri" w:hAnsi="Calibri"/>
-          <w:b w:val="false"/>
-          <w:bCs w:val="false"/>
-          <w:i w:val="false"/>
-          <w:iCs w:val="false"/>
-          <w:sz w:val="22"/>
-          <w:szCs w:val="22"/>
-        </w:rPr>
-        <w:t xml:space="preserve">Crusade of Prayer (13): </w:t>
-      </w:r>
-      <w:r>
-        <w:rPr>
-          <w:rFonts w:ascii="Calibri" w:cs="Calibri" w:eastAsia="Calibri" w:hAnsi="Calibri"/>
-          <w:b w:val="false"/>
-          <w:bCs w:val="false"/>
-          <w:i/>
-          <w:iCs/>
-          <w:sz w:val="22"/>
-          <w:szCs w:val="22"/>
-        </w:rPr>
-        <w:t xml:space="preserve">Prayer calling for immunity</w:t>
-      </w:r>
-    </w:p>
-    <w:p>
-      <w:pPr>
-        <w:spacing w:after="40" w:before="40"/>
-        <w:ind w:left="1080"/>
-      </w:pPr>
-      <w:r>
-        <w:rPr>
-          <w:rFonts w:ascii="Calibri" w:cs="Calibri" w:eastAsia="Calibri" w:hAnsi="Calibri"/>
-          <w:sz w:val="22"/>
-          <w:szCs w:val="22"/>
-        </w:rPr>
-        <w:t xml:space="preserve">•  </w:t>
-      </w:r>
-      <w:r>
-        <w:rPr>
-          <w:rFonts w:ascii="Calibri" w:cs="Calibri" w:eastAsia="Calibri" w:hAnsi="Calibri"/>
-          <w:b w:val="false"/>
-          <w:bCs w:val="false"/>
-          <w:i w:val="false"/>
-          <w:iCs w:val="false"/>
-          <w:sz w:val="22"/>
-          <w:szCs w:val="22"/>
-        </w:rPr>
-        <w:t xml:space="preserve">Crusade of Prayer (24): </w:t>
-      </w:r>
-      <w:r>
-        <w:rPr>
-          <w:rFonts w:ascii="Calibri" w:cs="Calibri" w:eastAsia="Calibri" w:hAnsi="Calibri"/>
-          <w:b w:val="false"/>
-          <w:bCs w:val="false"/>
-          <w:i/>
-          <w:iCs/>
-          <w:sz w:val="22"/>
-          <w:szCs w:val="22"/>
-        </w:rPr>
-        <w:t xml:space="preserve">Plenary Indulgence for Absolution</w:t>
-      </w:r>
-    </w:p>
-    <w:p>
-      <w:pPr>
-        <w:spacing w:after="40" w:before="40"/>
-        <w:ind w:left="1080"/>
-      </w:pPr>
-      <w:r>
-        <w:rPr>
-          <w:rFonts w:ascii="Calibri" w:cs="Calibri" w:eastAsia="Calibri" w:hAnsi="Calibri"/>
-          <w:sz w:val="22"/>
-          <w:szCs w:val="22"/>
-        </w:rPr>
-        <w:t xml:space="preserve">•  </w:t>
-      </w:r>
-      <w:r>
-        <w:rPr>
-          <w:rFonts w:ascii="Calibri" w:cs="Calibri" w:eastAsia="Calibri" w:hAnsi="Calibri"/>
-          <w:b w:val="false"/>
-          <w:bCs w:val="false"/>
-          <w:i w:val="false"/>
-          <w:iCs w:val="false"/>
-          <w:sz w:val="22"/>
-          <w:szCs w:val="22"/>
-        </w:rPr>
-        <w:t xml:space="preserve">Crusade of Prayer (30): </w:t>
-      </w:r>
-      <w:r>
-        <w:rPr>
-          <w:rFonts w:ascii="Calibri" w:cs="Calibri" w:eastAsia="Calibri" w:hAnsi="Calibri"/>
-          <w:b w:val="false"/>
-          <w:bCs w:val="false"/>
-          <w:i/>
-          <w:iCs/>
-          <w:sz w:val="22"/>
-          <w:szCs w:val="22"/>
-        </w:rPr>
-        <w:t xml:space="preserve">Prayer to avert war, famine and religious persecution</w:t>
-      </w:r>
-    </w:p>
-    <w:p>
-      <w:pPr>
-        <w:spacing w:after="40" w:before="40"/>
-        <w:ind w:left="1080"/>
-      </w:pPr>
-      <w:r>
-        <w:rPr>
-          <w:rFonts w:ascii="Calibri" w:cs="Calibri" w:eastAsia="Calibri" w:hAnsi="Calibri"/>
-          <w:sz w:val="22"/>
-          <w:szCs w:val="22"/>
-        </w:rPr>
-        <w:t xml:space="preserve">•  </w:t>
-      </w:r>
-      <w:r>
-        <w:rPr>
-          <w:rFonts w:ascii="Calibri" w:cs="Calibri" w:eastAsia="Calibri" w:hAnsi="Calibri"/>
-          <w:b w:val="false"/>
-          <w:bCs w:val="false"/>
-          <w:i w:val="false"/>
-          <w:iCs w:val="false"/>
-          <w:sz w:val="22"/>
-          <w:szCs w:val="22"/>
-        </w:rPr>
-        <w:t xml:space="preserve">Crusade of Prayer (33): </w:t>
-      </w:r>
-      <w:r>
-        <w:rPr>
-          <w:rFonts w:ascii="Calibri" w:cs="Calibri" w:eastAsia="Calibri" w:hAnsi="Calibri"/>
-          <w:b w:val="false"/>
-          <w:bCs w:val="false"/>
-          <w:i/>
-          <w:iCs/>
-          <w:sz w:val="22"/>
-          <w:szCs w:val="22"/>
-        </w:rPr>
-        <w:t xml:space="preserve">Rise now and accept the Seal of the Living God</w:t>
-      </w:r>
-    </w:p>
-    <w:p>
-      <w:pPr>
-        <w:spacing w:after="40" w:before="40"/>
-        <w:ind w:left="1080"/>
-      </w:pPr>
-      <w:r>
-        <w:rPr>
-          <w:rFonts w:ascii="Calibri" w:cs="Calibri" w:eastAsia="Calibri" w:hAnsi="Calibri"/>
-          <w:sz w:val="22"/>
-          <w:szCs w:val="22"/>
-        </w:rPr>
-        <w:t xml:space="preserve">•  </w:t>
-      </w:r>
-      <w:r>
-        <w:rPr>
-          <w:rFonts w:ascii="Calibri" w:cs="Calibri" w:eastAsia="Calibri" w:hAnsi="Calibri"/>
-          <w:b w:val="false"/>
-          <w:bCs w:val="false"/>
-          <w:i w:val="false"/>
-          <w:iCs w:val="false"/>
-          <w:sz w:val="22"/>
-          <w:szCs w:val="22"/>
-        </w:rPr>
-        <w:t xml:space="preserve">Crusade Prayer (79): </w:t>
-      </w:r>
-      <w:r>
-        <w:rPr>
-          <w:rFonts w:ascii="Calibri" w:cs="Calibri" w:eastAsia="Calibri" w:hAnsi="Calibri"/>
-          <w:b w:val="false"/>
-          <w:bCs w:val="false"/>
-          <w:i/>
-          <w:iCs/>
-          <w:sz w:val="22"/>
-          <w:szCs w:val="22"/>
-        </w:rPr>
-        <w:t xml:space="preserve">For 2 Billion Lost Souls</w:t>
-      </w:r>
-    </w:p>
-    <w:p>
-      <w:pPr>
-        <w:spacing w:after="40" w:before="40"/>
-        <w:ind w:left="1080"/>
-      </w:pPr>
-      <w:r>
-        <w:rPr>
-          <w:rFonts w:ascii="Calibri" w:cs="Calibri" w:eastAsia="Calibri" w:hAnsi="Calibri"/>
-          <w:sz w:val="22"/>
-          <w:szCs w:val="22"/>
-        </w:rPr>
-        <w:t xml:space="preserve">•  </w:t>
-      </w:r>
-      <w:r>
-        <w:rPr>
-          <w:rFonts w:ascii="Calibri" w:cs="Calibri" w:eastAsia="Calibri" w:hAnsi="Calibri"/>
-          <w:b w:val="false"/>
-          <w:bCs w:val="false"/>
-          <w:i w:val="false"/>
-          <w:iCs w:val="false"/>
-          <w:sz w:val="22"/>
-          <w:szCs w:val="22"/>
-        </w:rPr>
-        <w:t xml:space="preserve">Crusade Prayer (84): </w:t>
-      </w:r>
-      <w:r>
-        <w:rPr>
-          <w:rFonts w:ascii="Calibri" w:cs="Calibri" w:eastAsia="Calibri" w:hAnsi="Calibri"/>
-          <w:b w:val="false"/>
-          <w:bCs w:val="false"/>
-          <w:i/>
-          <w:iCs/>
-          <w:sz w:val="22"/>
-          <w:szCs w:val="22"/>
-        </w:rPr>
-        <w:t xml:space="preserve">To enlighten the souls of the elites who rule the world</w:t>
-      </w:r>
-    </w:p>
-    <w:p>
-      <w:pPr>
-        <w:spacing w:after="40" w:before="40"/>
-        <w:ind w:left="1080"/>
-      </w:pPr>
-      <w:r>
-        <w:rPr>
-          <w:rFonts w:ascii="Calibri" w:cs="Calibri" w:eastAsia="Calibri" w:hAnsi="Calibri"/>
-          <w:sz w:val="22"/>
-          <w:szCs w:val="22"/>
-        </w:rPr>
-        <w:t xml:space="preserve">•  </w:t>
-      </w:r>
-      <w:r>
-        <w:rPr>
-          <w:rFonts w:ascii="Calibri" w:cs="Calibri" w:eastAsia="Calibri" w:hAnsi="Calibri"/>
-          <w:b w:val="false"/>
-          <w:bCs w:val="false"/>
-          <w:i w:val="false"/>
-          <w:iCs w:val="false"/>
-          <w:sz w:val="22"/>
-          <w:szCs w:val="22"/>
-        </w:rPr>
-        <w:t xml:space="preserve">Crusade Prayer (96): </w:t>
-      </w:r>
-      <w:r>
-        <w:rPr>
-          <w:rFonts w:ascii="Calibri" w:cs="Calibri" w:eastAsia="Calibri" w:hAnsi="Calibri"/>
-          <w:b w:val="false"/>
-          <w:bCs w:val="false"/>
-          <w:i/>
-          <w:iCs/>
-          <w:sz w:val="22"/>
-          <w:szCs w:val="22"/>
-        </w:rPr>
-        <w:t xml:space="preserve">To Bless and Protect our Crusade Prayer Group</w:t>
-      </w:r>
-      <w:r>
-        <w:rPr>
-          <w:rFonts w:ascii="Calibri" w:cs="Calibri" w:eastAsia="Calibri" w:hAnsi="Calibri"/>
-          <w:b w:val="false"/>
-          <w:bCs w:val="false"/>
-          <w:i w:val="false"/>
-          <w:iCs w:val="false"/>
-          <w:sz w:val="22"/>
-          <w:szCs w:val="22"/>
-        </w:rPr>
-        <w:t xml:space="preserve"> (included in Opening Prayers and in the numbered series)</w:t>
-      </w:r>
-    </w:p>
-    <w:p>
-      <w:pPr>
-        <w:spacing w:after="40" w:before="40"/>
-        <w:ind w:left="1080"/>
-      </w:pPr>
-      <w:r>
-        <w:rPr>
-          <w:rFonts w:ascii="Calibri" w:cs="Calibri" w:eastAsia="Calibri" w:hAnsi="Calibri"/>
-          <w:sz w:val="22"/>
-          <w:szCs w:val="22"/>
-        </w:rPr>
-        <w:t xml:space="preserve">•  </w:t>
-      </w:r>
-      <w:r>
-        <w:rPr>
-          <w:rFonts w:ascii="Calibri" w:cs="Calibri" w:eastAsia="Calibri" w:hAnsi="Calibri"/>
-          <w:b w:val="false"/>
-          <w:bCs w:val="false"/>
-          <w:i w:val="false"/>
-          <w:iCs w:val="false"/>
-          <w:sz w:val="22"/>
-          <w:szCs w:val="22"/>
-        </w:rPr>
-        <w:t xml:space="preserve">Crusade Prayer (102): </w:t>
-      </w:r>
-      <w:r>
-        <w:rPr>
-          <w:rFonts w:ascii="Calibri" w:cs="Calibri" w:eastAsia="Calibri" w:hAnsi="Calibri"/>
-          <w:b w:val="false"/>
-          <w:bCs w:val="false"/>
-          <w:i/>
-          <w:iCs/>
-          <w:sz w:val="22"/>
-          <w:szCs w:val="22"/>
-        </w:rPr>
-        <w:t xml:space="preserve">To sustain faith and belief in God’s Message for the world</w:t>
-      </w:r>
-    </w:p>
-    <w:p>
-      <w:pPr>
-        <w:spacing w:after="40" w:before="40"/>
-        <w:ind w:left="1080"/>
-      </w:pPr>
-      <w:r>
-        <w:rPr>
-          <w:rFonts w:ascii="Calibri" w:cs="Calibri" w:eastAsia="Calibri" w:hAnsi="Calibri"/>
-          <w:sz w:val="22"/>
-          <w:szCs w:val="22"/>
-        </w:rPr>
-        <w:t xml:space="preserve">•  </w:t>
-      </w:r>
-      <w:r>
-        <w:rPr>
-          <w:rFonts w:ascii="Calibri" w:cs="Calibri" w:eastAsia="Calibri" w:hAnsi="Calibri"/>
-          <w:b w:val="false"/>
-          <w:bCs w:val="false"/>
-          <w:i w:val="false"/>
-          <w:iCs w:val="false"/>
-          <w:sz w:val="22"/>
-          <w:szCs w:val="22"/>
-        </w:rPr>
-        <w:t xml:space="preserve">Crusade Prayer (103): </w:t>
-      </w:r>
-      <w:r>
-        <w:rPr>
-          <w:rFonts w:ascii="Calibri" w:cs="Calibri" w:eastAsia="Calibri" w:hAnsi="Calibri"/>
-          <w:b w:val="false"/>
-          <w:bCs w:val="false"/>
-          <w:i/>
-          <w:iCs/>
-          <w:sz w:val="22"/>
-          <w:szCs w:val="22"/>
-        </w:rPr>
-        <w:t xml:space="preserve">To share the Cup of Suffering with Christ</w:t>
-      </w:r>
-    </w:p>
-    <w:p>
-      <w:pPr>
-        <w:spacing w:after="40" w:before="40"/>
-        <w:ind w:left="1080"/>
-      </w:pPr>
-      <w:r>
-        <w:rPr>
-          <w:rFonts w:ascii="Calibri" w:cs="Calibri" w:eastAsia="Calibri" w:hAnsi="Calibri"/>
-          <w:sz w:val="22"/>
-          <w:szCs w:val="22"/>
-        </w:rPr>
-        <w:t xml:space="preserve">•  </w:t>
-      </w:r>
-      <w:r>
-        <w:rPr>
-          <w:rFonts w:ascii="Calibri" w:cs="Calibri" w:eastAsia="Calibri" w:hAnsi="Calibri"/>
-          <w:b w:val="false"/>
-          <w:bCs w:val="false"/>
-          <w:i w:val="false"/>
-          <w:iCs w:val="false"/>
-          <w:sz w:val="22"/>
-          <w:szCs w:val="22"/>
-        </w:rPr>
-        <w:t xml:space="preserve">Crusade Prayer (104): </w:t>
-      </w:r>
-      <w:r>
-        <w:rPr>
-          <w:rFonts w:ascii="Calibri" w:cs="Calibri" w:eastAsia="Calibri" w:hAnsi="Calibri"/>
-          <w:b w:val="false"/>
-          <w:bCs w:val="false"/>
-          <w:i/>
-          <w:iCs/>
-          <w:sz w:val="22"/>
-          <w:szCs w:val="22"/>
-        </w:rPr>
-        <w:t xml:space="preserve">Free this soul from slavery</w:t>
-      </w:r>
-    </w:p>
-    <w:p>
-      <w:pPr>
-        <w:spacing w:after="40" w:before="40"/>
-        <w:ind w:left="1080"/>
-      </w:pPr>
-      <w:r>
-        <w:rPr>
-          <w:rFonts w:ascii="Calibri" w:cs="Calibri" w:eastAsia="Calibri" w:hAnsi="Calibri"/>
-          <w:sz w:val="22"/>
-          <w:szCs w:val="22"/>
-        </w:rPr>
-        <w:t xml:space="preserve">•  </w:t>
-      </w:r>
-      <w:r>
-        <w:rPr>
-          <w:rFonts w:ascii="Calibri" w:cs="Calibri" w:eastAsia="Calibri" w:hAnsi="Calibri"/>
-          <w:b w:val="false"/>
-          <w:bCs w:val="false"/>
-          <w:i w:val="false"/>
-          <w:iCs w:val="false"/>
-          <w:sz w:val="22"/>
-          <w:szCs w:val="22"/>
-        </w:rPr>
-        <w:t xml:space="preserve">Crusade Prayer (105): </w:t>
-      </w:r>
-      <w:r>
-        <w:rPr>
-          <w:rFonts w:ascii="Calibri" w:cs="Calibri" w:eastAsia="Calibri" w:hAnsi="Calibri"/>
-          <w:b w:val="false"/>
-          <w:bCs w:val="false"/>
-          <w:i/>
-          <w:iCs/>
-          <w:sz w:val="22"/>
-          <w:szCs w:val="22"/>
-        </w:rPr>
-        <w:t xml:space="preserve">Gift of Conversion for Others</w:t>
-      </w:r>
-    </w:p>
-    <w:p>
-      <w:pPr>
-        <w:spacing w:after="40" w:before="40"/>
-        <w:ind w:left="1080"/>
-      </w:pPr>
-      <w:r>
-        <w:rPr>
-          <w:rFonts w:ascii="Calibri" w:cs="Calibri" w:eastAsia="Calibri" w:hAnsi="Calibri"/>
-          <w:sz w:val="22"/>
-          <w:szCs w:val="22"/>
-        </w:rPr>
-        <w:t xml:space="preserve">•  </w:t>
-      </w:r>
-      <w:r>
-        <w:rPr>
-          <w:rFonts w:ascii="Calibri" w:cs="Calibri" w:eastAsia="Calibri" w:hAnsi="Calibri"/>
-          <w:b w:val="false"/>
-          <w:bCs w:val="false"/>
-          <w:i w:val="false"/>
-          <w:iCs w:val="false"/>
-          <w:sz w:val="22"/>
-          <w:szCs w:val="22"/>
-        </w:rPr>
-        <w:t xml:space="preserve">Crusade Prayer (111): </w:t>
-      </w:r>
-      <w:r>
-        <w:rPr>
-          <w:rFonts w:ascii="Calibri" w:cs="Calibri" w:eastAsia="Calibri" w:hAnsi="Calibri"/>
-          <w:b w:val="false"/>
-          <w:bCs w:val="false"/>
-          <w:i/>
-          <w:iCs/>
-          <w:sz w:val="22"/>
-          <w:szCs w:val="22"/>
-        </w:rPr>
-        <w:t xml:space="preserve">To consecrate your children to Jesus Christ</w:t>
-      </w:r>
-    </w:p>
-    <w:p>
-      <w:pPr>
-        <w:spacing w:after="40" w:before="40"/>
-        <w:ind w:left="1080"/>
-      </w:pPr>
-      <w:r>
-        <w:rPr>
-          <w:rFonts w:ascii="Calibri" w:cs="Calibri" w:eastAsia="Calibri" w:hAnsi="Calibri"/>
-          <w:sz w:val="22"/>
-          <w:szCs w:val="22"/>
-        </w:rPr>
-        <w:t xml:space="preserve">•  </w:t>
-      </w:r>
-      <w:r>
-        <w:rPr>
-          <w:rFonts w:ascii="Calibri" w:cs="Calibri" w:eastAsia="Calibri" w:hAnsi="Calibri"/>
-          <w:b w:val="false"/>
-          <w:bCs w:val="false"/>
-          <w:i w:val="false"/>
-          <w:iCs w:val="false"/>
-          <w:sz w:val="22"/>
-          <w:szCs w:val="22"/>
-        </w:rPr>
-        <w:t xml:space="preserve">Crusade Prayer (120): </w:t>
-      </w:r>
-      <w:r>
-        <w:rPr>
-          <w:rFonts w:ascii="Calibri" w:cs="Calibri" w:eastAsia="Calibri" w:hAnsi="Calibri"/>
-          <w:b w:val="false"/>
-          <w:bCs w:val="false"/>
-          <w:i/>
-          <w:iCs/>
-          <w:sz w:val="22"/>
-          <w:szCs w:val="22"/>
-        </w:rPr>
-        <w:t xml:space="preserve">Stop the Spread of War</w:t>
-      </w:r>
-    </w:p>
-    <w:p>
-      <w:pPr>
-        <w:spacing w:after="40" w:before="40"/>
-        <w:ind w:left="1080"/>
-      </w:pPr>
-      <w:r>
-        <w:rPr>
-          <w:rFonts w:ascii="Calibri" w:cs="Calibri" w:eastAsia="Calibri" w:hAnsi="Calibri"/>
-          <w:sz w:val="22"/>
-          <w:szCs w:val="22"/>
-        </w:rPr>
-        <w:t xml:space="preserve">•  </w:t>
-      </w:r>
-      <w:r>
-        <w:rPr>
-          <w:rFonts w:ascii="Calibri" w:cs="Calibri" w:eastAsia="Calibri" w:hAnsi="Calibri"/>
-          <w:b w:val="false"/>
-          <w:bCs w:val="false"/>
-          <w:i w:val="false"/>
-          <w:iCs w:val="false"/>
-          <w:sz w:val="22"/>
-          <w:szCs w:val="22"/>
-        </w:rPr>
-        <w:t xml:space="preserve">Crusade Prayer (122): </w:t>
-      </w:r>
-      <w:r>
-        <w:rPr>
-          <w:rFonts w:ascii="Calibri" w:cs="Calibri" w:eastAsia="Calibri" w:hAnsi="Calibri"/>
-          <w:b w:val="false"/>
-          <w:bCs w:val="false"/>
-          <w:i/>
-          <w:iCs/>
-          <w:sz w:val="22"/>
-          <w:szCs w:val="22"/>
-        </w:rPr>
-        <w:t xml:space="preserve">For the consecration to the Precious Blood of Jesus Christ</w:t>
-      </w:r>
-    </w:p>
-    <w:p>
-      <w:pPr>
-        <w:spacing w:after="40" w:before="40"/>
-        <w:ind w:left="1080"/>
-      </w:pPr>
-      <w:r>
-        <w:rPr>
-          <w:rFonts w:ascii="Calibri" w:cs="Calibri" w:eastAsia="Calibri" w:hAnsi="Calibri"/>
-          <w:sz w:val="22"/>
-          <w:szCs w:val="22"/>
-        </w:rPr>
-        <w:t xml:space="preserve">•  </w:t>
-      </w:r>
-      <w:r>
-        <w:rPr>
-          <w:rFonts w:ascii="Calibri" w:cs="Calibri" w:eastAsia="Calibri" w:hAnsi="Calibri"/>
-          <w:b w:val="false"/>
-          <w:bCs w:val="false"/>
-          <w:i w:val="false"/>
-          <w:iCs w:val="false"/>
-          <w:sz w:val="22"/>
-          <w:szCs w:val="22"/>
-        </w:rPr>
-        <w:t xml:space="preserve">Crusade Prayer (130): </w:t>
-      </w:r>
-      <w:r>
-        <w:rPr>
-          <w:rFonts w:ascii="Calibri" w:cs="Calibri" w:eastAsia="Calibri" w:hAnsi="Calibri"/>
-          <w:b w:val="false"/>
-          <w:bCs w:val="false"/>
-          <w:i/>
-          <w:iCs/>
-          <w:sz w:val="22"/>
-          <w:szCs w:val="22"/>
-        </w:rPr>
-        <w:t xml:space="preserve">Novena of Salvation Crusade Prayer</w:t>
-      </w:r>
-    </w:p>
-    <w:p>
-      <w:pPr>
-        <w:spacing w:after="40" w:before="40"/>
-        <w:ind w:left="1080"/>
-      </w:pPr>
-      <w:r>
-        <w:rPr>
-          <w:rFonts w:ascii="Calibri" w:cs="Calibri" w:eastAsia="Calibri" w:hAnsi="Calibri"/>
-          <w:sz w:val="22"/>
-          <w:szCs w:val="22"/>
-        </w:rPr>
-        <w:t xml:space="preserve">•  </w:t>
-      </w:r>
-      <w:r>
-        <w:rPr>
-          <w:rFonts w:ascii="Calibri" w:cs="Calibri" w:eastAsia="Calibri" w:hAnsi="Calibri"/>
-          <w:b w:val="false"/>
-          <w:bCs w:val="false"/>
-          <w:i w:val="false"/>
-          <w:iCs w:val="false"/>
-          <w:sz w:val="22"/>
-          <w:szCs w:val="22"/>
-        </w:rPr>
-        <w:t xml:space="preserve">Crusade Prayer (164): </w:t>
-      </w:r>
-      <w:r>
-        <w:rPr>
-          <w:rFonts w:ascii="Calibri" w:cs="Calibri" w:eastAsia="Calibri" w:hAnsi="Calibri"/>
-          <w:b w:val="false"/>
-          <w:bCs w:val="false"/>
-          <w:i/>
-          <w:iCs/>
-          <w:sz w:val="22"/>
-          <w:szCs w:val="22"/>
-        </w:rPr>
-        <w:t xml:space="preserve">Prayer of Peace for Nations</w:t>
       </w:r>
     </w:p>
     <w:p>

</xml_diff>

<commit_message>
Standardize common prayers in Crusade and daily prayers doc
Normalize the wording and line breaks of the Our Father, Hail Mary, Apostles' Creed, Glory Be, and Chaplet responses so the shared texts match across sections, and drop the duplicated Fatima Decade Prayer. Regenerate the printable .docx.
</commit_message>
<xml_diff>
--- a/for-printing/crusade-prayers/crusade-and-daily-prayers.docx
+++ b/for-printing/crusade-prayers/crusade-and-daily-prayers.docx
@@ -49,7 +49,7 @@
           <w:sz w:val="22"/>
           <w:szCs w:val="22"/>
         </w:rPr>
-        <w:t xml:space="preserve">Date: 2026-10-08  |  Version: 1.0</w:t>
+        <w:t xml:space="preserve">Date: 2026-10-09  |  Version: 1.0</w:t>
       </w:r>
     </w:p>
     <w:p>
@@ -2100,7 +2100,22 @@
           <w:sz w:val="18"/>
           <w:szCs w:val="18"/>
         </w:rPr>
-        <w:t xml:space="preserve">Our Father who art in heaven, hallowed be Thy name;</w:t>
+        <w:t xml:space="preserve">Our Father, who art in heaven,</w:t>
+      </w:r>
+    </w:p>
+    <w:p>
+      <w:pPr>
+        <w:shd w:fill="F5F5F5" w:color="F5F5F5" w:val="solid"/>
+        <w:spacing w:after="20" w:before="20"/>
+        <w:ind w:left="360"/>
+      </w:pPr>
+      <w:r>
+        <w:rPr>
+          <w:rFonts w:ascii="Consolas" w:cs="Consolas" w:eastAsia="Consolas" w:hAnsi="Consolas"/>
+          <w:sz w:val="18"/>
+          <w:szCs w:val="18"/>
+        </w:rPr>
+        <w:t xml:space="preserve">hallowed be Thy name;</w:t>
       </w:r>
     </w:p>
     <w:p>
@@ -2130,7 +2145,7 @@
           <w:sz w:val="18"/>
           <w:szCs w:val="18"/>
         </w:rPr>
-        <w:t xml:space="preserve">Thy will be done on earth as it is in Heaven.</w:t>
+        <w:t xml:space="preserve">Thy will be done on earth as it is in heaven.</w:t>
       </w:r>
     </w:p>
     <w:p>
@@ -2160,37 +2175,52 @@
           <w:sz w:val="18"/>
           <w:szCs w:val="18"/>
         </w:rPr>
-        <w:t xml:space="preserve">and forgive us our trespasses as we forgive those who trespass against us;</w:t>
-      </w:r>
-    </w:p>
-    <w:p>
-      <w:pPr>
-        <w:shd w:fill="F5F5F5" w:color="F5F5F5" w:val="solid"/>
-        <w:spacing w:after="20" w:before="20"/>
-        <w:ind w:left="360"/>
-      </w:pPr>
-      <w:r>
-        <w:rPr>
-          <w:rFonts w:ascii="Consolas" w:cs="Consolas" w:eastAsia="Consolas" w:hAnsi="Consolas"/>
-          <w:sz w:val="18"/>
-          <w:szCs w:val="18"/>
-        </w:rPr>
-        <w:t xml:space="preserve">and lead us not into temptation, but deliver us from evil.</w:t>
-      </w:r>
-    </w:p>
-    <w:p>
-      <w:pPr>
-        <w:shd w:fill="F5F5F5" w:color="F5F5F5" w:val="solid"/>
-        <w:spacing w:after="20" w:before="20"/>
-        <w:ind w:left="360"/>
-      </w:pPr>
-      <w:r>
-        <w:rPr>
-          <w:rFonts w:ascii="Consolas" w:cs="Consolas" w:eastAsia="Consolas" w:hAnsi="Consolas"/>
-          <w:sz w:val="18"/>
-          <w:szCs w:val="18"/>
-        </w:rPr>
-        <w:t xml:space="preserve">Amen.</w:t>
+        <w:t xml:space="preserve">and forgive us our trespasses</w:t>
+      </w:r>
+    </w:p>
+    <w:p>
+      <w:pPr>
+        <w:shd w:fill="F5F5F5" w:color="F5F5F5" w:val="solid"/>
+        <w:spacing w:after="20" w:before="20"/>
+        <w:ind w:left="360"/>
+      </w:pPr>
+      <w:r>
+        <w:rPr>
+          <w:rFonts w:ascii="Consolas" w:cs="Consolas" w:eastAsia="Consolas" w:hAnsi="Consolas"/>
+          <w:sz w:val="18"/>
+          <w:szCs w:val="18"/>
+        </w:rPr>
+        <w:t xml:space="preserve">as we forgive those who trespass against us;</w:t>
+      </w:r>
+    </w:p>
+    <w:p>
+      <w:pPr>
+        <w:shd w:fill="F5F5F5" w:color="F5F5F5" w:val="solid"/>
+        <w:spacing w:after="20" w:before="20"/>
+        <w:ind w:left="360"/>
+      </w:pPr>
+      <w:r>
+        <w:rPr>
+          <w:rFonts w:ascii="Consolas" w:cs="Consolas" w:eastAsia="Consolas" w:hAnsi="Consolas"/>
+          <w:sz w:val="18"/>
+          <w:szCs w:val="18"/>
+        </w:rPr>
+        <w:t xml:space="preserve">and lead us not into temptation,</w:t>
+      </w:r>
+    </w:p>
+    <w:p>
+      <w:pPr>
+        <w:shd w:fill="F5F5F5" w:color="F5F5F5" w:val="solid"/>
+        <w:spacing w:after="20" w:before="20"/>
+        <w:ind w:left="360"/>
+      </w:pPr>
+      <w:r>
+        <w:rPr>
+          <w:rFonts w:ascii="Consolas" w:cs="Consolas" w:eastAsia="Consolas" w:hAnsi="Consolas"/>
+          <w:sz w:val="18"/>
+          <w:szCs w:val="18"/>
+        </w:rPr>
+        <w:t xml:space="preserve">but deliver us from evil. Amen.</w:t>
       </w:r>
     </w:p>
     <w:p>
@@ -2227,22 +2257,22 @@
           <w:sz w:val="18"/>
           <w:szCs w:val="18"/>
         </w:rPr>
-        <w:t xml:space="preserve">Hail Mary, full of grace!</w:t>
-      </w:r>
-    </w:p>
-    <w:p>
-      <w:pPr>
-        <w:shd w:fill="F5F5F5" w:color="F5F5F5" w:val="solid"/>
-        <w:spacing w:after="20" w:before="20"/>
-        <w:ind w:left="360"/>
-      </w:pPr>
-      <w:r>
-        <w:rPr>
-          <w:rFonts w:ascii="Consolas" w:cs="Consolas" w:eastAsia="Consolas" w:hAnsi="Consolas"/>
-          <w:sz w:val="18"/>
-          <w:szCs w:val="18"/>
-        </w:rPr>
-        <w:t xml:space="preserve">the Lord is with thee; blessed are thou among women,</w:t>
+        <w:t xml:space="preserve">Hail Mary, full of grace, the Lord is with thee;</w:t>
+      </w:r>
+    </w:p>
+    <w:p>
+      <w:pPr>
+        <w:shd w:fill="F5F5F5" w:color="F5F5F5" w:val="solid"/>
+        <w:spacing w:after="20" w:before="20"/>
+        <w:ind w:left="360"/>
+      </w:pPr>
+      <w:r>
+        <w:rPr>
+          <w:rFonts w:ascii="Consolas" w:cs="Consolas" w:eastAsia="Consolas" w:hAnsi="Consolas"/>
+          <w:sz w:val="18"/>
+          <w:szCs w:val="18"/>
+        </w:rPr>
+        <w:t xml:space="preserve">blessed art thou among women,</w:t>
       </w:r>
     </w:p>
     <w:p>
@@ -2287,22 +2317,22 @@
           <w:sz w:val="18"/>
           <w:szCs w:val="18"/>
         </w:rPr>
-        <w:t xml:space="preserve">pray for us sinners now and at the hour of our death.</w:t>
-      </w:r>
-    </w:p>
-    <w:p>
-      <w:pPr>
-        <w:shd w:fill="F5F5F5" w:color="F5F5F5" w:val="solid"/>
-        <w:spacing w:after="20" w:before="20"/>
-        <w:ind w:left="360"/>
-      </w:pPr>
-      <w:r>
-        <w:rPr>
-          <w:rFonts w:ascii="Consolas" w:cs="Consolas" w:eastAsia="Consolas" w:hAnsi="Consolas"/>
-          <w:sz w:val="18"/>
-          <w:szCs w:val="18"/>
-        </w:rPr>
-        <w:t xml:space="preserve">Amen.</w:t>
+        <w:t xml:space="preserve">pray for us sinners,</w:t>
+      </w:r>
+    </w:p>
+    <w:p>
+      <w:pPr>
+        <w:shd w:fill="F5F5F5" w:color="F5F5F5" w:val="solid"/>
+        <w:spacing w:after="20" w:before="20"/>
+        <w:ind w:left="360"/>
+      </w:pPr>
+      <w:r>
+        <w:rPr>
+          <w:rFonts w:ascii="Consolas" w:cs="Consolas" w:eastAsia="Consolas" w:hAnsi="Consolas"/>
+          <w:sz w:val="18"/>
+          <w:szCs w:val="18"/>
+        </w:rPr>
+        <w:t xml:space="preserve">now and at the hour of our death. Amen.</w:t>
       </w:r>
     </w:p>
     <w:p>
@@ -2339,202 +2369,262 @@
           <w:sz w:val="18"/>
           <w:szCs w:val="18"/>
         </w:rPr>
-        <w:t xml:space="preserve">I believe in God, the Father Almighty,</w:t>
-      </w:r>
-    </w:p>
-    <w:p>
-      <w:pPr>
-        <w:shd w:fill="F5F5F5" w:color="F5F5F5" w:val="solid"/>
-        <w:spacing w:after="20" w:before="20"/>
-        <w:ind w:left="360"/>
-      </w:pPr>
-      <w:r>
-        <w:rPr>
-          <w:rFonts w:ascii="Consolas" w:cs="Consolas" w:eastAsia="Consolas" w:hAnsi="Consolas"/>
-          <w:sz w:val="18"/>
-          <w:szCs w:val="18"/>
-        </w:rPr>
-        <w:t xml:space="preserve">Creator of Heaven and earth; and in Jesus Christ His only Son,</w:t>
-      </w:r>
-    </w:p>
-    <w:p>
-      <w:pPr>
-        <w:shd w:fill="F5F5F5" w:color="F5F5F5" w:val="solid"/>
-        <w:spacing w:after="20" w:before="20"/>
-        <w:ind w:left="360"/>
-      </w:pPr>
-      <w:r>
-        <w:rPr>
-          <w:rFonts w:ascii="Consolas" w:cs="Consolas" w:eastAsia="Consolas" w:hAnsi="Consolas"/>
-          <w:sz w:val="18"/>
-          <w:szCs w:val="18"/>
-        </w:rPr>
-        <w:t xml:space="preserve">Our Lord; who was conceived by the Holy Spirit,</w:t>
-      </w:r>
-    </w:p>
-    <w:p>
-      <w:pPr>
-        <w:shd w:fill="F5F5F5" w:color="F5F5F5" w:val="solid"/>
-        <w:spacing w:after="20" w:before="20"/>
-        <w:ind w:left="360"/>
-      </w:pPr>
-      <w:r>
-        <w:rPr>
-          <w:rFonts w:ascii="Consolas" w:cs="Consolas" w:eastAsia="Consolas" w:hAnsi="Consolas"/>
-          <w:sz w:val="18"/>
-          <w:szCs w:val="18"/>
-        </w:rPr>
-        <w:t xml:space="preserve">born of the Virgin Mary, suffered under Pontius Pilate,</w:t>
-      </w:r>
-    </w:p>
-    <w:p>
-      <w:pPr>
-        <w:shd w:fill="F5F5F5" w:color="F5F5F5" w:val="solid"/>
-        <w:spacing w:after="20" w:before="20"/>
-        <w:ind w:left="360"/>
-      </w:pPr>
-      <w:r>
-        <w:rPr>
-          <w:rFonts w:ascii="Consolas" w:cs="Consolas" w:eastAsia="Consolas" w:hAnsi="Consolas"/>
-          <w:sz w:val="18"/>
-          <w:szCs w:val="18"/>
-        </w:rPr>
-        <w:t xml:space="preserve">was crucified, died and was buried.</w:t>
-      </w:r>
-    </w:p>
-    <w:p>
-      <w:pPr>
-        <w:shd w:fill="F5F5F5" w:color="F5F5F5" w:val="solid"/>
-        <w:spacing w:after="20" w:before="20"/>
-        <w:ind w:left="360"/>
-      </w:pPr>
-      <w:r>
-        <w:rPr>
-          <w:rFonts w:ascii="Consolas" w:cs="Consolas" w:eastAsia="Consolas" w:hAnsi="Consolas"/>
-          <w:sz w:val="18"/>
-          <w:szCs w:val="18"/>
-        </w:rPr>
-        <w:t xml:space="preserve">He descended into Hell;</w:t>
-      </w:r>
-    </w:p>
-    <w:p>
-      <w:pPr>
-        <w:shd w:fill="F5F5F5" w:color="F5F5F5" w:val="solid"/>
-        <w:spacing w:after="20" w:before="20"/>
-        <w:ind w:left="360"/>
-      </w:pPr>
-      <w:r>
-        <w:rPr>
-          <w:rFonts w:ascii="Consolas" w:cs="Consolas" w:eastAsia="Consolas" w:hAnsi="Consolas"/>
-          <w:sz w:val="18"/>
-          <w:szCs w:val="18"/>
-        </w:rPr>
-        <w:t xml:space="preserve">the third day He arose again from the dead;</w:t>
-      </w:r>
-    </w:p>
-    <w:p>
-      <w:pPr>
-        <w:shd w:fill="F5F5F5" w:color="F5F5F5" w:val="solid"/>
-        <w:spacing w:after="20" w:before="20"/>
-        <w:ind w:left="360"/>
-      </w:pPr>
-      <w:r>
-        <w:rPr>
-          <w:rFonts w:ascii="Consolas" w:cs="Consolas" w:eastAsia="Consolas" w:hAnsi="Consolas"/>
-          <w:sz w:val="18"/>
-          <w:szCs w:val="18"/>
-        </w:rPr>
-        <w:t xml:space="preserve">He ascended into Heaven,</w:t>
-      </w:r>
-    </w:p>
-    <w:p>
-      <w:pPr>
-        <w:shd w:fill="F5F5F5" w:color="F5F5F5" w:val="solid"/>
-        <w:spacing w:after="20" w:before="20"/>
-        <w:ind w:left="360"/>
-      </w:pPr>
-      <w:r>
-        <w:rPr>
-          <w:rFonts w:ascii="Consolas" w:cs="Consolas" w:eastAsia="Consolas" w:hAnsi="Consolas"/>
-          <w:sz w:val="18"/>
-          <w:szCs w:val="18"/>
-        </w:rPr>
-        <w:t xml:space="preserve">and is seated at the right hand of God, the Father Almighty;</w:t>
-      </w:r>
-    </w:p>
-    <w:p>
-      <w:pPr>
-        <w:shd w:fill="F5F5F5" w:color="F5F5F5" w:val="solid"/>
-        <w:spacing w:after="20" w:before="20"/>
-        <w:ind w:left="360"/>
-      </w:pPr>
-      <w:r>
-        <w:rPr>
-          <w:rFonts w:ascii="Consolas" w:cs="Consolas" w:eastAsia="Consolas" w:hAnsi="Consolas"/>
-          <w:sz w:val="18"/>
-          <w:szCs w:val="18"/>
-        </w:rPr>
-        <w:t xml:space="preserve">from thence He shall come to judge the living and the dead.</w:t>
-      </w:r>
-    </w:p>
-    <w:p>
-      <w:pPr>
-        <w:shd w:fill="F5F5F5" w:color="F5F5F5" w:val="solid"/>
-        <w:spacing w:after="20" w:before="20"/>
-        <w:ind w:left="360"/>
-      </w:pPr>
-      <w:r>
-        <w:rPr>
-          <w:rFonts w:ascii="Consolas" w:cs="Consolas" w:eastAsia="Consolas" w:hAnsi="Consolas"/>
-          <w:sz w:val="18"/>
-          <w:szCs w:val="18"/>
-        </w:rPr>
-        <w:t xml:space="preserve">I believe in the Holy Spirit, the Holy Catholic Church,</w:t>
-      </w:r>
-    </w:p>
-    <w:p>
-      <w:pPr>
-        <w:shd w:fill="F5F5F5" w:color="F5F5F5" w:val="solid"/>
-        <w:spacing w:after="20" w:before="20"/>
-        <w:ind w:left="360"/>
-      </w:pPr>
-      <w:r>
-        <w:rPr>
-          <w:rFonts w:ascii="Consolas" w:cs="Consolas" w:eastAsia="Consolas" w:hAnsi="Consolas"/>
-          <w:sz w:val="18"/>
-          <w:szCs w:val="18"/>
-        </w:rPr>
-        <w:t xml:space="preserve">the communion of Saints, the forgiveness of sins,</w:t>
-      </w:r>
-    </w:p>
-    <w:p>
-      <w:pPr>
-        <w:shd w:fill="F5F5F5" w:color="F5F5F5" w:val="solid"/>
-        <w:spacing w:after="20" w:before="20"/>
-        <w:ind w:left="360"/>
-      </w:pPr>
-      <w:r>
-        <w:rPr>
-          <w:rFonts w:ascii="Consolas" w:cs="Consolas" w:eastAsia="Consolas" w:hAnsi="Consolas"/>
-          <w:sz w:val="18"/>
-          <w:szCs w:val="18"/>
-        </w:rPr>
-        <w:t xml:space="preserve">the resurrection of the body, and life everlasting.</w:t>
-      </w:r>
-    </w:p>
-    <w:p>
-      <w:pPr>
-        <w:shd w:fill="F5F5F5" w:color="F5F5F5" w:val="solid"/>
-        <w:spacing w:after="20" w:before="20"/>
-        <w:ind w:left="360"/>
-      </w:pPr>
-      <w:r>
-        <w:rPr>
-          <w:rFonts w:ascii="Consolas" w:cs="Consolas" w:eastAsia="Consolas" w:hAnsi="Consolas"/>
-          <w:sz w:val="18"/>
-          <w:szCs w:val="18"/>
-        </w:rPr>
-        <w:t xml:space="preserve">Amen.</w:t>
+        <w:t xml:space="preserve">I believe in God, the Father almighty,</w:t>
+      </w:r>
+    </w:p>
+    <w:p>
+      <w:pPr>
+        <w:shd w:fill="F5F5F5" w:color="F5F5F5" w:val="solid"/>
+        <w:spacing w:after="20" w:before="20"/>
+        <w:ind w:left="360"/>
+      </w:pPr>
+      <w:r>
+        <w:rPr>
+          <w:rFonts w:ascii="Consolas" w:cs="Consolas" w:eastAsia="Consolas" w:hAnsi="Consolas"/>
+          <w:sz w:val="18"/>
+          <w:szCs w:val="18"/>
+        </w:rPr>
+        <w:t xml:space="preserve">Creator of heaven and earth,</w:t>
+      </w:r>
+    </w:p>
+    <w:p>
+      <w:pPr>
+        <w:shd w:fill="F5F5F5" w:color="F5F5F5" w:val="solid"/>
+        <w:spacing w:after="20" w:before="20"/>
+        <w:ind w:left="360"/>
+      </w:pPr>
+      <w:r>
+        <w:rPr>
+          <w:rFonts w:ascii="Consolas" w:cs="Consolas" w:eastAsia="Consolas" w:hAnsi="Consolas"/>
+          <w:sz w:val="18"/>
+          <w:szCs w:val="18"/>
+        </w:rPr>
+        <w:t xml:space="preserve">and in Jesus Christ, His only Son, our Lord,</w:t>
+      </w:r>
+    </w:p>
+    <w:p>
+      <w:pPr>
+        <w:shd w:fill="F5F5F5" w:color="F5F5F5" w:val="solid"/>
+        <w:spacing w:after="20" w:before="20"/>
+        <w:ind w:left="360"/>
+      </w:pPr>
+      <w:r>
+        <w:rPr>
+          <w:rFonts w:ascii="Consolas" w:cs="Consolas" w:eastAsia="Consolas" w:hAnsi="Consolas"/>
+          <w:sz w:val="18"/>
+          <w:szCs w:val="18"/>
+        </w:rPr>
+        <w:t xml:space="preserve">who was conceived by the Holy Spirit,</w:t>
+      </w:r>
+    </w:p>
+    <w:p>
+      <w:pPr>
+        <w:shd w:fill="F5F5F5" w:color="F5F5F5" w:val="solid"/>
+        <w:spacing w:after="20" w:before="20"/>
+        <w:ind w:left="360"/>
+      </w:pPr>
+      <w:r>
+        <w:rPr>
+          <w:rFonts w:ascii="Consolas" w:cs="Consolas" w:eastAsia="Consolas" w:hAnsi="Consolas"/>
+          <w:sz w:val="18"/>
+          <w:szCs w:val="18"/>
+        </w:rPr>
+        <w:t xml:space="preserve">born of the Virgin Mary,</w:t>
+      </w:r>
+    </w:p>
+    <w:p>
+      <w:pPr>
+        <w:shd w:fill="F5F5F5" w:color="F5F5F5" w:val="solid"/>
+        <w:spacing w:after="20" w:before="20"/>
+        <w:ind w:left="360"/>
+      </w:pPr>
+      <w:r>
+        <w:rPr>
+          <w:rFonts w:ascii="Consolas" w:cs="Consolas" w:eastAsia="Consolas" w:hAnsi="Consolas"/>
+          <w:sz w:val="18"/>
+          <w:szCs w:val="18"/>
+        </w:rPr>
+        <w:t xml:space="preserve">suffered under Pontius Pilate,</w:t>
+      </w:r>
+    </w:p>
+    <w:p>
+      <w:pPr>
+        <w:shd w:fill="F5F5F5" w:color="F5F5F5" w:val="solid"/>
+        <w:spacing w:after="20" w:before="20"/>
+        <w:ind w:left="360"/>
+      </w:pPr>
+      <w:r>
+        <w:rPr>
+          <w:rFonts w:ascii="Consolas" w:cs="Consolas" w:eastAsia="Consolas" w:hAnsi="Consolas"/>
+          <w:sz w:val="18"/>
+          <w:szCs w:val="18"/>
+        </w:rPr>
+        <w:t xml:space="preserve">was crucified, died and was buried;</w:t>
+      </w:r>
+    </w:p>
+    <w:p>
+      <w:pPr>
+        <w:shd w:fill="F5F5F5" w:color="F5F5F5" w:val="solid"/>
+        <w:spacing w:after="20" w:before="20"/>
+        <w:ind w:left="360"/>
+      </w:pPr>
+      <w:r>
+        <w:rPr>
+          <w:rFonts w:ascii="Consolas" w:cs="Consolas" w:eastAsia="Consolas" w:hAnsi="Consolas"/>
+          <w:sz w:val="18"/>
+          <w:szCs w:val="18"/>
+        </w:rPr>
+        <w:t xml:space="preserve">He descended into hell;</w:t>
+      </w:r>
+    </w:p>
+    <w:p>
+      <w:pPr>
+        <w:shd w:fill="F5F5F5" w:color="F5F5F5" w:val="solid"/>
+        <w:spacing w:after="20" w:before="20"/>
+        <w:ind w:left="360"/>
+      </w:pPr>
+      <w:r>
+        <w:rPr>
+          <w:rFonts w:ascii="Consolas" w:cs="Consolas" w:eastAsia="Consolas" w:hAnsi="Consolas"/>
+          <w:sz w:val="18"/>
+          <w:szCs w:val="18"/>
+        </w:rPr>
+        <w:t xml:space="preserve">on the third day He rose again from the dead;</w:t>
+      </w:r>
+    </w:p>
+    <w:p>
+      <w:pPr>
+        <w:shd w:fill="F5F5F5" w:color="F5F5F5" w:val="solid"/>
+        <w:spacing w:after="20" w:before="20"/>
+        <w:ind w:left="360"/>
+      </w:pPr>
+      <w:r>
+        <w:rPr>
+          <w:rFonts w:ascii="Consolas" w:cs="Consolas" w:eastAsia="Consolas" w:hAnsi="Consolas"/>
+          <w:sz w:val="18"/>
+          <w:szCs w:val="18"/>
+        </w:rPr>
+        <w:t xml:space="preserve">He ascended into heaven,</w:t>
+      </w:r>
+    </w:p>
+    <w:p>
+      <w:pPr>
+        <w:shd w:fill="F5F5F5" w:color="F5F5F5" w:val="solid"/>
+        <w:spacing w:after="20" w:before="20"/>
+        <w:ind w:left="360"/>
+      </w:pPr>
+      <w:r>
+        <w:rPr>
+          <w:rFonts w:ascii="Consolas" w:cs="Consolas" w:eastAsia="Consolas" w:hAnsi="Consolas"/>
+          <w:sz w:val="18"/>
+          <w:szCs w:val="18"/>
+        </w:rPr>
+        <w:t xml:space="preserve">and is seated at the right hand of God the Father almighty;</w:t>
+      </w:r>
+    </w:p>
+    <w:p>
+      <w:pPr>
+        <w:shd w:fill="F5F5F5" w:color="F5F5F5" w:val="solid"/>
+        <w:spacing w:after="20" w:before="20"/>
+        <w:ind w:left="360"/>
+      </w:pPr>
+      <w:r>
+        <w:rPr>
+          <w:rFonts w:ascii="Consolas" w:cs="Consolas" w:eastAsia="Consolas" w:hAnsi="Consolas"/>
+          <w:sz w:val="18"/>
+          <w:szCs w:val="18"/>
+        </w:rPr>
+        <w:t xml:space="preserve">from there He will come to judge the living and the dead.</w:t>
+      </w:r>
+    </w:p>
+    <w:p>
+      <w:pPr>
+        <w:shd w:fill="F5F5F5" w:color="F5F5F5" w:val="solid"/>
+        <w:spacing w:after="20" w:before="20"/>
+        <w:ind w:left="360"/>
+      </w:pPr>
+      <w:r>
+        <w:rPr>
+          <w:rFonts w:ascii="Consolas" w:cs="Consolas" w:eastAsia="Consolas" w:hAnsi="Consolas"/>
+          <w:sz w:val="18"/>
+          <w:szCs w:val="18"/>
+        </w:rPr>
+        <w:t xml:space="preserve">I believe in the Holy Spirit,</w:t>
+      </w:r>
+    </w:p>
+    <w:p>
+      <w:pPr>
+        <w:shd w:fill="F5F5F5" w:color="F5F5F5" w:val="solid"/>
+        <w:spacing w:after="20" w:before="20"/>
+        <w:ind w:left="360"/>
+      </w:pPr>
+      <w:r>
+        <w:rPr>
+          <w:rFonts w:ascii="Consolas" w:cs="Consolas" w:eastAsia="Consolas" w:hAnsi="Consolas"/>
+          <w:sz w:val="18"/>
+          <w:szCs w:val="18"/>
+        </w:rPr>
+        <w:t xml:space="preserve">the holy catholic Church,</w:t>
+      </w:r>
+    </w:p>
+    <w:p>
+      <w:pPr>
+        <w:shd w:fill="F5F5F5" w:color="F5F5F5" w:val="solid"/>
+        <w:spacing w:after="20" w:before="20"/>
+        <w:ind w:left="360"/>
+      </w:pPr>
+      <w:r>
+        <w:rPr>
+          <w:rFonts w:ascii="Consolas" w:cs="Consolas" w:eastAsia="Consolas" w:hAnsi="Consolas"/>
+          <w:sz w:val="18"/>
+          <w:szCs w:val="18"/>
+        </w:rPr>
+        <w:t xml:space="preserve">the communion of saints,</w:t>
+      </w:r>
+    </w:p>
+    <w:p>
+      <w:pPr>
+        <w:shd w:fill="F5F5F5" w:color="F5F5F5" w:val="solid"/>
+        <w:spacing w:after="20" w:before="20"/>
+        <w:ind w:left="360"/>
+      </w:pPr>
+      <w:r>
+        <w:rPr>
+          <w:rFonts w:ascii="Consolas" w:cs="Consolas" w:eastAsia="Consolas" w:hAnsi="Consolas"/>
+          <w:sz w:val="18"/>
+          <w:szCs w:val="18"/>
+        </w:rPr>
+        <w:t xml:space="preserve">the forgiveness of sins,</w:t>
+      </w:r>
+    </w:p>
+    <w:p>
+      <w:pPr>
+        <w:shd w:fill="F5F5F5" w:color="F5F5F5" w:val="solid"/>
+        <w:spacing w:after="20" w:before="20"/>
+        <w:ind w:left="360"/>
+      </w:pPr>
+      <w:r>
+        <w:rPr>
+          <w:rFonts w:ascii="Consolas" w:cs="Consolas" w:eastAsia="Consolas" w:hAnsi="Consolas"/>
+          <w:sz w:val="18"/>
+          <w:szCs w:val="18"/>
+        </w:rPr>
+        <w:t xml:space="preserve">the resurrection of the body,</w:t>
+      </w:r>
+    </w:p>
+    <w:p>
+      <w:pPr>
+        <w:shd w:fill="F5F5F5" w:color="F5F5F5" w:val="solid"/>
+        <w:spacing w:after="20" w:before="20"/>
+        <w:ind w:left="360"/>
+      </w:pPr>
+      <w:r>
+        <w:rPr>
+          <w:rFonts w:ascii="Consolas" w:cs="Consolas" w:eastAsia="Consolas" w:hAnsi="Consolas"/>
+          <w:sz w:val="18"/>
+          <w:szCs w:val="18"/>
+        </w:rPr>
+        <w:t xml:space="preserve">and life everlasting. Amen.</w:t>
       </w:r>
     </w:p>
     <w:p>
@@ -2625,10 +2715,61 @@
           <w:sz w:val="22"/>
           <w:szCs w:val="22"/>
         </w:rPr>
-        <w:t xml:space="preserve">Eternal Father, I offer you the Body and Blood,
-Soul and Divinity of Your Dearly Beloved Son, Our Lord,
-Jesus Christ,
-in atonement for our sins and those of the whole world.</w:t>
+        <w:t xml:space="preserve">Eternal Father, I offer you the Body and Blood,</w:t>
+      </w:r>
+      <w:r>
+        <w:rPr>
+          <w:rFonts w:ascii="Calibri" w:cs="Calibri" w:eastAsia="Calibri" w:hAnsi="Calibri"/>
+        </w:rPr>
+        <w:br/>
+      </w:r>
+      <w:r>
+        <w:rPr>
+          <w:rFonts w:ascii="Calibri" w:cs="Calibri" w:eastAsia="Calibri" w:hAnsi="Calibri"/>
+          <w:b w:val="false"/>
+          <w:bCs w:val="false"/>
+          <w:i w:val="false"/>
+          <w:iCs w:val="false"/>
+          <w:sz w:val="22"/>
+          <w:szCs w:val="22"/>
+        </w:rPr>
+        <w:t xml:space="preserve">Soul and Divinity of Your Dearly Beloved Son, Our Lord,</w:t>
+      </w:r>
+      <w:r>
+        <w:rPr>
+          <w:rFonts w:ascii="Calibri" w:cs="Calibri" w:eastAsia="Calibri" w:hAnsi="Calibri"/>
+        </w:rPr>
+        <w:br/>
+      </w:r>
+      <w:r>
+        <w:rPr>
+          <w:rFonts w:ascii="Calibri" w:cs="Calibri" w:eastAsia="Calibri" w:hAnsi="Calibri"/>
+          <w:b w:val="false"/>
+          <w:bCs w:val="false"/>
+          <w:i w:val="false"/>
+          <w:iCs w:val="false"/>
+          <w:sz w:val="22"/>
+          <w:szCs w:val="22"/>
+        </w:rPr>
+        <w:t xml:space="preserve">Jesus Christ,</w:t>
+      </w:r>
+      <w:r>
+        <w:rPr>
+          <w:rFonts w:ascii="Calibri" w:cs="Calibri" w:eastAsia="Calibri" w:hAnsi="Calibri"/>
+        </w:rPr>
+        <w:br/>
+      </w:r>
+      <w:r>
+        <w:rPr>
+          <w:rFonts w:ascii="Calibri" w:cs="Calibri" w:eastAsia="Calibri" w:hAnsi="Calibri"/>
+          <w:b w:val="false"/>
+          <w:bCs w:val="false"/>
+          <w:i w:val="false"/>
+          <w:iCs w:val="false"/>
+          <w:sz w:val="22"/>
+          <w:szCs w:val="22"/>
+        </w:rPr>
+        <w:t xml:space="preserve">in atonement for our sins and those of the whole world.</w:t>
       </w:r>
     </w:p>
     <w:p>
@@ -2680,8 +2821,25 @@
           <w:sz w:val="22"/>
           <w:szCs w:val="22"/>
         </w:rPr>
-        <w:t xml:space="preserve">For the sake of His sorrowful Passion,
-have mercy on us and on the whole world.</w:t>
+        <w:t xml:space="preserve">For the sake of His sorrowful Passion,</w:t>
+      </w:r>
+      <w:r>
+        <w:rPr>
+          <w:rFonts w:ascii="Calibri" w:cs="Calibri" w:eastAsia="Calibri" w:hAnsi="Calibri"/>
+        </w:rPr>
+        <w:br/>
+      </w:r>
+      <w:r>
+        <w:rPr>
+          <w:rFonts w:ascii="Calibri" w:cs="Calibri" w:eastAsia="Calibri" w:hAnsi="Calibri"/>
+          <w:b w:val="false"/>
+          <w:bCs w:val="false"/>
+          <w:i w:val="false"/>
+          <w:iCs w:val="false"/>
+          <w:sz w:val="22"/>
+          <w:szCs w:val="22"/>
+        </w:rPr>
+        <w:t xml:space="preserve">have mercy on us and on the whole world.</w:t>
       </w:r>
     </w:p>
     <w:p>
@@ -3242,202 +3400,262 @@
           <w:sz w:val="18"/>
           <w:szCs w:val="18"/>
         </w:rPr>
-        <w:t xml:space="preserve">I believe in God, the Father Almighty,</w:t>
-      </w:r>
-    </w:p>
-    <w:p>
-      <w:pPr>
-        <w:shd w:fill="F5F5F5" w:color="F5F5F5" w:val="solid"/>
-        <w:spacing w:after="20" w:before="20"/>
-        <w:ind w:left="360"/>
-      </w:pPr>
-      <w:r>
-        <w:rPr>
-          <w:rFonts w:ascii="Consolas" w:cs="Consolas" w:eastAsia="Consolas" w:hAnsi="Consolas"/>
-          <w:sz w:val="18"/>
-          <w:szCs w:val="18"/>
-        </w:rPr>
-        <w:t xml:space="preserve">Creator of Heaven and earth; and in Jesus Christ His only Son,</w:t>
-      </w:r>
-    </w:p>
-    <w:p>
-      <w:pPr>
-        <w:shd w:fill="F5F5F5" w:color="F5F5F5" w:val="solid"/>
-        <w:spacing w:after="20" w:before="20"/>
-        <w:ind w:left="360"/>
-      </w:pPr>
-      <w:r>
-        <w:rPr>
-          <w:rFonts w:ascii="Consolas" w:cs="Consolas" w:eastAsia="Consolas" w:hAnsi="Consolas"/>
-          <w:sz w:val="18"/>
-          <w:szCs w:val="18"/>
-        </w:rPr>
-        <w:t xml:space="preserve">Our Lord; who was conceived by the Holy Spirit,</w:t>
-      </w:r>
-    </w:p>
-    <w:p>
-      <w:pPr>
-        <w:shd w:fill="F5F5F5" w:color="F5F5F5" w:val="solid"/>
-        <w:spacing w:after="20" w:before="20"/>
-        <w:ind w:left="360"/>
-      </w:pPr>
-      <w:r>
-        <w:rPr>
-          <w:rFonts w:ascii="Consolas" w:cs="Consolas" w:eastAsia="Consolas" w:hAnsi="Consolas"/>
-          <w:sz w:val="18"/>
-          <w:szCs w:val="18"/>
-        </w:rPr>
-        <w:t xml:space="preserve">born of the Virgin Mary, suffered under Pontius Pilate,</w:t>
-      </w:r>
-    </w:p>
-    <w:p>
-      <w:pPr>
-        <w:shd w:fill="F5F5F5" w:color="F5F5F5" w:val="solid"/>
-        <w:spacing w:after="20" w:before="20"/>
-        <w:ind w:left="360"/>
-      </w:pPr>
-      <w:r>
-        <w:rPr>
-          <w:rFonts w:ascii="Consolas" w:cs="Consolas" w:eastAsia="Consolas" w:hAnsi="Consolas"/>
-          <w:sz w:val="18"/>
-          <w:szCs w:val="18"/>
-        </w:rPr>
-        <w:t xml:space="preserve">was crucified, died and was buried.</w:t>
-      </w:r>
-    </w:p>
-    <w:p>
-      <w:pPr>
-        <w:shd w:fill="F5F5F5" w:color="F5F5F5" w:val="solid"/>
-        <w:spacing w:after="20" w:before="20"/>
-        <w:ind w:left="360"/>
-      </w:pPr>
-      <w:r>
-        <w:rPr>
-          <w:rFonts w:ascii="Consolas" w:cs="Consolas" w:eastAsia="Consolas" w:hAnsi="Consolas"/>
-          <w:sz w:val="18"/>
-          <w:szCs w:val="18"/>
-        </w:rPr>
-        <w:t xml:space="preserve">He descended into Hell;</w:t>
-      </w:r>
-    </w:p>
-    <w:p>
-      <w:pPr>
-        <w:shd w:fill="F5F5F5" w:color="F5F5F5" w:val="solid"/>
-        <w:spacing w:after="20" w:before="20"/>
-        <w:ind w:left="360"/>
-      </w:pPr>
-      <w:r>
-        <w:rPr>
-          <w:rFonts w:ascii="Consolas" w:cs="Consolas" w:eastAsia="Consolas" w:hAnsi="Consolas"/>
-          <w:sz w:val="18"/>
-          <w:szCs w:val="18"/>
-        </w:rPr>
-        <w:t xml:space="preserve">the third day He arose again from the dead;</w:t>
-      </w:r>
-    </w:p>
-    <w:p>
-      <w:pPr>
-        <w:shd w:fill="F5F5F5" w:color="F5F5F5" w:val="solid"/>
-        <w:spacing w:after="20" w:before="20"/>
-        <w:ind w:left="360"/>
-      </w:pPr>
-      <w:r>
-        <w:rPr>
-          <w:rFonts w:ascii="Consolas" w:cs="Consolas" w:eastAsia="Consolas" w:hAnsi="Consolas"/>
-          <w:sz w:val="18"/>
-          <w:szCs w:val="18"/>
-        </w:rPr>
-        <w:t xml:space="preserve">He ascended into Heaven,</w:t>
-      </w:r>
-    </w:p>
-    <w:p>
-      <w:pPr>
-        <w:shd w:fill="F5F5F5" w:color="F5F5F5" w:val="solid"/>
-        <w:spacing w:after="20" w:before="20"/>
-        <w:ind w:left="360"/>
-      </w:pPr>
-      <w:r>
-        <w:rPr>
-          <w:rFonts w:ascii="Consolas" w:cs="Consolas" w:eastAsia="Consolas" w:hAnsi="Consolas"/>
-          <w:sz w:val="18"/>
-          <w:szCs w:val="18"/>
-        </w:rPr>
-        <w:t xml:space="preserve">and is seated at the right hand of God, the Father Almighty;</w:t>
-      </w:r>
-    </w:p>
-    <w:p>
-      <w:pPr>
-        <w:shd w:fill="F5F5F5" w:color="F5F5F5" w:val="solid"/>
-        <w:spacing w:after="20" w:before="20"/>
-        <w:ind w:left="360"/>
-      </w:pPr>
-      <w:r>
-        <w:rPr>
-          <w:rFonts w:ascii="Consolas" w:cs="Consolas" w:eastAsia="Consolas" w:hAnsi="Consolas"/>
-          <w:sz w:val="18"/>
-          <w:szCs w:val="18"/>
-        </w:rPr>
-        <w:t xml:space="preserve">from thence He shall come to judge the living and the dead.</w:t>
-      </w:r>
-    </w:p>
-    <w:p>
-      <w:pPr>
-        <w:shd w:fill="F5F5F5" w:color="F5F5F5" w:val="solid"/>
-        <w:spacing w:after="20" w:before="20"/>
-        <w:ind w:left="360"/>
-      </w:pPr>
-      <w:r>
-        <w:rPr>
-          <w:rFonts w:ascii="Consolas" w:cs="Consolas" w:eastAsia="Consolas" w:hAnsi="Consolas"/>
-          <w:sz w:val="18"/>
-          <w:szCs w:val="18"/>
-        </w:rPr>
-        <w:t xml:space="preserve">I believe in the Holy Spirit, the Holy Catholic Church,</w:t>
-      </w:r>
-    </w:p>
-    <w:p>
-      <w:pPr>
-        <w:shd w:fill="F5F5F5" w:color="F5F5F5" w:val="solid"/>
-        <w:spacing w:after="20" w:before="20"/>
-        <w:ind w:left="360"/>
-      </w:pPr>
-      <w:r>
-        <w:rPr>
-          <w:rFonts w:ascii="Consolas" w:cs="Consolas" w:eastAsia="Consolas" w:hAnsi="Consolas"/>
-          <w:sz w:val="18"/>
-          <w:szCs w:val="18"/>
-        </w:rPr>
-        <w:t xml:space="preserve">the communion of Saints, the forgiveness of sins,</w:t>
-      </w:r>
-    </w:p>
-    <w:p>
-      <w:pPr>
-        <w:shd w:fill="F5F5F5" w:color="F5F5F5" w:val="solid"/>
-        <w:spacing w:after="20" w:before="20"/>
-        <w:ind w:left="360"/>
-      </w:pPr>
-      <w:r>
-        <w:rPr>
-          <w:rFonts w:ascii="Consolas" w:cs="Consolas" w:eastAsia="Consolas" w:hAnsi="Consolas"/>
-          <w:sz w:val="18"/>
-          <w:szCs w:val="18"/>
-        </w:rPr>
-        <w:t xml:space="preserve">the resurrection of the body, and life everlasting.</w:t>
-      </w:r>
-    </w:p>
-    <w:p>
-      <w:pPr>
-        <w:shd w:fill="F5F5F5" w:color="F5F5F5" w:val="solid"/>
-        <w:spacing w:after="20" w:before="20"/>
-        <w:ind w:left="360"/>
-      </w:pPr>
-      <w:r>
-        <w:rPr>
-          <w:rFonts w:ascii="Consolas" w:cs="Consolas" w:eastAsia="Consolas" w:hAnsi="Consolas"/>
-          <w:sz w:val="18"/>
-          <w:szCs w:val="18"/>
-        </w:rPr>
-        <w:t xml:space="preserve">Amen.</w:t>
+        <w:t xml:space="preserve">I believe in God, the Father almighty,</w:t>
+      </w:r>
+    </w:p>
+    <w:p>
+      <w:pPr>
+        <w:shd w:fill="F5F5F5" w:color="F5F5F5" w:val="solid"/>
+        <w:spacing w:after="20" w:before="20"/>
+        <w:ind w:left="360"/>
+      </w:pPr>
+      <w:r>
+        <w:rPr>
+          <w:rFonts w:ascii="Consolas" w:cs="Consolas" w:eastAsia="Consolas" w:hAnsi="Consolas"/>
+          <w:sz w:val="18"/>
+          <w:szCs w:val="18"/>
+        </w:rPr>
+        <w:t xml:space="preserve">Creator of heaven and earth,</w:t>
+      </w:r>
+    </w:p>
+    <w:p>
+      <w:pPr>
+        <w:shd w:fill="F5F5F5" w:color="F5F5F5" w:val="solid"/>
+        <w:spacing w:after="20" w:before="20"/>
+        <w:ind w:left="360"/>
+      </w:pPr>
+      <w:r>
+        <w:rPr>
+          <w:rFonts w:ascii="Consolas" w:cs="Consolas" w:eastAsia="Consolas" w:hAnsi="Consolas"/>
+          <w:sz w:val="18"/>
+          <w:szCs w:val="18"/>
+        </w:rPr>
+        <w:t xml:space="preserve">and in Jesus Christ, His only Son, our Lord,</w:t>
+      </w:r>
+    </w:p>
+    <w:p>
+      <w:pPr>
+        <w:shd w:fill="F5F5F5" w:color="F5F5F5" w:val="solid"/>
+        <w:spacing w:after="20" w:before="20"/>
+        <w:ind w:left="360"/>
+      </w:pPr>
+      <w:r>
+        <w:rPr>
+          <w:rFonts w:ascii="Consolas" w:cs="Consolas" w:eastAsia="Consolas" w:hAnsi="Consolas"/>
+          <w:sz w:val="18"/>
+          <w:szCs w:val="18"/>
+        </w:rPr>
+        <w:t xml:space="preserve">who was conceived by the Holy Spirit,</w:t>
+      </w:r>
+    </w:p>
+    <w:p>
+      <w:pPr>
+        <w:shd w:fill="F5F5F5" w:color="F5F5F5" w:val="solid"/>
+        <w:spacing w:after="20" w:before="20"/>
+        <w:ind w:left="360"/>
+      </w:pPr>
+      <w:r>
+        <w:rPr>
+          <w:rFonts w:ascii="Consolas" w:cs="Consolas" w:eastAsia="Consolas" w:hAnsi="Consolas"/>
+          <w:sz w:val="18"/>
+          <w:szCs w:val="18"/>
+        </w:rPr>
+        <w:t xml:space="preserve">born of the Virgin Mary,</w:t>
+      </w:r>
+    </w:p>
+    <w:p>
+      <w:pPr>
+        <w:shd w:fill="F5F5F5" w:color="F5F5F5" w:val="solid"/>
+        <w:spacing w:after="20" w:before="20"/>
+        <w:ind w:left="360"/>
+      </w:pPr>
+      <w:r>
+        <w:rPr>
+          <w:rFonts w:ascii="Consolas" w:cs="Consolas" w:eastAsia="Consolas" w:hAnsi="Consolas"/>
+          <w:sz w:val="18"/>
+          <w:szCs w:val="18"/>
+        </w:rPr>
+        <w:t xml:space="preserve">suffered under Pontius Pilate,</w:t>
+      </w:r>
+    </w:p>
+    <w:p>
+      <w:pPr>
+        <w:shd w:fill="F5F5F5" w:color="F5F5F5" w:val="solid"/>
+        <w:spacing w:after="20" w:before="20"/>
+        <w:ind w:left="360"/>
+      </w:pPr>
+      <w:r>
+        <w:rPr>
+          <w:rFonts w:ascii="Consolas" w:cs="Consolas" w:eastAsia="Consolas" w:hAnsi="Consolas"/>
+          <w:sz w:val="18"/>
+          <w:szCs w:val="18"/>
+        </w:rPr>
+        <w:t xml:space="preserve">was crucified, died and was buried;</w:t>
+      </w:r>
+    </w:p>
+    <w:p>
+      <w:pPr>
+        <w:shd w:fill="F5F5F5" w:color="F5F5F5" w:val="solid"/>
+        <w:spacing w:after="20" w:before="20"/>
+        <w:ind w:left="360"/>
+      </w:pPr>
+      <w:r>
+        <w:rPr>
+          <w:rFonts w:ascii="Consolas" w:cs="Consolas" w:eastAsia="Consolas" w:hAnsi="Consolas"/>
+          <w:sz w:val="18"/>
+          <w:szCs w:val="18"/>
+        </w:rPr>
+        <w:t xml:space="preserve">He descended into hell;</w:t>
+      </w:r>
+    </w:p>
+    <w:p>
+      <w:pPr>
+        <w:shd w:fill="F5F5F5" w:color="F5F5F5" w:val="solid"/>
+        <w:spacing w:after="20" w:before="20"/>
+        <w:ind w:left="360"/>
+      </w:pPr>
+      <w:r>
+        <w:rPr>
+          <w:rFonts w:ascii="Consolas" w:cs="Consolas" w:eastAsia="Consolas" w:hAnsi="Consolas"/>
+          <w:sz w:val="18"/>
+          <w:szCs w:val="18"/>
+        </w:rPr>
+        <w:t xml:space="preserve">on the third day He rose again from the dead;</w:t>
+      </w:r>
+    </w:p>
+    <w:p>
+      <w:pPr>
+        <w:shd w:fill="F5F5F5" w:color="F5F5F5" w:val="solid"/>
+        <w:spacing w:after="20" w:before="20"/>
+        <w:ind w:left="360"/>
+      </w:pPr>
+      <w:r>
+        <w:rPr>
+          <w:rFonts w:ascii="Consolas" w:cs="Consolas" w:eastAsia="Consolas" w:hAnsi="Consolas"/>
+          <w:sz w:val="18"/>
+          <w:szCs w:val="18"/>
+        </w:rPr>
+        <w:t xml:space="preserve">He ascended into heaven,</w:t>
+      </w:r>
+    </w:p>
+    <w:p>
+      <w:pPr>
+        <w:shd w:fill="F5F5F5" w:color="F5F5F5" w:val="solid"/>
+        <w:spacing w:after="20" w:before="20"/>
+        <w:ind w:left="360"/>
+      </w:pPr>
+      <w:r>
+        <w:rPr>
+          <w:rFonts w:ascii="Consolas" w:cs="Consolas" w:eastAsia="Consolas" w:hAnsi="Consolas"/>
+          <w:sz w:val="18"/>
+          <w:szCs w:val="18"/>
+        </w:rPr>
+        <w:t xml:space="preserve">and is seated at the right hand of God the Father almighty;</w:t>
+      </w:r>
+    </w:p>
+    <w:p>
+      <w:pPr>
+        <w:shd w:fill="F5F5F5" w:color="F5F5F5" w:val="solid"/>
+        <w:spacing w:after="20" w:before="20"/>
+        <w:ind w:left="360"/>
+      </w:pPr>
+      <w:r>
+        <w:rPr>
+          <w:rFonts w:ascii="Consolas" w:cs="Consolas" w:eastAsia="Consolas" w:hAnsi="Consolas"/>
+          <w:sz w:val="18"/>
+          <w:szCs w:val="18"/>
+        </w:rPr>
+        <w:t xml:space="preserve">from there He will come to judge the living and the dead.</w:t>
+      </w:r>
+    </w:p>
+    <w:p>
+      <w:pPr>
+        <w:shd w:fill="F5F5F5" w:color="F5F5F5" w:val="solid"/>
+        <w:spacing w:after="20" w:before="20"/>
+        <w:ind w:left="360"/>
+      </w:pPr>
+      <w:r>
+        <w:rPr>
+          <w:rFonts w:ascii="Consolas" w:cs="Consolas" w:eastAsia="Consolas" w:hAnsi="Consolas"/>
+          <w:sz w:val="18"/>
+          <w:szCs w:val="18"/>
+        </w:rPr>
+        <w:t xml:space="preserve">I believe in the Holy Spirit,</w:t>
+      </w:r>
+    </w:p>
+    <w:p>
+      <w:pPr>
+        <w:shd w:fill="F5F5F5" w:color="F5F5F5" w:val="solid"/>
+        <w:spacing w:after="20" w:before="20"/>
+        <w:ind w:left="360"/>
+      </w:pPr>
+      <w:r>
+        <w:rPr>
+          <w:rFonts w:ascii="Consolas" w:cs="Consolas" w:eastAsia="Consolas" w:hAnsi="Consolas"/>
+          <w:sz w:val="18"/>
+          <w:szCs w:val="18"/>
+        </w:rPr>
+        <w:t xml:space="preserve">the holy catholic Church,</w:t>
+      </w:r>
+    </w:p>
+    <w:p>
+      <w:pPr>
+        <w:shd w:fill="F5F5F5" w:color="F5F5F5" w:val="solid"/>
+        <w:spacing w:after="20" w:before="20"/>
+        <w:ind w:left="360"/>
+      </w:pPr>
+      <w:r>
+        <w:rPr>
+          <w:rFonts w:ascii="Consolas" w:cs="Consolas" w:eastAsia="Consolas" w:hAnsi="Consolas"/>
+          <w:sz w:val="18"/>
+          <w:szCs w:val="18"/>
+        </w:rPr>
+        <w:t xml:space="preserve">the communion of saints,</w:t>
+      </w:r>
+    </w:p>
+    <w:p>
+      <w:pPr>
+        <w:shd w:fill="F5F5F5" w:color="F5F5F5" w:val="solid"/>
+        <w:spacing w:after="20" w:before="20"/>
+        <w:ind w:left="360"/>
+      </w:pPr>
+      <w:r>
+        <w:rPr>
+          <w:rFonts w:ascii="Consolas" w:cs="Consolas" w:eastAsia="Consolas" w:hAnsi="Consolas"/>
+          <w:sz w:val="18"/>
+          <w:szCs w:val="18"/>
+        </w:rPr>
+        <w:t xml:space="preserve">the forgiveness of sins,</w:t>
+      </w:r>
+    </w:p>
+    <w:p>
+      <w:pPr>
+        <w:shd w:fill="F5F5F5" w:color="F5F5F5" w:val="solid"/>
+        <w:spacing w:after="20" w:before="20"/>
+        <w:ind w:left="360"/>
+      </w:pPr>
+      <w:r>
+        <w:rPr>
+          <w:rFonts w:ascii="Consolas" w:cs="Consolas" w:eastAsia="Consolas" w:hAnsi="Consolas"/>
+          <w:sz w:val="18"/>
+          <w:szCs w:val="18"/>
+        </w:rPr>
+        <w:t xml:space="preserve">the resurrection of the body,</w:t>
+      </w:r>
+    </w:p>
+    <w:p>
+      <w:pPr>
+        <w:shd w:fill="F5F5F5" w:color="F5F5F5" w:val="solid"/>
+        <w:spacing w:after="20" w:before="20"/>
+        <w:ind w:left="360"/>
+      </w:pPr>
+      <w:r>
+        <w:rPr>
+          <w:rFonts w:ascii="Consolas" w:cs="Consolas" w:eastAsia="Consolas" w:hAnsi="Consolas"/>
+          <w:sz w:val="18"/>
+          <w:szCs w:val="18"/>
+        </w:rPr>
+        <w:t xml:space="preserve">and life everlasting. Amen.</w:t>
       </w:r>
     </w:p>
     <w:p>
@@ -3511,13 +3729,151 @@
           <w:sz w:val="22"/>
           <w:szCs w:val="22"/>
         </w:rPr>
-        <w:t xml:space="preserve">Our Father who art in heaven, hallowed be Thy name;
-Thy kingdom come;
-Thy will be done on earth as it is in Heaven.
-Give us this day our daily bread;
-and forgive us our trespasses as we forgive those who trespass against us;
-and lead us not into temptation, but deliver us from evil.
-Amen.</w:t>
+        <w:t xml:space="preserve">Our Father, who art in heaven,</w:t>
+      </w:r>
+      <w:r>
+        <w:rPr>
+          <w:rFonts w:ascii="Calibri" w:cs="Calibri" w:eastAsia="Calibri" w:hAnsi="Calibri"/>
+        </w:rPr>
+        <w:br/>
+      </w:r>
+      <w:r>
+        <w:rPr>
+          <w:rFonts w:ascii="Calibri" w:cs="Calibri" w:eastAsia="Calibri" w:hAnsi="Calibri"/>
+          <w:b w:val="false"/>
+          <w:bCs w:val="false"/>
+          <w:i w:val="false"/>
+          <w:iCs w:val="false"/>
+          <w:sz w:val="22"/>
+          <w:szCs w:val="22"/>
+        </w:rPr>
+        <w:t xml:space="preserve">hallowed be Thy name;</w:t>
+      </w:r>
+      <w:r>
+        <w:rPr>
+          <w:rFonts w:ascii="Calibri" w:cs="Calibri" w:eastAsia="Calibri" w:hAnsi="Calibri"/>
+        </w:rPr>
+        <w:br/>
+      </w:r>
+      <w:r>
+        <w:rPr>
+          <w:rFonts w:ascii="Calibri" w:cs="Calibri" w:eastAsia="Calibri" w:hAnsi="Calibri"/>
+          <w:b w:val="false"/>
+          <w:bCs w:val="false"/>
+          <w:i w:val="false"/>
+          <w:iCs w:val="false"/>
+          <w:sz w:val="22"/>
+          <w:szCs w:val="22"/>
+        </w:rPr>
+        <w:t xml:space="preserve">Thy kingdom come;</w:t>
+      </w:r>
+      <w:r>
+        <w:rPr>
+          <w:rFonts w:ascii="Calibri" w:cs="Calibri" w:eastAsia="Calibri" w:hAnsi="Calibri"/>
+        </w:rPr>
+        <w:br/>
+      </w:r>
+      <w:r>
+        <w:rPr>
+          <w:rFonts w:ascii="Calibri" w:cs="Calibri" w:eastAsia="Calibri" w:hAnsi="Calibri"/>
+          <w:b w:val="false"/>
+          <w:bCs w:val="false"/>
+          <w:i w:val="false"/>
+          <w:iCs w:val="false"/>
+          <w:sz w:val="22"/>
+          <w:szCs w:val="22"/>
+        </w:rPr>
+        <w:t xml:space="preserve">Thy will be done on earth as it is in heaven.</w:t>
+      </w:r>
+      <w:r>
+        <w:rPr>
+          <w:rFonts w:ascii="Calibri" w:cs="Calibri" w:eastAsia="Calibri" w:hAnsi="Calibri"/>
+        </w:rPr>
+        <w:br/>
+      </w:r>
+      <w:r>
+        <w:rPr>
+          <w:rFonts w:ascii="Calibri" w:cs="Calibri" w:eastAsia="Calibri" w:hAnsi="Calibri"/>
+          <w:b w:val="false"/>
+          <w:bCs w:val="false"/>
+          <w:i w:val="false"/>
+          <w:iCs w:val="false"/>
+          <w:sz w:val="22"/>
+          <w:szCs w:val="22"/>
+        </w:rPr>
+        <w:t xml:space="preserve">Give us this day our daily bread;</w:t>
+      </w:r>
+      <w:r>
+        <w:rPr>
+          <w:rFonts w:ascii="Calibri" w:cs="Calibri" w:eastAsia="Calibri" w:hAnsi="Calibri"/>
+        </w:rPr>
+        <w:br/>
+      </w:r>
+      <w:r>
+        <w:rPr>
+          <w:rFonts w:ascii="Calibri" w:cs="Calibri" w:eastAsia="Calibri" w:hAnsi="Calibri"/>
+          <w:b w:val="false"/>
+          <w:bCs w:val="false"/>
+          <w:i w:val="false"/>
+          <w:iCs w:val="false"/>
+          <w:sz w:val="22"/>
+          <w:szCs w:val="22"/>
+        </w:rPr>
+        <w:t xml:space="preserve">and forgive us our trespasses</w:t>
+      </w:r>
+      <w:r>
+        <w:rPr>
+          <w:rFonts w:ascii="Calibri" w:cs="Calibri" w:eastAsia="Calibri" w:hAnsi="Calibri"/>
+        </w:rPr>
+        <w:br/>
+      </w:r>
+      <w:r>
+        <w:rPr>
+          <w:rFonts w:ascii="Calibri" w:cs="Calibri" w:eastAsia="Calibri" w:hAnsi="Calibri"/>
+          <w:b w:val="false"/>
+          <w:bCs w:val="false"/>
+          <w:i w:val="false"/>
+          <w:iCs w:val="false"/>
+          <w:sz w:val="22"/>
+          <w:szCs w:val="22"/>
+        </w:rPr>
+        <w:t xml:space="preserve">as we forgive those who trespass against us;</w:t>
+      </w:r>
+      <w:r>
+        <w:rPr>
+          <w:rFonts w:ascii="Calibri" w:cs="Calibri" w:eastAsia="Calibri" w:hAnsi="Calibri"/>
+        </w:rPr>
+        <w:br/>
+      </w:r>
+      <w:r>
+        <w:rPr>
+          <w:rFonts w:ascii="Calibri" w:cs="Calibri" w:eastAsia="Calibri" w:hAnsi="Calibri"/>
+          <w:b w:val="false"/>
+          <w:bCs w:val="false"/>
+          <w:i w:val="false"/>
+          <w:iCs w:val="false"/>
+          <w:sz w:val="22"/>
+          <w:szCs w:val="22"/>
+        </w:rPr>
+        <w:t xml:space="preserve">and lead us not into temptation,</w:t>
+      </w:r>
+      <w:r>
+        <w:rPr>
+          <w:rFonts w:ascii="Calibri" w:cs="Calibri" w:eastAsia="Calibri" w:hAnsi="Calibri"/>
+        </w:rPr>
+        <w:br/>
+      </w:r>
+      <w:r>
+        <w:rPr>
+          <w:rFonts w:ascii="Calibri" w:cs="Calibri" w:eastAsia="Calibri" w:hAnsi="Calibri"/>
+          <w:b w:val="false"/>
+          <w:bCs w:val="false"/>
+          <w:i w:val="false"/>
+          <w:iCs w:val="false"/>
+          <w:sz w:val="22"/>
+          <w:szCs w:val="22"/>
+        </w:rPr>
+        <w:t xml:space="preserve">but deliver us from evil. Amen.</w:t>
       </w:r>
     </w:p>
     <w:p>
@@ -3569,13 +3925,115 @@
           <w:sz w:val="22"/>
           <w:szCs w:val="22"/>
         </w:rPr>
-        <w:t xml:space="preserve">Hail Mary, full of grace!
-the Lord is with thee; blessed are thou among women,
-and blessed is the fruit of thy womb, Jesus.
-Holy Mary, Mother of God,
-pray for us sinners now and at the hour of our death.
-Amen.
-(Recite three times)</w:t>
+        <w:t xml:space="preserve">Hail Mary, full of grace, the Lord is with thee;</w:t>
+      </w:r>
+      <w:r>
+        <w:rPr>
+          <w:rFonts w:ascii="Calibri" w:cs="Calibri" w:eastAsia="Calibri" w:hAnsi="Calibri"/>
+        </w:rPr>
+        <w:br/>
+      </w:r>
+      <w:r>
+        <w:rPr>
+          <w:rFonts w:ascii="Calibri" w:cs="Calibri" w:eastAsia="Calibri" w:hAnsi="Calibri"/>
+          <w:b w:val="false"/>
+          <w:bCs w:val="false"/>
+          <w:i w:val="false"/>
+          <w:iCs w:val="false"/>
+          <w:sz w:val="22"/>
+          <w:szCs w:val="22"/>
+        </w:rPr>
+        <w:t xml:space="preserve">blessed art thou among women,</w:t>
+      </w:r>
+      <w:r>
+        <w:rPr>
+          <w:rFonts w:ascii="Calibri" w:cs="Calibri" w:eastAsia="Calibri" w:hAnsi="Calibri"/>
+        </w:rPr>
+        <w:br/>
+      </w:r>
+      <w:r>
+        <w:rPr>
+          <w:rFonts w:ascii="Calibri" w:cs="Calibri" w:eastAsia="Calibri" w:hAnsi="Calibri"/>
+          <w:b w:val="false"/>
+          <w:bCs w:val="false"/>
+          <w:i w:val="false"/>
+          <w:iCs w:val="false"/>
+          <w:sz w:val="22"/>
+          <w:szCs w:val="22"/>
+        </w:rPr>
+        <w:t xml:space="preserve">and blessed is the fruit of thy womb, Jesus.</w:t>
+      </w:r>
+      <w:r>
+        <w:rPr>
+          <w:rFonts w:ascii="Calibri" w:cs="Calibri" w:eastAsia="Calibri" w:hAnsi="Calibri"/>
+        </w:rPr>
+        <w:br/>
+      </w:r>
+      <w:r>
+        <w:rPr>
+          <w:rFonts w:ascii="Calibri" w:cs="Calibri" w:eastAsia="Calibri" w:hAnsi="Calibri"/>
+          <w:b w:val="false"/>
+          <w:bCs w:val="false"/>
+          <w:i w:val="false"/>
+          <w:iCs w:val="false"/>
+          <w:sz w:val="22"/>
+          <w:szCs w:val="22"/>
+        </w:rPr>
+        <w:t xml:space="preserve">Holy Mary, Mother of God,</w:t>
+      </w:r>
+      <w:r>
+        <w:rPr>
+          <w:rFonts w:ascii="Calibri" w:cs="Calibri" w:eastAsia="Calibri" w:hAnsi="Calibri"/>
+        </w:rPr>
+        <w:br/>
+      </w:r>
+      <w:r>
+        <w:rPr>
+          <w:rFonts w:ascii="Calibri" w:cs="Calibri" w:eastAsia="Calibri" w:hAnsi="Calibri"/>
+          <w:b w:val="false"/>
+          <w:bCs w:val="false"/>
+          <w:i w:val="false"/>
+          <w:iCs w:val="false"/>
+          <w:sz w:val="22"/>
+          <w:szCs w:val="22"/>
+        </w:rPr>
+        <w:t xml:space="preserve">pray for us sinners,</w:t>
+      </w:r>
+      <w:r>
+        <w:rPr>
+          <w:rFonts w:ascii="Calibri" w:cs="Calibri" w:eastAsia="Calibri" w:hAnsi="Calibri"/>
+        </w:rPr>
+        <w:br/>
+      </w:r>
+      <w:r>
+        <w:rPr>
+          <w:rFonts w:ascii="Calibri" w:cs="Calibri" w:eastAsia="Calibri" w:hAnsi="Calibri"/>
+          <w:b w:val="false"/>
+          <w:bCs w:val="false"/>
+          <w:i w:val="false"/>
+          <w:iCs w:val="false"/>
+          <w:sz w:val="22"/>
+          <w:szCs w:val="22"/>
+        </w:rPr>
+        <w:t xml:space="preserve">now and at the hour of our death. Amen.</w:t>
+      </w:r>
+      <w:r>
+        <w:rPr>
+          <w:rFonts w:ascii="Calibri" w:cs="Calibri" w:eastAsia="Calibri" w:hAnsi="Calibri"/>
+        </w:rPr>
+        <w:br/>
+      </w:r>
+      <w:r>
+        <w:rPr>
+          <w:rFonts w:ascii="Calibri" w:cs="Calibri" w:eastAsia="Calibri" w:hAnsi="Calibri"/>
+          <w:b w:val="false"/>
+          <w:bCs w:val="false"/>
+          <w:i w:val="false"/>
+          <w:iCs w:val="false"/>
+          <w:sz w:val="22"/>
+          <w:szCs w:val="22"/>
+        </w:rPr>
+        <w:t xml:space="preserve">(Recite three times)</w:t>
       </w:r>
     </w:p>
     <w:p>
@@ -3627,66 +4085,43 @@
           <w:sz w:val="22"/>
           <w:szCs w:val="22"/>
         </w:rPr>
-        <w:t xml:space="preserve">Glory be to the Father, and to the Son,
-and to the Holy Spirit.
-As it was in the beginning, is now, and ever shall be,
-world without end.
-Amen.</w:t>
-      </w:r>
-    </w:p>
-    <w:p>
-      <w:pPr>
-        <w:spacing w:after="40" w:before="40"/>
-        <w:ind w:left="720"/>
-      </w:pPr>
-      <w:r>
-        <w:rPr>
-          <w:rFonts w:ascii="Calibri" w:cs="Calibri" w:eastAsia="Calibri" w:hAnsi="Calibri"/>
-          <w:sz w:val="22"/>
-          <w:szCs w:val="22"/>
-        </w:rPr>
-        <w:t xml:space="preserve">•  </w:t>
-      </w:r>
-      <w:r>
-        <w:rPr>
-          <w:rFonts w:ascii="Calibri" w:cs="Calibri" w:eastAsia="Calibri" w:hAnsi="Calibri"/>
-          <w:b/>
-          <w:bCs/>
-          <w:i w:val="false"/>
-          <w:iCs w:val="false"/>
-          <w:sz w:val="22"/>
-          <w:szCs w:val="22"/>
-        </w:rPr>
-        <w:t xml:space="preserve">Fatima Decade Prayer:</w:t>
-      </w:r>
-    </w:p>
-    <w:p>
-      <w:pPr>
-        <w:spacing w:after="40" w:before="40"/>
-        <w:ind w:left="1080"/>
-      </w:pPr>
-      <w:r>
-        <w:rPr>
-          <w:rFonts w:ascii="Calibri" w:cs="Calibri" w:eastAsia="Calibri" w:hAnsi="Calibri"/>
-          <w:sz w:val="22"/>
-          <w:szCs w:val="22"/>
-        </w:rPr>
-        <w:t xml:space="preserve"/>
-      </w:r>
-      <w:r>
-        <w:rPr>
-          <w:rFonts w:ascii="Calibri" w:cs="Calibri" w:eastAsia="Calibri" w:hAnsi="Calibri"/>
-          <w:b w:val="false"/>
-          <w:bCs w:val="false"/>
-          <w:i w:val="false"/>
-          <w:iCs w:val="false"/>
-          <w:sz w:val="22"/>
-          <w:szCs w:val="22"/>
-        </w:rPr>
-        <w:t xml:space="preserve">O my Jesus, forgive us our sins,
-save us from the fires of hell, and lead all souls to Heaven,
-especially those in most need of your Mercy.
-Amen.</w:t>
+        <w:t xml:space="preserve">Glory be to the Father, and to the Son, and to the Holy Spirit.</w:t>
+      </w:r>
+      <w:r>
+        <w:rPr>
+          <w:rFonts w:ascii="Calibri" w:cs="Calibri" w:eastAsia="Calibri" w:hAnsi="Calibri"/>
+        </w:rPr>
+        <w:br/>
+      </w:r>
+      <w:r>
+        <w:rPr>
+          <w:rFonts w:ascii="Calibri" w:cs="Calibri" w:eastAsia="Calibri" w:hAnsi="Calibri"/>
+          <w:b w:val="false"/>
+          <w:bCs w:val="false"/>
+          <w:i w:val="false"/>
+          <w:iCs w:val="false"/>
+          <w:sz w:val="22"/>
+          <w:szCs w:val="22"/>
+        </w:rPr>
+        <w:t xml:space="preserve">As it was in the beginning, is now, and ever shall be,</w:t>
+      </w:r>
+      <w:r>
+        <w:rPr>
+          <w:rFonts w:ascii="Calibri" w:cs="Calibri" w:eastAsia="Calibri" w:hAnsi="Calibri"/>
+        </w:rPr>
+        <w:br/>
+      </w:r>
+      <w:r>
+        <w:rPr>
+          <w:rFonts w:ascii="Calibri" w:cs="Calibri" w:eastAsia="Calibri" w:hAnsi="Calibri"/>
+          <w:b w:val="false"/>
+          <w:bCs w:val="false"/>
+          <w:i w:val="false"/>
+          <w:iCs w:val="false"/>
+          <w:sz w:val="22"/>
+          <w:szCs w:val="22"/>
+        </w:rPr>
+        <w:t xml:space="preserve">world without end. Amen.</w:t>
       </w:r>
     </w:p>
     <w:p>
@@ -3848,11 +4283,43 @@
           <w:sz w:val="22"/>
           <w:szCs w:val="22"/>
         </w:rPr>
-        <w:t xml:space="preserve">Glory be to the Father, and to the Son,
-and to the Holy Spirit.
-As it was in the beginning, is now, and ever shall be,
-world without end.
-Amen.</w:t>
+        <w:t xml:space="preserve">Glory be to the Father, and to the Son, and to the Holy Spirit.</w:t>
+      </w:r>
+      <w:r>
+        <w:rPr>
+          <w:rFonts w:ascii="Calibri" w:cs="Calibri" w:eastAsia="Calibri" w:hAnsi="Calibri"/>
+        </w:rPr>
+        <w:br/>
+      </w:r>
+      <w:r>
+        <w:rPr>
+          <w:rFonts w:ascii="Calibri" w:cs="Calibri" w:eastAsia="Calibri" w:hAnsi="Calibri"/>
+          <w:b w:val="false"/>
+          <w:bCs w:val="false"/>
+          <w:i w:val="false"/>
+          <w:iCs w:val="false"/>
+          <w:sz w:val="22"/>
+          <w:szCs w:val="22"/>
+        </w:rPr>
+        <w:t xml:space="preserve">As it was in the beginning, is now, and ever shall be,</w:t>
+      </w:r>
+      <w:r>
+        <w:rPr>
+          <w:rFonts w:ascii="Calibri" w:cs="Calibri" w:eastAsia="Calibri" w:hAnsi="Calibri"/>
+        </w:rPr>
+        <w:br/>
+      </w:r>
+      <w:r>
+        <w:rPr>
+          <w:rFonts w:ascii="Calibri" w:cs="Calibri" w:eastAsia="Calibri" w:hAnsi="Calibri"/>
+          <w:b w:val="false"/>
+          <w:bCs w:val="false"/>
+          <w:i w:val="false"/>
+          <w:iCs w:val="false"/>
+          <w:sz w:val="22"/>
+          <w:szCs w:val="22"/>
+        </w:rPr>
+        <w:t xml:space="preserve">world without end. Amen.</w:t>
       </w:r>
     </w:p>
     <w:p>
@@ -3904,10 +4371,61 @@
           <w:sz w:val="22"/>
           <w:szCs w:val="22"/>
         </w:rPr>
-        <w:t xml:space="preserve">O my Jesus, forgive us our sins,
-save us from the fires of hell, and lead all souls to Heaven,
-especially those in most need of your Mercy.
-Amen.</w:t>
+        <w:t xml:space="preserve">O my Jesus, forgive us our sins,</w:t>
+      </w:r>
+      <w:r>
+        <w:rPr>
+          <w:rFonts w:ascii="Calibri" w:cs="Calibri" w:eastAsia="Calibri" w:hAnsi="Calibri"/>
+        </w:rPr>
+        <w:br/>
+      </w:r>
+      <w:r>
+        <w:rPr>
+          <w:rFonts w:ascii="Calibri" w:cs="Calibri" w:eastAsia="Calibri" w:hAnsi="Calibri"/>
+          <w:b w:val="false"/>
+          <w:bCs w:val="false"/>
+          <w:i w:val="false"/>
+          <w:iCs w:val="false"/>
+          <w:sz w:val="22"/>
+          <w:szCs w:val="22"/>
+        </w:rPr>
+        <w:t xml:space="preserve">save us from the fires of hell;</w:t>
+      </w:r>
+      <w:r>
+        <w:rPr>
+          <w:rFonts w:ascii="Calibri" w:cs="Calibri" w:eastAsia="Calibri" w:hAnsi="Calibri"/>
+        </w:rPr>
+        <w:br/>
+      </w:r>
+      <w:r>
+        <w:rPr>
+          <w:rFonts w:ascii="Calibri" w:cs="Calibri" w:eastAsia="Calibri" w:hAnsi="Calibri"/>
+          <w:b w:val="false"/>
+          <w:bCs w:val="false"/>
+          <w:i w:val="false"/>
+          <w:iCs w:val="false"/>
+          <w:sz w:val="22"/>
+          <w:szCs w:val="22"/>
+        </w:rPr>
+        <w:t xml:space="preserve">lead all souls to Heaven,</w:t>
+      </w:r>
+      <w:r>
+        <w:rPr>
+          <w:rFonts w:ascii="Calibri" w:cs="Calibri" w:eastAsia="Calibri" w:hAnsi="Calibri"/>
+        </w:rPr>
+        <w:br/>
+      </w:r>
+      <w:r>
+        <w:rPr>
+          <w:rFonts w:ascii="Calibri" w:cs="Calibri" w:eastAsia="Calibri" w:hAnsi="Calibri"/>
+          <w:b w:val="false"/>
+          <w:bCs w:val="false"/>
+          <w:i w:val="false"/>
+          <w:iCs w:val="false"/>
+          <w:sz w:val="22"/>
+          <w:szCs w:val="22"/>
+        </w:rPr>
+        <w:t xml:space="preserve">especially those in most need of Thy mercy. Amen.</w:t>
       </w:r>
     </w:p>
     <w:p>
@@ -5542,142 +6060,127 @@
           <w:sz w:val="18"/>
           <w:szCs w:val="18"/>
         </w:rPr>
-        <w:t xml:space="preserve">Hail, holy Queen, Mother of mercy, hail, our life,</w:t>
-      </w:r>
-    </w:p>
-    <w:p>
-      <w:pPr>
-        <w:shd w:fill="F5F5F5" w:color="F5F5F5" w:val="solid"/>
-        <w:spacing w:after="20" w:before="20"/>
-        <w:ind w:left="360"/>
-      </w:pPr>
-      <w:r>
-        <w:rPr>
-          <w:rFonts w:ascii="Consolas" w:cs="Consolas" w:eastAsia="Consolas" w:hAnsi="Consolas"/>
-          <w:sz w:val="18"/>
-          <w:szCs w:val="18"/>
-        </w:rPr>
-        <w:t xml:space="preserve">our sweetness and our hope.</w:t>
-      </w:r>
-    </w:p>
-    <w:p>
-      <w:pPr>
-        <w:shd w:fill="F5F5F5" w:color="F5F5F5" w:val="solid"/>
-        <w:spacing w:after="20" w:before="20"/>
-        <w:ind w:left="360"/>
-      </w:pPr>
-      <w:r>
-        <w:rPr>
-          <w:rFonts w:ascii="Consolas" w:cs="Consolas" w:eastAsia="Consolas" w:hAnsi="Consolas"/>
-          <w:sz w:val="18"/>
-          <w:szCs w:val="18"/>
-        </w:rPr>
-        <w:t xml:space="preserve">To thee do we cry, poor banished children of Eve:</w:t>
-      </w:r>
-    </w:p>
-    <w:p>
-      <w:pPr>
-        <w:shd w:fill="F5F5F5" w:color="F5F5F5" w:val="solid"/>
-        <w:spacing w:after="20" w:before="20"/>
-        <w:ind w:left="360"/>
-      </w:pPr>
-      <w:r>
-        <w:rPr>
-          <w:rFonts w:ascii="Consolas" w:cs="Consolas" w:eastAsia="Consolas" w:hAnsi="Consolas"/>
-          <w:sz w:val="18"/>
-          <w:szCs w:val="18"/>
-        </w:rPr>
-        <w:t xml:space="preserve">to thee do we send up our sighs,</w:t>
-      </w:r>
-    </w:p>
-    <w:p>
-      <w:pPr>
-        <w:shd w:fill="F5F5F5" w:color="F5F5F5" w:val="solid"/>
-        <w:spacing w:after="20" w:before="20"/>
-        <w:ind w:left="360"/>
-      </w:pPr>
-      <w:r>
-        <w:rPr>
-          <w:rFonts w:ascii="Consolas" w:cs="Consolas" w:eastAsia="Consolas" w:hAnsi="Consolas"/>
-          <w:sz w:val="18"/>
-          <w:szCs w:val="18"/>
-        </w:rPr>
-        <w:t xml:space="preserve">mourning and weeping in this vale of tears.</w:t>
-      </w:r>
-    </w:p>
-    <w:p>
-      <w:pPr>
-        <w:shd w:fill="F5F5F5" w:color="F5F5F5" w:val="solid"/>
-        <w:spacing w:after="20" w:before="20"/>
-        <w:ind w:left="360"/>
-      </w:pPr>
-      <w:r>
-        <w:rPr>
-          <w:rFonts w:ascii="Consolas" w:cs="Consolas" w:eastAsia="Consolas" w:hAnsi="Consolas"/>
-          <w:sz w:val="18"/>
-          <w:szCs w:val="18"/>
-        </w:rPr>
-        <w:t xml:space="preserve">Turn then, most gracious Advocate,</w:t>
-      </w:r>
-    </w:p>
-    <w:p>
-      <w:pPr>
-        <w:shd w:fill="F5F5F5" w:color="F5F5F5" w:val="solid"/>
-        <w:spacing w:after="20" w:before="20"/>
-        <w:ind w:left="360"/>
-      </w:pPr>
-      <w:r>
-        <w:rPr>
-          <w:rFonts w:ascii="Consolas" w:cs="Consolas" w:eastAsia="Consolas" w:hAnsi="Consolas"/>
-          <w:sz w:val="18"/>
-          <w:szCs w:val="18"/>
-        </w:rPr>
-        <w:t xml:space="preserve">thine eyes of mercy toward us, and after this our exile,</w:t>
-      </w:r>
-    </w:p>
-    <w:p>
-      <w:pPr>
-        <w:shd w:fill="F5F5F5" w:color="F5F5F5" w:val="solid"/>
-        <w:spacing w:after="20" w:before="20"/>
-        <w:ind w:left="360"/>
-      </w:pPr>
-      <w:r>
-        <w:rPr>
-          <w:rFonts w:ascii="Consolas" w:cs="Consolas" w:eastAsia="Consolas" w:hAnsi="Consolas"/>
-          <w:sz w:val="18"/>
-          <w:szCs w:val="18"/>
-        </w:rPr>
-        <w:t xml:space="preserve">show unto us the blessed fruit of thy womb, Jesus, O merciful,</w:t>
-      </w:r>
-    </w:p>
-    <w:p>
-      <w:pPr>
-        <w:shd w:fill="F5F5F5" w:color="F5F5F5" w:val="solid"/>
-        <w:spacing w:after="20" w:before="20"/>
-        <w:ind w:left="360"/>
-      </w:pPr>
-      <w:r>
-        <w:rPr>
-          <w:rFonts w:ascii="Consolas" w:cs="Consolas" w:eastAsia="Consolas" w:hAnsi="Consolas"/>
-          <w:sz w:val="18"/>
-          <w:szCs w:val="18"/>
-        </w:rPr>
-        <w:t xml:space="preserve">O loving, O sweet Virgin Mary!</w:t>
-      </w:r>
-    </w:p>
-    <w:p>
-      <w:pPr>
-        <w:shd w:fill="F5F5F5" w:color="F5F5F5" w:val="solid"/>
-        <w:spacing w:after="20" w:before="20"/>
-        <w:ind w:left="360"/>
-      </w:pPr>
-      <w:r>
-        <w:rPr>
-          <w:rFonts w:ascii="Consolas" w:cs="Consolas" w:eastAsia="Consolas" w:hAnsi="Consolas"/>
-          <w:sz w:val="18"/>
-          <w:szCs w:val="18"/>
-        </w:rPr>
-        <w:t xml:space="preserve">Amen.</w:t>
+        <w:t xml:space="preserve">Hail, holy Queen, Mother of mercy, our life, our sweetness, and our hope.</w:t>
+      </w:r>
+    </w:p>
+    <w:p>
+      <w:pPr>
+        <w:shd w:fill="F5F5F5" w:color="F5F5F5" w:val="solid"/>
+        <w:spacing w:after="20" w:before="20"/>
+        <w:ind w:left="360"/>
+      </w:pPr>
+      <w:r>
+        <w:rPr>
+          <w:rFonts w:ascii="Consolas" w:cs="Consolas" w:eastAsia="Consolas" w:hAnsi="Consolas"/>
+          <w:sz w:val="18"/>
+          <w:szCs w:val="18"/>
+        </w:rPr>
+        <w:t xml:space="preserve">To thee do we cry, poor banished children of Eve.</w:t>
+      </w:r>
+    </w:p>
+    <w:p>
+      <w:pPr>
+        <w:shd w:fill="F5F5F5" w:color="F5F5F5" w:val="solid"/>
+        <w:spacing w:after="20" w:before="20"/>
+        <w:ind w:left="360"/>
+      </w:pPr>
+      <w:r>
+        <w:rPr>
+          <w:rFonts w:ascii="Consolas" w:cs="Consolas" w:eastAsia="Consolas" w:hAnsi="Consolas"/>
+          <w:sz w:val="18"/>
+          <w:szCs w:val="18"/>
+        </w:rPr>
+        <w:t xml:space="preserve">To thee do we send up our sighs, mourning and weeping in this valley of tears.</w:t>
+      </w:r>
+    </w:p>
+    <w:p>
+      <w:pPr>
+        <w:shd w:fill="F5F5F5" w:color="F5F5F5" w:val="solid"/>
+        <w:spacing w:after="20" w:before="20"/>
+        <w:ind w:left="360"/>
+      </w:pPr>
+      <w:r>
+        <w:rPr>
+          <w:rFonts w:ascii="Consolas" w:cs="Consolas" w:eastAsia="Consolas" w:hAnsi="Consolas"/>
+          <w:sz w:val="18"/>
+          <w:szCs w:val="18"/>
+        </w:rPr>
+        <w:t xml:space="preserve">Turn then, most gracious Advocate, thine eyes of mercy toward us,</w:t>
+      </w:r>
+    </w:p>
+    <w:p>
+      <w:pPr>
+        <w:shd w:fill="F5F5F5" w:color="F5F5F5" w:val="solid"/>
+        <w:spacing w:after="20" w:before="20"/>
+        <w:ind w:left="360"/>
+      </w:pPr>
+      <w:r>
+        <w:rPr>
+          <w:rFonts w:ascii="Consolas" w:cs="Consolas" w:eastAsia="Consolas" w:hAnsi="Consolas"/>
+          <w:sz w:val="18"/>
+          <w:szCs w:val="18"/>
+        </w:rPr>
+        <w:t xml:space="preserve">and after this our exile, show unto us the blessed fruit of thy womb, Jesus.</w:t>
+      </w:r>
+    </w:p>
+    <w:p>
+      <w:pPr>
+        <w:shd w:fill="F5F5F5" w:color="F5F5F5" w:val="solid"/>
+        <w:spacing w:after="20" w:before="20"/>
+        <w:ind w:left="360"/>
+      </w:pPr>
+      <w:r>
+        <w:rPr>
+          <w:rFonts w:ascii="Consolas" w:cs="Consolas" w:eastAsia="Consolas" w:hAnsi="Consolas"/>
+          <w:sz w:val="18"/>
+          <w:szCs w:val="18"/>
+        </w:rPr>
+        <w:t xml:space="preserve">O clement, O loving, O sweet Virgin Mary.</w:t>
+      </w:r>
+    </w:p>
+    <w:p>
+      <w:pPr>
+        <w:shd w:fill="F5F5F5" w:color="F5F5F5" w:val="solid"/>
+        <w:spacing w:after="20" w:before="20"/>
+        <w:ind w:left="360"/>
+      </w:pPr>
+      <w:r>
+        <w:rPr>
+          <w:rFonts w:ascii="Consolas" w:cs="Consolas" w:eastAsia="Consolas" w:hAnsi="Consolas"/>
+          <w:sz w:val="18"/>
+          <w:szCs w:val="18"/>
+        </w:rPr>
+        <w:t xml:space="preserve"> </w:t>
+      </w:r>
+    </w:p>
+    <w:p>
+      <w:pPr>
+        <w:shd w:fill="F5F5F5" w:color="F5F5F5" w:val="solid"/>
+        <w:spacing w:after="20" w:before="20"/>
+        <w:ind w:left="360"/>
+      </w:pPr>
+      <w:r>
+        <w:rPr>
+          <w:rFonts w:ascii="Consolas" w:cs="Consolas" w:eastAsia="Consolas" w:hAnsi="Consolas"/>
+          <w:sz w:val="18"/>
+          <w:szCs w:val="18"/>
+        </w:rPr>
+        <w:t xml:space="preserve">V. Pray for us, O holy Mother of God.</w:t>
+      </w:r>
+    </w:p>
+    <w:p>
+      <w:pPr>
+        <w:shd w:fill="F5F5F5" w:color="F5F5F5" w:val="solid"/>
+        <w:spacing w:after="20" w:before="20"/>
+        <w:ind w:left="360"/>
+      </w:pPr>
+      <w:r>
+        <w:rPr>
+          <w:rFonts w:ascii="Consolas" w:cs="Consolas" w:eastAsia="Consolas" w:hAnsi="Consolas"/>
+          <w:sz w:val="18"/>
+          <w:szCs w:val="18"/>
+        </w:rPr>
+        <w:t xml:space="preserve">R. That we may be made worthy of the promises of Christ.</w:t>
       </w:r>
     </w:p>
     <w:p>
@@ -5714,127 +6217,157 @@
           <w:sz w:val="18"/>
           <w:szCs w:val="18"/>
         </w:rPr>
-        <w:t xml:space="preserve">Let Us Pray.</w:t>
-      </w:r>
-    </w:p>
-    <w:p>
-      <w:pPr>
-        <w:shd w:fill="F5F5F5" w:color="F5F5F5" w:val="solid"/>
-        <w:spacing w:after="20" w:before="20"/>
-        <w:ind w:left="360"/>
-      </w:pPr>
-      <w:r>
-        <w:rPr>
-          <w:rFonts w:ascii="Consolas" w:cs="Consolas" w:eastAsia="Consolas" w:hAnsi="Consolas"/>
-          <w:sz w:val="18"/>
-          <w:szCs w:val="18"/>
-        </w:rPr>
-        <w:t xml:space="preserve">O God, Whose only begotten Son, by His Life, death,</w:t>
-      </w:r>
-    </w:p>
-    <w:p>
-      <w:pPr>
-        <w:shd w:fill="F5F5F5" w:color="F5F5F5" w:val="solid"/>
-        <w:spacing w:after="20" w:before="20"/>
-        <w:ind w:left="360"/>
-      </w:pPr>
-      <w:r>
-        <w:rPr>
-          <w:rFonts w:ascii="Consolas" w:cs="Consolas" w:eastAsia="Consolas" w:hAnsi="Consolas"/>
-          <w:sz w:val="18"/>
-          <w:szCs w:val="18"/>
-        </w:rPr>
-        <w:t xml:space="preserve">and resurrection has purchased for us the rewards of eternal life;</w:t>
-      </w:r>
-    </w:p>
-    <w:p>
-      <w:pPr>
-        <w:shd w:fill="F5F5F5" w:color="F5F5F5" w:val="solid"/>
-        <w:spacing w:after="20" w:before="20"/>
-        <w:ind w:left="360"/>
-      </w:pPr>
-      <w:r>
-        <w:rPr>
-          <w:rFonts w:ascii="Consolas" w:cs="Consolas" w:eastAsia="Consolas" w:hAnsi="Consolas"/>
-          <w:sz w:val="18"/>
-          <w:szCs w:val="18"/>
-        </w:rPr>
-        <w:t xml:space="preserve">grant we beseech Thee,</w:t>
-      </w:r>
-    </w:p>
-    <w:p>
-      <w:pPr>
-        <w:shd w:fill="F5F5F5" w:color="F5F5F5" w:val="solid"/>
-        <w:spacing w:after="20" w:before="20"/>
-        <w:ind w:left="360"/>
-      </w:pPr>
-      <w:r>
-        <w:rPr>
-          <w:rFonts w:ascii="Consolas" w:cs="Consolas" w:eastAsia="Consolas" w:hAnsi="Consolas"/>
-          <w:sz w:val="18"/>
-          <w:szCs w:val="18"/>
-        </w:rPr>
-        <w:t xml:space="preserve">that meditating upon these mysteries of the Most Holy Rosary of the Blessed Virgin Mary,</w:t>
-      </w:r>
-    </w:p>
-    <w:p>
-      <w:pPr>
-        <w:shd w:fill="F5F5F5" w:color="F5F5F5" w:val="solid"/>
-        <w:spacing w:after="20" w:before="20"/>
-        <w:ind w:left="360"/>
-      </w:pPr>
-      <w:r>
-        <w:rPr>
-          <w:rFonts w:ascii="Consolas" w:cs="Consolas" w:eastAsia="Consolas" w:hAnsi="Consolas"/>
-          <w:sz w:val="18"/>
-          <w:szCs w:val="18"/>
-        </w:rPr>
-        <w:t xml:space="preserve">we may imitate what they contain,</w:t>
-      </w:r>
-    </w:p>
-    <w:p>
-      <w:pPr>
-        <w:shd w:fill="F5F5F5" w:color="F5F5F5" w:val="solid"/>
-        <w:spacing w:after="20" w:before="20"/>
-        <w:ind w:left="360"/>
-      </w:pPr>
-      <w:r>
-        <w:rPr>
-          <w:rFonts w:ascii="Consolas" w:cs="Consolas" w:eastAsia="Consolas" w:hAnsi="Consolas"/>
-          <w:sz w:val="18"/>
-          <w:szCs w:val="18"/>
-        </w:rPr>
-        <w:t xml:space="preserve">and obtain what they promise.</w:t>
-      </w:r>
-    </w:p>
-    <w:p>
-      <w:pPr>
-        <w:shd w:fill="F5F5F5" w:color="F5F5F5" w:val="solid"/>
-        <w:spacing w:after="20" w:before="20"/>
-        <w:ind w:left="360"/>
-      </w:pPr>
-      <w:r>
-        <w:rPr>
-          <w:rFonts w:ascii="Consolas" w:cs="Consolas" w:eastAsia="Consolas" w:hAnsi="Consolas"/>
-          <w:sz w:val="18"/>
-          <w:szCs w:val="18"/>
-        </w:rPr>
-        <w:t xml:space="preserve">We ask this through the same Christ our Lord.</w:t>
-      </w:r>
-    </w:p>
-    <w:p>
-      <w:pPr>
-        <w:shd w:fill="F5F5F5" w:color="F5F5F5" w:val="solid"/>
-        <w:spacing w:after="20" w:before="20"/>
-        <w:ind w:left="360"/>
-      </w:pPr>
-      <w:r>
-        <w:rPr>
-          <w:rFonts w:ascii="Consolas" w:cs="Consolas" w:eastAsia="Consolas" w:hAnsi="Consolas"/>
-          <w:sz w:val="18"/>
-          <w:szCs w:val="18"/>
-        </w:rPr>
-        <w:t xml:space="preserve">Amen.</w:t>
+        <w:t xml:space="preserve">Let us pray.</w:t>
+      </w:r>
+    </w:p>
+    <w:p>
+      <w:pPr>
+        <w:shd w:fill="F5F5F5" w:color="F5F5F5" w:val="solid"/>
+        <w:spacing w:after="20" w:before="20"/>
+        <w:ind w:left="360"/>
+      </w:pPr>
+      <w:r>
+        <w:rPr>
+          <w:rFonts w:ascii="Consolas" w:cs="Consolas" w:eastAsia="Consolas" w:hAnsi="Consolas"/>
+          <w:sz w:val="18"/>
+          <w:szCs w:val="18"/>
+        </w:rPr>
+        <w:t xml:space="preserve"> </w:t>
+      </w:r>
+    </w:p>
+    <w:p>
+      <w:pPr>
+        <w:shd w:fill="F5F5F5" w:color="F5F5F5" w:val="solid"/>
+        <w:spacing w:after="20" w:before="20"/>
+        <w:ind w:left="360"/>
+      </w:pPr>
+      <w:r>
+        <w:rPr>
+          <w:rFonts w:ascii="Consolas" w:cs="Consolas" w:eastAsia="Consolas" w:hAnsi="Consolas"/>
+          <w:sz w:val="18"/>
+          <w:szCs w:val="18"/>
+        </w:rPr>
+        <w:t xml:space="preserve">O God, whose only-begotten Son,</w:t>
+      </w:r>
+    </w:p>
+    <w:p>
+      <w:pPr>
+        <w:shd w:fill="F5F5F5" w:color="F5F5F5" w:val="solid"/>
+        <w:spacing w:after="20" w:before="20"/>
+        <w:ind w:left="360"/>
+      </w:pPr>
+      <w:r>
+        <w:rPr>
+          <w:rFonts w:ascii="Consolas" w:cs="Consolas" w:eastAsia="Consolas" w:hAnsi="Consolas"/>
+          <w:sz w:val="18"/>
+          <w:szCs w:val="18"/>
+        </w:rPr>
+        <w:t xml:space="preserve">by His life, death, and resurrection,</w:t>
+      </w:r>
+    </w:p>
+    <w:p>
+      <w:pPr>
+        <w:shd w:fill="F5F5F5" w:color="F5F5F5" w:val="solid"/>
+        <w:spacing w:after="20" w:before="20"/>
+        <w:ind w:left="360"/>
+      </w:pPr>
+      <w:r>
+        <w:rPr>
+          <w:rFonts w:ascii="Consolas" w:cs="Consolas" w:eastAsia="Consolas" w:hAnsi="Consolas"/>
+          <w:sz w:val="18"/>
+          <w:szCs w:val="18"/>
+        </w:rPr>
+        <w:t xml:space="preserve">has purchased for us the rewards of eternal life,</w:t>
+      </w:r>
+    </w:p>
+    <w:p>
+      <w:pPr>
+        <w:shd w:fill="F5F5F5" w:color="F5F5F5" w:val="solid"/>
+        <w:spacing w:after="20" w:before="20"/>
+        <w:ind w:left="360"/>
+      </w:pPr>
+      <w:r>
+        <w:rPr>
+          <w:rFonts w:ascii="Consolas" w:cs="Consolas" w:eastAsia="Consolas" w:hAnsi="Consolas"/>
+          <w:sz w:val="18"/>
+          <w:szCs w:val="18"/>
+        </w:rPr>
+        <w:t xml:space="preserve">grant, we beseech Thee,</w:t>
+      </w:r>
+    </w:p>
+    <w:p>
+      <w:pPr>
+        <w:shd w:fill="F5F5F5" w:color="F5F5F5" w:val="solid"/>
+        <w:spacing w:after="20" w:before="20"/>
+        <w:ind w:left="360"/>
+      </w:pPr>
+      <w:r>
+        <w:rPr>
+          <w:rFonts w:ascii="Consolas" w:cs="Consolas" w:eastAsia="Consolas" w:hAnsi="Consolas"/>
+          <w:sz w:val="18"/>
+          <w:szCs w:val="18"/>
+        </w:rPr>
+        <w:t xml:space="preserve">that meditating upon these mysteries</w:t>
+      </w:r>
+    </w:p>
+    <w:p>
+      <w:pPr>
+        <w:shd w:fill="F5F5F5" w:color="F5F5F5" w:val="solid"/>
+        <w:spacing w:after="20" w:before="20"/>
+        <w:ind w:left="360"/>
+      </w:pPr>
+      <w:r>
+        <w:rPr>
+          <w:rFonts w:ascii="Consolas" w:cs="Consolas" w:eastAsia="Consolas" w:hAnsi="Consolas"/>
+          <w:sz w:val="18"/>
+          <w:szCs w:val="18"/>
+        </w:rPr>
+        <w:t xml:space="preserve">of the Most Holy Rosary of the Blessed Virgin Mary,</w:t>
+      </w:r>
+    </w:p>
+    <w:p>
+      <w:pPr>
+        <w:shd w:fill="F5F5F5" w:color="F5F5F5" w:val="solid"/>
+        <w:spacing w:after="20" w:before="20"/>
+        <w:ind w:left="360"/>
+      </w:pPr>
+      <w:r>
+        <w:rPr>
+          <w:rFonts w:ascii="Consolas" w:cs="Consolas" w:eastAsia="Consolas" w:hAnsi="Consolas"/>
+          <w:sz w:val="18"/>
+          <w:szCs w:val="18"/>
+        </w:rPr>
+        <w:t xml:space="preserve">we may imitate what they contain</w:t>
+      </w:r>
+    </w:p>
+    <w:p>
+      <w:pPr>
+        <w:shd w:fill="F5F5F5" w:color="F5F5F5" w:val="solid"/>
+        <w:spacing w:after="20" w:before="20"/>
+        <w:ind w:left="360"/>
+      </w:pPr>
+      <w:r>
+        <w:rPr>
+          <w:rFonts w:ascii="Consolas" w:cs="Consolas" w:eastAsia="Consolas" w:hAnsi="Consolas"/>
+          <w:sz w:val="18"/>
+          <w:szCs w:val="18"/>
+        </w:rPr>
+        <w:t xml:space="preserve">and obtain what they promise,</w:t>
+      </w:r>
+    </w:p>
+    <w:p>
+      <w:pPr>
+        <w:shd w:fill="F5F5F5" w:color="F5F5F5" w:val="solid"/>
+        <w:spacing w:after="20" w:before="20"/>
+        <w:ind w:left="360"/>
+      </w:pPr>
+      <w:r>
+        <w:rPr>
+          <w:rFonts w:ascii="Consolas" w:cs="Consolas" w:eastAsia="Consolas" w:hAnsi="Consolas"/>
+          <w:sz w:val="18"/>
+          <w:szCs w:val="18"/>
+        </w:rPr>
+        <w:t xml:space="preserve">through the same Christ our Lord. Amen.</w:t>
       </w:r>
     </w:p>
     <w:p>

</xml_diff>

<commit_message>
docs(book-of-truth): re-render printable Crusade and Daily Prayers DOCX
</commit_message>
<xml_diff>
--- a/for-printing/crusade-prayers/crusade-and-daily-prayers.docx
+++ b/for-printing/crusade-prayers/crusade-and-daily-prayers.docx
@@ -44,7 +44,21 @@
         <w:rPr>
           <w:color w:val="666666"/>
         </w:rPr>
-        <w:t>Date: 2026-10-09  |  Version: 1.0</w:t>
+        <w:t>Date: 2026-10-</w:t>
+      </w:r>
+      <w:proofErr w:type="gramStart"/>
+      <w:r>
+        <w:rPr>
+          <w:color w:val="666666"/>
+        </w:rPr>
+        <w:t>09  |</w:t>
+      </w:r>
+      <w:proofErr w:type="gramEnd"/>
+      <w:r>
+        <w:rPr>
+          <w:color w:val="666666"/>
+        </w:rPr>
+        <w:t xml:space="preserve">  Version: 1.0</w:t>
       </w:r>
     </w:p>
     <w:p>
@@ -175,7 +189,25 @@
           <w:sz w:val="18"/>
           <w:szCs w:val="18"/>
         </w:rPr>
-        <w:t>Jesus forgive me, for I have sinned.</w:t>
+        <w:t xml:space="preserve">Jesus </w:t>
+      </w:r>
+      <w:proofErr w:type="gramStart"/>
+      <w:r>
+        <w:rPr>
+          <w:rFonts w:ascii="Consolas" w:eastAsia="Consolas" w:hAnsi="Consolas" w:cs="Consolas"/>
+          <w:sz w:val="18"/>
+          <w:szCs w:val="18"/>
+        </w:rPr>
+        <w:t>forgive</w:t>
+      </w:r>
+      <w:proofErr w:type="gramEnd"/>
+      <w:r>
+        <w:rPr>
+          <w:rFonts w:ascii="Consolas" w:eastAsia="Consolas" w:hAnsi="Consolas" w:cs="Consolas"/>
+          <w:sz w:val="18"/>
+          <w:szCs w:val="18"/>
+        </w:rPr>
+        <w:t xml:space="preserve"> me, for I have sinned.</w:t>
       </w:r>
     </w:p>
     <w:p>
@@ -373,28 +405,56 @@
         <w:spacing w:before="20" w:after="20"/>
         <w:ind w:left="360"/>
       </w:pPr>
-      <w:r>
-        <w:rPr>
-          <w:rFonts w:ascii="Consolas" w:eastAsia="Consolas" w:hAnsi="Consolas" w:cs="Consolas"/>
-          <w:sz w:val="18"/>
-          <w:szCs w:val="18"/>
-        </w:rPr>
-        <w:t>Oh my precious Jesus embrace me in your arms and allow my head to rest upon your shoulders so that you can raise me up to your glorious Kingdom when the time is right.</w:t>
-      </w:r>
-    </w:p>
-    <w:p>
-      <w:pPr>
-        <w:shd w:val="solid" w:color="F5F5F5" w:fill="F5F5F5"/>
-        <w:spacing w:before="20" w:after="20"/>
-        <w:ind w:left="360"/>
-      </w:pPr>
-      <w:r>
-        <w:rPr>
-          <w:rFonts w:ascii="Consolas" w:eastAsia="Consolas" w:hAnsi="Consolas" w:cs="Consolas"/>
-          <w:sz w:val="18"/>
-          <w:szCs w:val="18"/>
-        </w:rPr>
-        <w:t>Allow your precious blood to flow over my heart that we can be united as one.</w:t>
+      <w:proofErr w:type="gramStart"/>
+      <w:r>
+        <w:rPr>
+          <w:rFonts w:ascii="Consolas" w:eastAsia="Consolas" w:hAnsi="Consolas" w:cs="Consolas"/>
+          <w:sz w:val="18"/>
+          <w:szCs w:val="18"/>
+        </w:rPr>
+        <w:t>Oh</w:t>
+      </w:r>
+      <w:proofErr w:type="gramEnd"/>
+      <w:r>
+        <w:rPr>
+          <w:rFonts w:ascii="Consolas" w:eastAsia="Consolas" w:hAnsi="Consolas" w:cs="Consolas"/>
+          <w:sz w:val="18"/>
+          <w:szCs w:val="18"/>
+        </w:rPr>
+        <w:t xml:space="preserve"> my precious Jesus embrace me in your arms and allow my head to rest upon your shoulders so that you can raise me up to your glorious Kingdom when the time is right.</w:t>
+      </w:r>
+    </w:p>
+    <w:p>
+      <w:pPr>
+        <w:shd w:val="solid" w:color="F5F5F5" w:fill="F5F5F5"/>
+        <w:spacing w:before="20" w:after="20"/>
+        <w:ind w:left="360"/>
+      </w:pPr>
+      <w:r>
+        <w:rPr>
+          <w:rFonts w:ascii="Consolas" w:eastAsia="Consolas" w:hAnsi="Consolas" w:cs="Consolas"/>
+          <w:sz w:val="18"/>
+          <w:szCs w:val="18"/>
+        </w:rPr>
+        <w:t xml:space="preserve">Allow your precious blood to flow over my heart that we can be </w:t>
+      </w:r>
+      <w:proofErr w:type="gramStart"/>
+      <w:r>
+        <w:rPr>
+          <w:rFonts w:ascii="Consolas" w:eastAsia="Consolas" w:hAnsi="Consolas" w:cs="Consolas"/>
+          <w:sz w:val="18"/>
+          <w:szCs w:val="18"/>
+        </w:rPr>
+        <w:t>united as one</w:t>
+      </w:r>
+      <w:proofErr w:type="gramEnd"/>
+      <w:r>
+        <w:rPr>
+          <w:rFonts w:ascii="Consolas" w:eastAsia="Consolas" w:hAnsi="Consolas" w:cs="Consolas"/>
+          <w:sz w:val="18"/>
+          <w:szCs w:val="18"/>
+        </w:rPr>
+        <w:t>.</w:t>
       </w:r>
     </w:p>
     <w:p>
@@ -555,13 +615,23 @@
         <w:spacing w:before="20" w:after="20"/>
         <w:ind w:left="360"/>
       </w:pPr>
-      <w:r>
-        <w:rPr>
-          <w:rFonts w:ascii="Consolas" w:eastAsia="Consolas" w:hAnsi="Consolas" w:cs="Consolas"/>
-          <w:sz w:val="18"/>
-          <w:szCs w:val="18"/>
-        </w:rPr>
-        <w:t>Sweet Heart of Mary, be the salvation of Russia, Spain,</w:t>
+      <w:proofErr w:type="gramStart"/>
+      <w:r>
+        <w:rPr>
+          <w:rFonts w:ascii="Consolas" w:eastAsia="Consolas" w:hAnsi="Consolas" w:cs="Consolas"/>
+          <w:sz w:val="18"/>
+          <w:szCs w:val="18"/>
+        </w:rPr>
+        <w:t>Sweet Heart</w:t>
+      </w:r>
+      <w:proofErr w:type="gramEnd"/>
+      <w:r>
+        <w:rPr>
+          <w:rFonts w:ascii="Consolas" w:eastAsia="Consolas" w:hAnsi="Consolas" w:cs="Consolas"/>
+          <w:sz w:val="18"/>
+          <w:szCs w:val="18"/>
+        </w:rPr>
+        <w:t xml:space="preserve"> of Mary, be the salvation of Russia, Spain,</w:t>
       </w:r>
     </w:p>
     <w:p>
@@ -1395,13 +1465,41 @@
         <w:spacing w:before="20" w:after="20"/>
         <w:ind w:left="360"/>
       </w:pPr>
-      <w:r>
-        <w:rPr>
-          <w:rFonts w:ascii="Consolas" w:eastAsia="Consolas" w:hAnsi="Consolas" w:cs="Consolas"/>
-          <w:sz w:val="18"/>
-          <w:szCs w:val="18"/>
-        </w:rPr>
-        <w:t>so we can follow the path of Your True Church at all times,</w:t>
+      <w:proofErr w:type="gramStart"/>
+      <w:r>
+        <w:rPr>
+          <w:rFonts w:ascii="Consolas" w:eastAsia="Consolas" w:hAnsi="Consolas" w:cs="Consolas"/>
+          <w:sz w:val="18"/>
+          <w:szCs w:val="18"/>
+        </w:rPr>
+        <w:t>so</w:t>
+      </w:r>
+      <w:proofErr w:type="gramEnd"/>
+      <w:r>
+        <w:rPr>
+          <w:rFonts w:ascii="Consolas" w:eastAsia="Consolas" w:hAnsi="Consolas" w:cs="Consolas"/>
+          <w:sz w:val="18"/>
+          <w:szCs w:val="18"/>
+        </w:rPr>
+        <w:t xml:space="preserve"> we can </w:t>
+      </w:r>
+      <w:proofErr w:type="gramStart"/>
+      <w:r>
+        <w:rPr>
+          <w:rFonts w:ascii="Consolas" w:eastAsia="Consolas" w:hAnsi="Consolas" w:cs="Consolas"/>
+          <w:sz w:val="18"/>
+          <w:szCs w:val="18"/>
+        </w:rPr>
+        <w:t>follow the path of Your True Church at all times</w:t>
+      </w:r>
+      <w:proofErr w:type="gramEnd"/>
+      <w:r>
+        <w:rPr>
+          <w:rFonts w:ascii="Consolas" w:eastAsia="Consolas" w:hAnsi="Consolas" w:cs="Consolas"/>
+          <w:sz w:val="18"/>
+          <w:szCs w:val="18"/>
+        </w:rPr>
+        <w:t>,</w:t>
       </w:r>
     </w:p>
     <w:p>
@@ -1475,7 +1573,25 @@
           <w:sz w:val="18"/>
           <w:szCs w:val="18"/>
         </w:rPr>
-        <w:t>I honour You.</w:t>
+        <w:t xml:space="preserve">I </w:t>
+      </w:r>
+      <w:proofErr w:type="spellStart"/>
+      <w:r>
+        <w:rPr>
+          <w:rFonts w:ascii="Consolas" w:eastAsia="Consolas" w:hAnsi="Consolas" w:cs="Consolas"/>
+          <w:sz w:val="18"/>
+          <w:szCs w:val="18"/>
+        </w:rPr>
+        <w:t>honour</w:t>
+      </w:r>
+      <w:proofErr w:type="spellEnd"/>
+      <w:r>
+        <w:rPr>
+          <w:rFonts w:ascii="Consolas" w:eastAsia="Consolas" w:hAnsi="Consolas" w:cs="Consolas"/>
+          <w:sz w:val="18"/>
+          <w:szCs w:val="18"/>
+        </w:rPr>
+        <w:t xml:space="preserve"> You.</w:t>
       </w:r>
     </w:p>
     <w:p>
@@ -1580,7 +1696,25 @@
           <w:sz w:val="18"/>
           <w:szCs w:val="18"/>
         </w:rPr>
-        <w:t>I offer You my loyalty at all times.</w:t>
+        <w:t xml:space="preserve">I </w:t>
+      </w:r>
+      <w:proofErr w:type="gramStart"/>
+      <w:r>
+        <w:rPr>
+          <w:rFonts w:ascii="Consolas" w:eastAsia="Consolas" w:hAnsi="Consolas" w:cs="Consolas"/>
+          <w:sz w:val="18"/>
+          <w:szCs w:val="18"/>
+        </w:rPr>
+        <w:t>offer You my loyalty at all times</w:t>
+      </w:r>
+      <w:proofErr w:type="gramEnd"/>
+      <w:r>
+        <w:rPr>
+          <w:rFonts w:ascii="Consolas" w:eastAsia="Consolas" w:hAnsi="Consolas" w:cs="Consolas"/>
+          <w:sz w:val="18"/>
+          <w:szCs w:val="18"/>
+        </w:rPr>
+        <w:t>.</w:t>
       </w:r>
     </w:p>
     <w:p>
@@ -1685,7 +1819,25 @@
           <w:sz w:val="18"/>
           <w:szCs w:val="18"/>
         </w:rPr>
-        <w:t>I honour You and lay myself before You.</w:t>
+        <w:t xml:space="preserve">I </w:t>
+      </w:r>
+      <w:proofErr w:type="spellStart"/>
+      <w:r>
+        <w:rPr>
+          <w:rFonts w:ascii="Consolas" w:eastAsia="Consolas" w:hAnsi="Consolas" w:cs="Consolas"/>
+          <w:sz w:val="18"/>
+          <w:szCs w:val="18"/>
+        </w:rPr>
+        <w:t>honour</w:t>
+      </w:r>
+      <w:proofErr w:type="spellEnd"/>
+      <w:r>
+        <w:rPr>
+          <w:rFonts w:ascii="Consolas" w:eastAsia="Consolas" w:hAnsi="Consolas" w:cs="Consolas"/>
+          <w:sz w:val="18"/>
+          <w:szCs w:val="18"/>
+        </w:rPr>
+        <w:t xml:space="preserve"> You and lay myself before You.</w:t>
       </w:r>
     </w:p>
     <w:p>
@@ -1715,7 +1867,25 @@
           <w:sz w:val="18"/>
           <w:szCs w:val="18"/>
         </w:rPr>
-        <w:t>who don’t honour You, who reject Your Hand of Mercy.</w:t>
+        <w:t xml:space="preserve">who don’t </w:t>
+      </w:r>
+      <w:proofErr w:type="spellStart"/>
+      <w:r>
+        <w:rPr>
+          <w:rFonts w:ascii="Consolas" w:eastAsia="Consolas" w:hAnsi="Consolas" w:cs="Consolas"/>
+          <w:sz w:val="18"/>
+          <w:szCs w:val="18"/>
+        </w:rPr>
+        <w:t>honour</w:t>
+      </w:r>
+      <w:proofErr w:type="spellEnd"/>
+      <w:r>
+        <w:rPr>
+          <w:rFonts w:ascii="Consolas" w:eastAsia="Consolas" w:hAnsi="Consolas" w:cs="Consolas"/>
+          <w:sz w:val="18"/>
+          <w:szCs w:val="18"/>
+        </w:rPr>
+        <w:t xml:space="preserve"> You, who reject Your Hand of Mercy.</w:t>
       </w:r>
     </w:p>
     <w:p>
@@ -2084,7 +2254,25 @@
           <w:sz w:val="18"/>
           <w:szCs w:val="18"/>
         </w:rPr>
-        <w:t>Help us to remain loyal to You, at all times.</w:t>
+        <w:t xml:space="preserve">Help us to remain loyal to You, </w:t>
+      </w:r>
+      <w:proofErr w:type="gramStart"/>
+      <w:r>
+        <w:rPr>
+          <w:rFonts w:ascii="Consolas" w:eastAsia="Consolas" w:hAnsi="Consolas" w:cs="Consolas"/>
+          <w:sz w:val="18"/>
+          <w:szCs w:val="18"/>
+        </w:rPr>
+        <w:t>at all times</w:t>
+      </w:r>
+      <w:proofErr w:type="gramEnd"/>
+      <w:r>
+        <w:rPr>
+          <w:rFonts w:ascii="Consolas" w:eastAsia="Consolas" w:hAnsi="Consolas" w:cs="Consolas"/>
+          <w:sz w:val="18"/>
+          <w:szCs w:val="18"/>
+        </w:rPr>
+        <w:t>.</w:t>
       </w:r>
     </w:p>
     <w:p>
@@ -3044,7 +3232,25 @@
           <w:sz w:val="18"/>
           <w:szCs w:val="18"/>
         </w:rPr>
-        <w:t>I pledge my allegiance to Your Most Holy Will, at all times.</w:t>
+        <w:t xml:space="preserve">I pledge my allegiance to Your Most Holy Will, </w:t>
+      </w:r>
+      <w:proofErr w:type="gramStart"/>
+      <w:r>
+        <w:rPr>
+          <w:rFonts w:ascii="Consolas" w:eastAsia="Consolas" w:hAnsi="Consolas" w:cs="Consolas"/>
+          <w:sz w:val="18"/>
+          <w:szCs w:val="18"/>
+        </w:rPr>
+        <w:t>at all times</w:t>
+      </w:r>
+      <w:proofErr w:type="gramEnd"/>
+      <w:r>
+        <w:rPr>
+          <w:rFonts w:ascii="Consolas" w:eastAsia="Consolas" w:hAnsi="Consolas" w:cs="Consolas"/>
+          <w:sz w:val="18"/>
+          <w:szCs w:val="18"/>
+        </w:rPr>
+        <w:t>.</w:t>
       </w:r>
     </w:p>
     <w:p>
@@ -3100,7 +3306,23 @@
           <w:i/>
           <w:iCs/>
         </w:rPr>
-        <w:t>Prayer given by God the Father to Maria Divine Mercy urging for prayer for those who reject the Mercy of Jesus shown to them during The Warning “My Son will envelope the whole of humanity now and when the Illumination of Conscience is past your prayers are truly needed at that stage. Your prayers children will help save those people who will defiantly continue to reject the mercy My son will show them. My solemn promise children is that all those of you who call on Me on behalf of My beloved Son Jesus Christ to save your brothers and sisters that they will be granted immediate immunity. Special graces will be given to each of you who pledges a full month of prayer for their souls. Here is what I request you to say</w:t>
+        <w:t xml:space="preserve">Prayer given by God the Father to Maria Divine Mercy urging for prayer for those who reject the Mercy of Jesus shown to them during The Warning “My Son will envelope the whole of humanity now and when the Illumination of Conscience is past your prayers are truly needed at that stage. Your prayers children will help save those people who will defiantly continue to reject the mercy My son will show them. My solemn promise children </w:t>
+      </w:r>
+      <w:proofErr w:type="gramStart"/>
+      <w:r>
+        <w:rPr>
+          <w:i/>
+          <w:iCs/>
+        </w:rPr>
+        <w:t>is</w:t>
+      </w:r>
+      <w:proofErr w:type="gramEnd"/>
+      <w:r>
+        <w:rPr>
+          <w:i/>
+          <w:iCs/>
+        </w:rPr>
+        <w:t xml:space="preserve"> that all those of you who call on Me on behalf of My beloved Son Jesus Christ to save your brothers and sisters that they will be granted immediate immunity. Special graces will be given to each of you who pledges a full month of prayer for their souls. Here is what I request you to say</w:t>
       </w:r>
     </w:p>
     <w:p>
@@ -3264,264 +3486,374 @@
           <w:i/>
           <w:iCs/>
         </w:rPr>
-        <w:t>Tuesday, January 31st, 2012 @ 21:30 - My army, through their love for Me, will be given very special graces now. I grant them this Plenary Indulgence to enable them carry My torch of fire so that they can spread conversion. This gift from me will enable them to spread the truth of My Holy Word so that it will touch hearts everywhere they go. They must say this prayer for seven consecutive days and they will be given the gift of total absolution and the power of the Holy Spirit.</w:t>
-      </w:r>
-    </w:p>
-    <w:p>
-      <w:pPr>
-        <w:shd w:val="solid" w:color="F5F5F5" w:fill="F5F5F5"/>
-        <w:spacing w:before="20" w:after="20"/>
-        <w:ind w:left="360"/>
-      </w:pPr>
-      <w:r>
-        <w:rPr>
-          <w:rFonts w:ascii="Consolas" w:eastAsia="Consolas" w:hAnsi="Consolas" w:cs="Consolas"/>
-          <w:sz w:val="18"/>
-          <w:szCs w:val="18"/>
-        </w:rPr>
-        <w:t>O my Jesus, You are the Light of the earth.</w:t>
-      </w:r>
-    </w:p>
-    <w:p>
-      <w:pPr>
-        <w:shd w:val="solid" w:color="F5F5F5" w:fill="F5F5F5"/>
-        <w:spacing w:before="20" w:after="20"/>
-        <w:ind w:left="360"/>
-      </w:pPr>
-      <w:r>
-        <w:rPr>
-          <w:rFonts w:ascii="Consolas" w:eastAsia="Consolas" w:hAnsi="Consolas" w:cs="Consolas"/>
-          <w:sz w:val="18"/>
-          <w:szCs w:val="18"/>
-        </w:rPr>
-        <w:t>You are the Flame that touches all souls.</w:t>
-      </w:r>
-    </w:p>
-    <w:p>
-      <w:pPr>
-        <w:shd w:val="solid" w:color="F5F5F5" w:fill="F5F5F5"/>
-        <w:spacing w:before="20" w:after="20"/>
-        <w:ind w:left="360"/>
-      </w:pPr>
-      <w:r>
-        <w:rPr>
-          <w:rFonts w:ascii="Consolas" w:eastAsia="Consolas" w:hAnsi="Consolas" w:cs="Consolas"/>
-          <w:sz w:val="18"/>
-          <w:szCs w:val="18"/>
-        </w:rPr>
-        <w:t>Your Mercy and Love knows no bounds.</w:t>
-      </w:r>
-    </w:p>
-    <w:p>
-      <w:pPr>
-        <w:shd w:val="solid" w:color="F5F5F5" w:fill="F5F5F5"/>
-        <w:spacing w:before="20" w:after="20"/>
-        <w:ind w:left="360"/>
-      </w:pPr>
-      <w:r>
-        <w:rPr>
-          <w:rFonts w:ascii="Consolas" w:eastAsia="Consolas" w:hAnsi="Consolas" w:cs="Consolas"/>
-          <w:sz w:val="18"/>
-          <w:szCs w:val="18"/>
-        </w:rPr>
-        <w:t>We are not worthy of the Sacrifice You made by Your death on the Cross,</w:t>
-      </w:r>
-    </w:p>
-    <w:p>
-      <w:pPr>
-        <w:shd w:val="solid" w:color="F5F5F5" w:fill="F5F5F5"/>
-        <w:spacing w:before="20" w:after="20"/>
-        <w:ind w:left="360"/>
-      </w:pPr>
-      <w:r>
-        <w:rPr>
-          <w:rFonts w:ascii="Consolas" w:eastAsia="Consolas" w:hAnsi="Consolas" w:cs="Consolas"/>
-          <w:sz w:val="18"/>
-          <w:szCs w:val="18"/>
-        </w:rPr>
-        <w:t>yet we know that Your Love for us is greater than the love we hold for You.</w:t>
-      </w:r>
-    </w:p>
-    <w:p>
-      <w:pPr>
-        <w:shd w:val="solid" w:color="F5F5F5" w:fill="F5F5F5"/>
-        <w:spacing w:before="20" w:after="20"/>
-        <w:ind w:left="360"/>
-      </w:pPr>
-      <w:r>
-        <w:rPr>
-          <w:rFonts w:ascii="Consolas" w:eastAsia="Consolas" w:hAnsi="Consolas" w:cs="Consolas"/>
-          <w:sz w:val="18"/>
-          <w:szCs w:val="18"/>
-        </w:rPr>
-        <w:t>Grant us, O Lord, the Gift of Humility,</w:t>
-      </w:r>
-    </w:p>
-    <w:p>
-      <w:pPr>
-        <w:shd w:val="solid" w:color="F5F5F5" w:fill="F5F5F5"/>
-        <w:spacing w:before="20" w:after="20"/>
-        <w:ind w:left="360"/>
-      </w:pPr>
-      <w:r>
-        <w:rPr>
-          <w:rFonts w:ascii="Consolas" w:eastAsia="Consolas" w:hAnsi="Consolas" w:cs="Consolas"/>
-          <w:sz w:val="18"/>
-          <w:szCs w:val="18"/>
-        </w:rPr>
-        <w:t>so that we are deserving of Your New Kingdom.</w:t>
-      </w:r>
-    </w:p>
-    <w:p>
-      <w:pPr>
-        <w:shd w:val="solid" w:color="F5F5F5" w:fill="F5F5F5"/>
-        <w:spacing w:before="20" w:after="20"/>
-        <w:ind w:left="360"/>
-      </w:pPr>
-      <w:r>
-        <w:rPr>
-          <w:rFonts w:ascii="Consolas" w:eastAsia="Consolas" w:hAnsi="Consolas" w:cs="Consolas"/>
-          <w:sz w:val="18"/>
-          <w:szCs w:val="18"/>
-        </w:rPr>
-        <w:t>Fill us with the Holy Spirit,</w:t>
-      </w:r>
-    </w:p>
-    <w:p>
-      <w:pPr>
-        <w:shd w:val="solid" w:color="F5F5F5" w:fill="F5F5F5"/>
-        <w:spacing w:before="20" w:after="20"/>
-        <w:ind w:left="360"/>
-      </w:pPr>
-      <w:r>
-        <w:rPr>
-          <w:rFonts w:ascii="Consolas" w:eastAsia="Consolas" w:hAnsi="Consolas" w:cs="Consolas"/>
-          <w:sz w:val="18"/>
-          <w:szCs w:val="18"/>
-        </w:rPr>
-        <w:t>so we can march forth and lead Your army to proclaim the Truth of Your Holy Word and prepare our brothers and sisters for the glory of Your Second Coming on earth.</w:t>
-      </w:r>
-    </w:p>
-    <w:p>
-      <w:pPr>
-        <w:shd w:val="solid" w:color="F5F5F5" w:fill="F5F5F5"/>
-        <w:spacing w:before="20" w:after="20"/>
-        <w:ind w:left="360"/>
-      </w:pPr>
-      <w:r>
-        <w:rPr>
-          <w:rFonts w:ascii="Consolas" w:eastAsia="Consolas" w:hAnsi="Consolas" w:cs="Consolas"/>
-          <w:sz w:val="18"/>
-          <w:szCs w:val="18"/>
-        </w:rPr>
-        <w:t>We honour You.</w:t>
-      </w:r>
-    </w:p>
-    <w:p>
-      <w:pPr>
-        <w:shd w:val="solid" w:color="F5F5F5" w:fill="F5F5F5"/>
-        <w:spacing w:before="20" w:after="20"/>
-        <w:ind w:left="360"/>
-      </w:pPr>
-      <w:r>
-        <w:rPr>
-          <w:rFonts w:ascii="Consolas" w:eastAsia="Consolas" w:hAnsi="Consolas" w:cs="Consolas"/>
-          <w:sz w:val="18"/>
-          <w:szCs w:val="18"/>
-        </w:rPr>
-        <w:t>We Praise You.</w:t>
-      </w:r>
-    </w:p>
-    <w:p>
-      <w:pPr>
-        <w:shd w:val="solid" w:color="F5F5F5" w:fill="F5F5F5"/>
-        <w:spacing w:before="20" w:after="20"/>
-        <w:ind w:left="360"/>
-      </w:pPr>
-      <w:r>
-        <w:rPr>
-          <w:rFonts w:ascii="Consolas" w:eastAsia="Consolas" w:hAnsi="Consolas" w:cs="Consolas"/>
-          <w:sz w:val="18"/>
-          <w:szCs w:val="18"/>
-        </w:rPr>
-        <w:t>We offer ourselves, our sorrows,</w:t>
-      </w:r>
-    </w:p>
-    <w:p>
-      <w:pPr>
-        <w:shd w:val="solid" w:color="F5F5F5" w:fill="F5F5F5"/>
-        <w:spacing w:before="20" w:after="20"/>
-        <w:ind w:left="360"/>
-      </w:pPr>
-      <w:r>
-        <w:rPr>
-          <w:rFonts w:ascii="Consolas" w:eastAsia="Consolas" w:hAnsi="Consolas" w:cs="Consolas"/>
-          <w:sz w:val="18"/>
-          <w:szCs w:val="18"/>
-        </w:rPr>
-        <w:t>our sufferings as a gift to You to save souls.</w:t>
-      </w:r>
-    </w:p>
-    <w:p>
-      <w:pPr>
-        <w:shd w:val="solid" w:color="F5F5F5" w:fill="F5F5F5"/>
-        <w:spacing w:before="20" w:after="20"/>
-        <w:ind w:left="360"/>
-      </w:pPr>
-      <w:r>
-        <w:rPr>
-          <w:rFonts w:ascii="Consolas" w:eastAsia="Consolas" w:hAnsi="Consolas" w:cs="Consolas"/>
-          <w:sz w:val="18"/>
-          <w:szCs w:val="18"/>
-        </w:rPr>
-        <w:t>We love You, Jesus.</w:t>
-      </w:r>
-    </w:p>
-    <w:p>
-      <w:pPr>
-        <w:shd w:val="solid" w:color="F5F5F5" w:fill="F5F5F5"/>
-        <w:spacing w:before="20" w:after="20"/>
-        <w:ind w:left="360"/>
-      </w:pPr>
-      <w:r>
-        <w:rPr>
-          <w:rFonts w:ascii="Consolas" w:eastAsia="Consolas" w:hAnsi="Consolas" w:cs="Consolas"/>
-          <w:sz w:val="18"/>
-          <w:szCs w:val="18"/>
-        </w:rPr>
-        <w:t>Have Mercy on all Your children, wherever they may be.</w:t>
-      </w:r>
-    </w:p>
-    <w:p>
-      <w:pPr>
-        <w:shd w:val="solid" w:color="F5F5F5" w:fill="F5F5F5"/>
-        <w:spacing w:before="20" w:after="20"/>
-        <w:ind w:left="360"/>
-      </w:pPr>
-      <w:r>
-        <w:rPr>
-          <w:rFonts w:ascii="Consolas" w:eastAsia="Consolas" w:hAnsi="Consolas" w:cs="Consolas"/>
-          <w:sz w:val="18"/>
-          <w:szCs w:val="18"/>
-        </w:rPr>
-        <w:t>Amen.</w:t>
-      </w:r>
-    </w:p>
-    <w:p>
-      <w:pPr>
-        <w:spacing w:after="80"/>
-      </w:pPr>
-    </w:p>
-    <w:p>
-      <w:pPr>
-        <w:spacing w:before="80" w:after="80"/>
-      </w:pPr>
+        <w:t xml:space="preserve">Tuesday, January 31st, 2012 @ 21:30 - My army, through their love for Me, will be given very special graces now. I grant them this Plenary Indulgence to enable them </w:t>
+      </w:r>
+      <w:proofErr w:type="gramStart"/>
       <w:r>
         <w:rPr>
           <w:i/>
           <w:iCs/>
         </w:rPr>
-        <w:t>Go forth in peace My beloved followers and remember that your love for Me enkindles My heart and brings great joy to My Eternal Father, My Blessed Mother, the angels and all the saints in Heaven. I love you all. I await the moment when I will embrace each and every one of you in My arms so that you will find the peace, love and joy that you have been awaiting for all your lives on earth. Your Beloved Jesus Christ</w:t>
+        <w:t>carry</w:t>
+      </w:r>
+      <w:proofErr w:type="gramEnd"/>
+      <w:r>
+        <w:rPr>
+          <w:i/>
+          <w:iCs/>
+        </w:rPr>
+        <w:t xml:space="preserve"> My torch of fire so that they can spread conversion. This gift from me will enable them to spread the truth of My Holy Word so that it will touch hearts everywhere they go. They must say this prayer for seven consecutive </w:t>
+      </w:r>
+      <w:proofErr w:type="gramStart"/>
+      <w:r>
+        <w:rPr>
+          <w:i/>
+          <w:iCs/>
+        </w:rPr>
+        <w:t>days</w:t>
+      </w:r>
+      <w:proofErr w:type="gramEnd"/>
+      <w:r>
+        <w:rPr>
+          <w:i/>
+          <w:iCs/>
+        </w:rPr>
+        <w:t xml:space="preserve"> and they will be given the gift of total absolution and the power of the Holy Spirit.</w:t>
+      </w:r>
+    </w:p>
+    <w:p>
+      <w:pPr>
+        <w:shd w:val="solid" w:color="F5F5F5" w:fill="F5F5F5"/>
+        <w:spacing w:before="20" w:after="20"/>
+        <w:ind w:left="360"/>
+      </w:pPr>
+      <w:r>
+        <w:rPr>
+          <w:rFonts w:ascii="Consolas" w:eastAsia="Consolas" w:hAnsi="Consolas" w:cs="Consolas"/>
+          <w:sz w:val="18"/>
+          <w:szCs w:val="18"/>
+        </w:rPr>
+        <w:t xml:space="preserve">O my Jesus, </w:t>
+      </w:r>
+      <w:proofErr w:type="gramStart"/>
+      <w:r>
+        <w:rPr>
+          <w:rFonts w:ascii="Consolas" w:eastAsia="Consolas" w:hAnsi="Consolas" w:cs="Consolas"/>
+          <w:sz w:val="18"/>
+          <w:szCs w:val="18"/>
+        </w:rPr>
+        <w:t>You</w:t>
+      </w:r>
+      <w:proofErr w:type="gramEnd"/>
+      <w:r>
+        <w:rPr>
+          <w:rFonts w:ascii="Consolas" w:eastAsia="Consolas" w:hAnsi="Consolas" w:cs="Consolas"/>
+          <w:sz w:val="18"/>
+          <w:szCs w:val="18"/>
+        </w:rPr>
+        <w:t xml:space="preserve"> are the Light of the earth.</w:t>
+      </w:r>
+    </w:p>
+    <w:p>
+      <w:pPr>
+        <w:shd w:val="solid" w:color="F5F5F5" w:fill="F5F5F5"/>
+        <w:spacing w:before="20" w:after="20"/>
+        <w:ind w:left="360"/>
+      </w:pPr>
+      <w:r>
+        <w:rPr>
+          <w:rFonts w:ascii="Consolas" w:eastAsia="Consolas" w:hAnsi="Consolas" w:cs="Consolas"/>
+          <w:sz w:val="18"/>
+          <w:szCs w:val="18"/>
+        </w:rPr>
+        <w:t>You are the Flame that touches all souls.</w:t>
+      </w:r>
+    </w:p>
+    <w:p>
+      <w:pPr>
+        <w:shd w:val="solid" w:color="F5F5F5" w:fill="F5F5F5"/>
+        <w:spacing w:before="20" w:after="20"/>
+        <w:ind w:left="360"/>
+      </w:pPr>
+      <w:r>
+        <w:rPr>
+          <w:rFonts w:ascii="Consolas" w:eastAsia="Consolas" w:hAnsi="Consolas" w:cs="Consolas"/>
+          <w:sz w:val="18"/>
+          <w:szCs w:val="18"/>
+        </w:rPr>
+        <w:t>Your Mercy and Love knows no bounds.</w:t>
+      </w:r>
+    </w:p>
+    <w:p>
+      <w:pPr>
+        <w:shd w:val="solid" w:color="F5F5F5" w:fill="F5F5F5"/>
+        <w:spacing w:before="20" w:after="20"/>
+        <w:ind w:left="360"/>
+      </w:pPr>
+      <w:r>
+        <w:rPr>
+          <w:rFonts w:ascii="Consolas" w:eastAsia="Consolas" w:hAnsi="Consolas" w:cs="Consolas"/>
+          <w:sz w:val="18"/>
+          <w:szCs w:val="18"/>
+        </w:rPr>
+        <w:t>We are not worthy of the Sacrifice You made by Your death on the Cross,</w:t>
+      </w:r>
+    </w:p>
+    <w:p>
+      <w:pPr>
+        <w:shd w:val="solid" w:color="F5F5F5" w:fill="F5F5F5"/>
+        <w:spacing w:before="20" w:after="20"/>
+        <w:ind w:left="360"/>
+      </w:pPr>
+      <w:r>
+        <w:rPr>
+          <w:rFonts w:ascii="Consolas" w:eastAsia="Consolas" w:hAnsi="Consolas" w:cs="Consolas"/>
+          <w:sz w:val="18"/>
+          <w:szCs w:val="18"/>
+        </w:rPr>
+        <w:t>yet we know that Your Love for us is greater than the love we hold for You.</w:t>
+      </w:r>
+    </w:p>
+    <w:p>
+      <w:pPr>
+        <w:shd w:val="solid" w:color="F5F5F5" w:fill="F5F5F5"/>
+        <w:spacing w:before="20" w:after="20"/>
+        <w:ind w:left="360"/>
+      </w:pPr>
+      <w:r>
+        <w:rPr>
+          <w:rFonts w:ascii="Consolas" w:eastAsia="Consolas" w:hAnsi="Consolas" w:cs="Consolas"/>
+          <w:sz w:val="18"/>
+          <w:szCs w:val="18"/>
+        </w:rPr>
+        <w:t>Grant us, O Lord, the Gift of Humility,</w:t>
+      </w:r>
+    </w:p>
+    <w:p>
+      <w:pPr>
+        <w:shd w:val="solid" w:color="F5F5F5" w:fill="F5F5F5"/>
+        <w:spacing w:before="20" w:after="20"/>
+        <w:ind w:left="360"/>
+      </w:pPr>
+      <w:r>
+        <w:rPr>
+          <w:rFonts w:ascii="Consolas" w:eastAsia="Consolas" w:hAnsi="Consolas" w:cs="Consolas"/>
+          <w:sz w:val="18"/>
+          <w:szCs w:val="18"/>
+        </w:rPr>
+        <w:t>so that we are deserving of Your New Kingdom.</w:t>
+      </w:r>
+    </w:p>
+    <w:p>
+      <w:pPr>
+        <w:shd w:val="solid" w:color="F5F5F5" w:fill="F5F5F5"/>
+        <w:spacing w:before="20" w:after="20"/>
+        <w:ind w:left="360"/>
+      </w:pPr>
+      <w:r>
+        <w:rPr>
+          <w:rFonts w:ascii="Consolas" w:eastAsia="Consolas" w:hAnsi="Consolas" w:cs="Consolas"/>
+          <w:sz w:val="18"/>
+          <w:szCs w:val="18"/>
+        </w:rPr>
+        <w:t>Fill us with the Holy Spirit,</w:t>
+      </w:r>
+    </w:p>
+    <w:p>
+      <w:pPr>
+        <w:shd w:val="solid" w:color="F5F5F5" w:fill="F5F5F5"/>
+        <w:spacing w:before="20" w:after="20"/>
+        <w:ind w:left="360"/>
+      </w:pPr>
+      <w:proofErr w:type="gramStart"/>
+      <w:r>
+        <w:rPr>
+          <w:rFonts w:ascii="Consolas" w:eastAsia="Consolas" w:hAnsi="Consolas" w:cs="Consolas"/>
+          <w:sz w:val="18"/>
+          <w:szCs w:val="18"/>
+        </w:rPr>
+        <w:t>so</w:t>
+      </w:r>
+      <w:proofErr w:type="gramEnd"/>
+      <w:r>
+        <w:rPr>
+          <w:rFonts w:ascii="Consolas" w:eastAsia="Consolas" w:hAnsi="Consolas" w:cs="Consolas"/>
+          <w:sz w:val="18"/>
+          <w:szCs w:val="18"/>
+        </w:rPr>
+        <w:t xml:space="preserve"> we can march forth and lead Your army to proclaim the Truth of Your Holy Word and prepare our brothers and sisters for the glory of Your Second Coming on earth.</w:t>
+      </w:r>
+    </w:p>
+    <w:p>
+      <w:pPr>
+        <w:shd w:val="solid" w:color="F5F5F5" w:fill="F5F5F5"/>
+        <w:spacing w:before="20" w:after="20"/>
+        <w:ind w:left="360"/>
+      </w:pPr>
+      <w:r>
+        <w:rPr>
+          <w:rFonts w:ascii="Consolas" w:eastAsia="Consolas" w:hAnsi="Consolas" w:cs="Consolas"/>
+          <w:sz w:val="18"/>
+          <w:szCs w:val="18"/>
+        </w:rPr>
+        <w:t xml:space="preserve">We </w:t>
+      </w:r>
+      <w:proofErr w:type="spellStart"/>
+      <w:r>
+        <w:rPr>
+          <w:rFonts w:ascii="Consolas" w:eastAsia="Consolas" w:hAnsi="Consolas" w:cs="Consolas"/>
+          <w:sz w:val="18"/>
+          <w:szCs w:val="18"/>
+        </w:rPr>
+        <w:t>honour</w:t>
+      </w:r>
+      <w:proofErr w:type="spellEnd"/>
+      <w:r>
+        <w:rPr>
+          <w:rFonts w:ascii="Consolas" w:eastAsia="Consolas" w:hAnsi="Consolas" w:cs="Consolas"/>
+          <w:sz w:val="18"/>
+          <w:szCs w:val="18"/>
+        </w:rPr>
+        <w:t xml:space="preserve"> You.</w:t>
+      </w:r>
+    </w:p>
+    <w:p>
+      <w:pPr>
+        <w:shd w:val="solid" w:color="F5F5F5" w:fill="F5F5F5"/>
+        <w:spacing w:before="20" w:after="20"/>
+        <w:ind w:left="360"/>
+      </w:pPr>
+      <w:r>
+        <w:rPr>
+          <w:rFonts w:ascii="Consolas" w:eastAsia="Consolas" w:hAnsi="Consolas" w:cs="Consolas"/>
+          <w:sz w:val="18"/>
+          <w:szCs w:val="18"/>
+        </w:rPr>
+        <w:t>We Praise You.</w:t>
+      </w:r>
+    </w:p>
+    <w:p>
+      <w:pPr>
+        <w:shd w:val="solid" w:color="F5F5F5" w:fill="F5F5F5"/>
+        <w:spacing w:before="20" w:after="20"/>
+        <w:ind w:left="360"/>
+      </w:pPr>
+      <w:r>
+        <w:rPr>
+          <w:rFonts w:ascii="Consolas" w:eastAsia="Consolas" w:hAnsi="Consolas" w:cs="Consolas"/>
+          <w:sz w:val="18"/>
+          <w:szCs w:val="18"/>
+        </w:rPr>
+        <w:t>We offer ourselves, our sorrows,</w:t>
+      </w:r>
+    </w:p>
+    <w:p>
+      <w:pPr>
+        <w:shd w:val="solid" w:color="F5F5F5" w:fill="F5F5F5"/>
+        <w:spacing w:before="20" w:after="20"/>
+        <w:ind w:left="360"/>
+      </w:pPr>
+      <w:r>
+        <w:rPr>
+          <w:rFonts w:ascii="Consolas" w:eastAsia="Consolas" w:hAnsi="Consolas" w:cs="Consolas"/>
+          <w:sz w:val="18"/>
+          <w:szCs w:val="18"/>
+        </w:rPr>
+        <w:t>our sufferings as a gift to You to save souls.</w:t>
+      </w:r>
+    </w:p>
+    <w:p>
+      <w:pPr>
+        <w:shd w:val="solid" w:color="F5F5F5" w:fill="F5F5F5"/>
+        <w:spacing w:before="20" w:after="20"/>
+        <w:ind w:left="360"/>
+      </w:pPr>
+      <w:r>
+        <w:rPr>
+          <w:rFonts w:ascii="Consolas" w:eastAsia="Consolas" w:hAnsi="Consolas" w:cs="Consolas"/>
+          <w:sz w:val="18"/>
+          <w:szCs w:val="18"/>
+        </w:rPr>
+        <w:t>We love You, Jesus.</w:t>
+      </w:r>
+    </w:p>
+    <w:p>
+      <w:pPr>
+        <w:shd w:val="solid" w:color="F5F5F5" w:fill="F5F5F5"/>
+        <w:spacing w:before="20" w:after="20"/>
+        <w:ind w:left="360"/>
+      </w:pPr>
+      <w:r>
+        <w:rPr>
+          <w:rFonts w:ascii="Consolas" w:eastAsia="Consolas" w:hAnsi="Consolas" w:cs="Consolas"/>
+          <w:sz w:val="18"/>
+          <w:szCs w:val="18"/>
+        </w:rPr>
+        <w:t>Have Mercy on all Your children, wherever they may be.</w:t>
+      </w:r>
+    </w:p>
+    <w:p>
+      <w:pPr>
+        <w:shd w:val="solid" w:color="F5F5F5" w:fill="F5F5F5"/>
+        <w:spacing w:before="20" w:after="20"/>
+        <w:ind w:left="360"/>
+      </w:pPr>
+      <w:r>
+        <w:rPr>
+          <w:rFonts w:ascii="Consolas" w:eastAsia="Consolas" w:hAnsi="Consolas" w:cs="Consolas"/>
+          <w:sz w:val="18"/>
+          <w:szCs w:val="18"/>
+        </w:rPr>
+        <w:t>Amen.</w:t>
+      </w:r>
+    </w:p>
+    <w:p>
+      <w:pPr>
+        <w:spacing w:after="80"/>
+      </w:pPr>
+    </w:p>
+    <w:p>
+      <w:pPr>
+        <w:spacing w:before="80" w:after="80"/>
+      </w:pPr>
+      <w:r>
+        <w:rPr>
+          <w:i/>
+          <w:iCs/>
+        </w:rPr>
+        <w:t xml:space="preserve">Go forth in peace My beloved followers and remember that your love for Me enkindles My heart and brings great joy to My Eternal Father, My Blessed Mother, the angels and all the saints in Heaven. I love you all. I await the moment when I will embrace </w:t>
+      </w:r>
+      <w:proofErr w:type="gramStart"/>
+      <w:r>
+        <w:rPr>
+          <w:i/>
+          <w:iCs/>
+        </w:rPr>
+        <w:t>each and every</w:t>
+      </w:r>
+      <w:proofErr w:type="gramEnd"/>
+      <w:r>
+        <w:rPr>
+          <w:i/>
+          <w:iCs/>
+        </w:rPr>
+        <w:t xml:space="preserve"> one of you in My arms so that you will find the peace, love and joy that you have been </w:t>
+      </w:r>
+      <w:proofErr w:type="gramStart"/>
+      <w:r>
+        <w:rPr>
+          <w:i/>
+          <w:iCs/>
+        </w:rPr>
+        <w:t>awaiting</w:t>
+      </w:r>
+      <w:proofErr w:type="gramEnd"/>
+      <w:r>
+        <w:rPr>
+          <w:i/>
+          <w:iCs/>
+        </w:rPr>
+        <w:t xml:space="preserve"> for all your lives on earth. Your Beloved Jesus Christ</w:t>
       </w:r>
     </w:p>
     <w:p>
@@ -3708,7 +4040,25 @@
           <w:sz w:val="18"/>
           <w:szCs w:val="18"/>
         </w:rPr>
-        <w:t>so that they can join with all of Your children in the Paradise on earth You have lovingly created for us,</w:t>
+        <w:t xml:space="preserve">so that they can join with </w:t>
+      </w:r>
+      <w:proofErr w:type="gramStart"/>
+      <w:r>
+        <w:rPr>
+          <w:rFonts w:ascii="Consolas" w:eastAsia="Consolas" w:hAnsi="Consolas" w:cs="Consolas"/>
+          <w:sz w:val="18"/>
+          <w:szCs w:val="18"/>
+        </w:rPr>
+        <w:t>all of</w:t>
+      </w:r>
+      <w:proofErr w:type="gramEnd"/>
+      <w:r>
+        <w:rPr>
+          <w:rFonts w:ascii="Consolas" w:eastAsia="Consolas" w:hAnsi="Consolas" w:cs="Consolas"/>
+          <w:sz w:val="18"/>
+          <w:szCs w:val="18"/>
+        </w:rPr>
+        <w:t xml:space="preserve"> Your children in the Paradise on earth You have lovingly created for us,</w:t>
       </w:r>
     </w:p>
     <w:p>
@@ -3809,189 +4159,271 @@
           <w:i/>
           <w:iCs/>
         </w:rPr>
-        <w:t>Important SEAL for all of God’s followers on earth was given to Maria Divine Mercy by God the Father. He asks that all accept this Seal as a protection for each and every one of us and our families during the future difificult times we will have to live in. Rise now and accept My Seal, the Seal of the Living God. Recite this Crusade Prayer (33) to acknowledge My Seal and accept it with love, joy and gratitude.</w:t>
-      </w:r>
-    </w:p>
-    <w:p>
-      <w:pPr>
-        <w:shd w:val="solid" w:color="F5F5F5" w:fill="F5F5F5"/>
-        <w:spacing w:before="20" w:after="20"/>
-        <w:ind w:left="360"/>
-      </w:pPr>
-      <w:r>
-        <w:rPr>
-          <w:rFonts w:ascii="Consolas" w:eastAsia="Consolas" w:hAnsi="Consolas" w:cs="Consolas"/>
-          <w:sz w:val="18"/>
-          <w:szCs w:val="18"/>
-        </w:rPr>
-        <w:t>O my God, my loving Father,</w:t>
-      </w:r>
-    </w:p>
-    <w:p>
-      <w:pPr>
-        <w:shd w:val="solid" w:color="F5F5F5" w:fill="F5F5F5"/>
-        <w:spacing w:before="20" w:after="20"/>
-        <w:ind w:left="360"/>
-      </w:pPr>
-      <w:r>
-        <w:rPr>
-          <w:rFonts w:ascii="Consolas" w:eastAsia="Consolas" w:hAnsi="Consolas" w:cs="Consolas"/>
-          <w:sz w:val="18"/>
-          <w:szCs w:val="18"/>
-        </w:rPr>
-        <w:t>I accept with love and gratitude Your Divine Seal of Protection.</w:t>
-      </w:r>
-    </w:p>
-    <w:p>
-      <w:pPr>
-        <w:shd w:val="solid" w:color="F5F5F5" w:fill="F5F5F5"/>
-        <w:spacing w:before="20" w:after="20"/>
-        <w:ind w:left="360"/>
-      </w:pPr>
-      <w:r>
-        <w:rPr>
-          <w:rFonts w:ascii="Consolas" w:eastAsia="Consolas" w:hAnsi="Consolas" w:cs="Consolas"/>
-          <w:sz w:val="18"/>
-          <w:szCs w:val="18"/>
-        </w:rPr>
-        <w:t>Your Divinity encompasses my body and soul for eternity.</w:t>
-      </w:r>
-    </w:p>
-    <w:p>
-      <w:pPr>
-        <w:shd w:val="solid" w:color="F5F5F5" w:fill="F5F5F5"/>
-        <w:spacing w:before="20" w:after="20"/>
-        <w:ind w:left="360"/>
-      </w:pPr>
-      <w:r>
-        <w:rPr>
-          <w:rFonts w:ascii="Consolas" w:eastAsia="Consolas" w:hAnsi="Consolas" w:cs="Consolas"/>
-          <w:sz w:val="18"/>
-          <w:szCs w:val="18"/>
-        </w:rPr>
-        <w:t>I bow in humble thanksgiving and offer my deep love and loyalty to You,</w:t>
-      </w:r>
-    </w:p>
-    <w:p>
-      <w:pPr>
-        <w:shd w:val="solid" w:color="F5F5F5" w:fill="F5F5F5"/>
-        <w:spacing w:before="20" w:after="20"/>
-        <w:ind w:left="360"/>
-      </w:pPr>
-      <w:r>
-        <w:rPr>
-          <w:rFonts w:ascii="Consolas" w:eastAsia="Consolas" w:hAnsi="Consolas" w:cs="Consolas"/>
-          <w:sz w:val="18"/>
-          <w:szCs w:val="18"/>
-        </w:rPr>
-        <w:t>my beloved Father.</w:t>
-      </w:r>
-    </w:p>
-    <w:p>
-      <w:pPr>
-        <w:shd w:val="solid" w:color="F5F5F5" w:fill="F5F5F5"/>
-        <w:spacing w:before="20" w:after="20"/>
-        <w:ind w:left="360"/>
-      </w:pPr>
-      <w:r>
-        <w:rPr>
-          <w:rFonts w:ascii="Consolas" w:eastAsia="Consolas" w:hAnsi="Consolas" w:cs="Consolas"/>
-          <w:sz w:val="18"/>
-          <w:szCs w:val="18"/>
-        </w:rPr>
-        <w:t>I beg You to protect me and my loved ones with this special Seal and I pledge my life to Your service forever and ever.</w:t>
-      </w:r>
-    </w:p>
-    <w:p>
-      <w:pPr>
-        <w:shd w:val="solid" w:color="F5F5F5" w:fill="F5F5F5"/>
-        <w:spacing w:before="20" w:after="20"/>
-        <w:ind w:left="360"/>
-      </w:pPr>
-      <w:r>
-        <w:rPr>
-          <w:rFonts w:ascii="Consolas" w:eastAsia="Consolas" w:hAnsi="Consolas" w:cs="Consolas"/>
-          <w:sz w:val="18"/>
-          <w:szCs w:val="18"/>
-        </w:rPr>
-        <w:t>I love You, dear Father.</w:t>
-      </w:r>
-    </w:p>
-    <w:p>
-      <w:pPr>
-        <w:shd w:val="solid" w:color="F5F5F5" w:fill="F5F5F5"/>
-        <w:spacing w:before="20" w:after="20"/>
-        <w:ind w:left="360"/>
-      </w:pPr>
-      <w:r>
-        <w:rPr>
-          <w:rFonts w:ascii="Consolas" w:eastAsia="Consolas" w:hAnsi="Consolas" w:cs="Consolas"/>
-          <w:sz w:val="18"/>
-          <w:szCs w:val="18"/>
-        </w:rPr>
-        <w:t>I console You in these times, dear Father.</w:t>
-      </w:r>
-    </w:p>
-    <w:p>
-      <w:pPr>
-        <w:shd w:val="solid" w:color="F5F5F5" w:fill="F5F5F5"/>
-        <w:spacing w:before="20" w:after="20"/>
-        <w:ind w:left="360"/>
-      </w:pPr>
-      <w:r>
-        <w:rPr>
-          <w:rFonts w:ascii="Consolas" w:eastAsia="Consolas" w:hAnsi="Consolas" w:cs="Consolas"/>
-          <w:sz w:val="18"/>
-          <w:szCs w:val="18"/>
-        </w:rPr>
-        <w:t>I offer You the Body, Blood,</w:t>
-      </w:r>
-    </w:p>
-    <w:p>
-      <w:pPr>
-        <w:shd w:val="solid" w:color="F5F5F5" w:fill="F5F5F5"/>
-        <w:spacing w:before="20" w:after="20"/>
-        <w:ind w:left="360"/>
-      </w:pPr>
-      <w:r>
-        <w:rPr>
-          <w:rFonts w:ascii="Consolas" w:eastAsia="Consolas" w:hAnsi="Consolas" w:cs="Consolas"/>
-          <w:sz w:val="18"/>
-          <w:szCs w:val="18"/>
-        </w:rPr>
-        <w:t>Soul and Divinity of Your dearly beloved Son in atonement for the sins of the world and for the salvation of all Your children.</w:t>
-      </w:r>
-    </w:p>
-    <w:p>
-      <w:pPr>
-        <w:shd w:val="solid" w:color="F5F5F5" w:fill="F5F5F5"/>
-        <w:spacing w:before="20" w:after="20"/>
-        <w:ind w:left="360"/>
-      </w:pPr>
-      <w:r>
-        <w:rPr>
-          <w:rFonts w:ascii="Consolas" w:eastAsia="Consolas" w:hAnsi="Consolas" w:cs="Consolas"/>
-          <w:sz w:val="18"/>
-          <w:szCs w:val="18"/>
-        </w:rPr>
-        <w:t>Amen.</w:t>
-      </w:r>
-    </w:p>
-    <w:p>
-      <w:pPr>
-        <w:spacing w:after="80"/>
-      </w:pPr>
-    </w:p>
-    <w:p>
-      <w:pPr>
-        <w:spacing w:before="80" w:after="80"/>
-      </w:pPr>
+        <w:t xml:space="preserve">Important SEAL for all of God’s followers on earth was given to Maria Divine Mercy by God the Father. He asks that all accept this Seal as a protection for </w:t>
+      </w:r>
+      <w:proofErr w:type="gramStart"/>
       <w:r>
         <w:rPr>
           <w:i/>
           <w:iCs/>
         </w:rPr>
-        <w:t>Go, My children and do not fear. Trust in Me, Your beloved Father who lovingly created each of you. I know every single soul, every part of you is known to Me. Not one of you is loved less than the other. Because of this I do not want to lose one soul. Not one. Please continue to pray My Divine Mercy Chaplet every day. One day, you will understand why this purification is needed. Your loving Father in Heaven - God of the Most High</w:t>
+        <w:t>each and every</w:t>
+      </w:r>
+      <w:proofErr w:type="gramEnd"/>
+      <w:r>
+        <w:rPr>
+          <w:i/>
+          <w:iCs/>
+        </w:rPr>
+        <w:t xml:space="preserve"> one of us and our families during the future </w:t>
+      </w:r>
+      <w:proofErr w:type="spellStart"/>
+      <w:r>
+        <w:rPr>
+          <w:i/>
+          <w:iCs/>
+        </w:rPr>
+        <w:t>difificult</w:t>
+      </w:r>
+      <w:proofErr w:type="spellEnd"/>
+      <w:r>
+        <w:rPr>
+          <w:i/>
+          <w:iCs/>
+        </w:rPr>
+        <w:t xml:space="preserve"> times we will have to live in. Rise now and accept My Seal, the Seal of the Living God. Recite this Crusade Prayer (33) to acknowledge My Seal and accept it with love, joy and gratitude.</w:t>
+      </w:r>
+    </w:p>
+    <w:p>
+      <w:pPr>
+        <w:shd w:val="solid" w:color="F5F5F5" w:fill="F5F5F5"/>
+        <w:spacing w:before="20" w:after="20"/>
+        <w:ind w:left="360"/>
+      </w:pPr>
+      <w:r>
+        <w:rPr>
+          <w:rFonts w:ascii="Consolas" w:eastAsia="Consolas" w:hAnsi="Consolas" w:cs="Consolas"/>
+          <w:sz w:val="18"/>
+          <w:szCs w:val="18"/>
+        </w:rPr>
+        <w:t>O my God, my loving Father,</w:t>
+      </w:r>
+    </w:p>
+    <w:p>
+      <w:pPr>
+        <w:shd w:val="solid" w:color="F5F5F5" w:fill="F5F5F5"/>
+        <w:spacing w:before="20" w:after="20"/>
+        <w:ind w:left="360"/>
+      </w:pPr>
+      <w:r>
+        <w:rPr>
+          <w:rFonts w:ascii="Consolas" w:eastAsia="Consolas" w:hAnsi="Consolas" w:cs="Consolas"/>
+          <w:sz w:val="18"/>
+          <w:szCs w:val="18"/>
+        </w:rPr>
+        <w:t>I accept with love and gratitude Your Divine Seal of Protection.</w:t>
+      </w:r>
+    </w:p>
+    <w:p>
+      <w:pPr>
+        <w:shd w:val="solid" w:color="F5F5F5" w:fill="F5F5F5"/>
+        <w:spacing w:before="20" w:after="20"/>
+        <w:ind w:left="360"/>
+      </w:pPr>
+      <w:r>
+        <w:rPr>
+          <w:rFonts w:ascii="Consolas" w:eastAsia="Consolas" w:hAnsi="Consolas" w:cs="Consolas"/>
+          <w:sz w:val="18"/>
+          <w:szCs w:val="18"/>
+        </w:rPr>
+        <w:t>Your Divinity encompasses my body and soul for eternity.</w:t>
+      </w:r>
+    </w:p>
+    <w:p>
+      <w:pPr>
+        <w:shd w:val="solid" w:color="F5F5F5" w:fill="F5F5F5"/>
+        <w:spacing w:before="20" w:after="20"/>
+        <w:ind w:left="360"/>
+      </w:pPr>
+      <w:r>
+        <w:rPr>
+          <w:rFonts w:ascii="Consolas" w:eastAsia="Consolas" w:hAnsi="Consolas" w:cs="Consolas"/>
+          <w:sz w:val="18"/>
+          <w:szCs w:val="18"/>
+        </w:rPr>
+        <w:t>I bow in humble thanksgiving and offer my deep love and loyalty to You,</w:t>
+      </w:r>
+    </w:p>
+    <w:p>
+      <w:pPr>
+        <w:shd w:val="solid" w:color="F5F5F5" w:fill="F5F5F5"/>
+        <w:spacing w:before="20" w:after="20"/>
+        <w:ind w:left="360"/>
+      </w:pPr>
+      <w:r>
+        <w:rPr>
+          <w:rFonts w:ascii="Consolas" w:eastAsia="Consolas" w:hAnsi="Consolas" w:cs="Consolas"/>
+          <w:sz w:val="18"/>
+          <w:szCs w:val="18"/>
+        </w:rPr>
+        <w:t>my beloved Father.</w:t>
+      </w:r>
+    </w:p>
+    <w:p>
+      <w:pPr>
+        <w:shd w:val="solid" w:color="F5F5F5" w:fill="F5F5F5"/>
+        <w:spacing w:before="20" w:after="20"/>
+        <w:ind w:left="360"/>
+      </w:pPr>
+      <w:r>
+        <w:rPr>
+          <w:rFonts w:ascii="Consolas" w:eastAsia="Consolas" w:hAnsi="Consolas" w:cs="Consolas"/>
+          <w:sz w:val="18"/>
+          <w:szCs w:val="18"/>
+        </w:rPr>
+        <w:t xml:space="preserve">I beg You to protect me and my loved ones with this special </w:t>
+      </w:r>
+      <w:proofErr w:type="gramStart"/>
+      <w:r>
+        <w:rPr>
+          <w:rFonts w:ascii="Consolas" w:eastAsia="Consolas" w:hAnsi="Consolas" w:cs="Consolas"/>
+          <w:sz w:val="18"/>
+          <w:szCs w:val="18"/>
+        </w:rPr>
+        <w:t>Seal</w:t>
+      </w:r>
+      <w:proofErr w:type="gramEnd"/>
+      <w:r>
+        <w:rPr>
+          <w:rFonts w:ascii="Consolas" w:eastAsia="Consolas" w:hAnsi="Consolas" w:cs="Consolas"/>
+          <w:sz w:val="18"/>
+          <w:szCs w:val="18"/>
+        </w:rPr>
+        <w:t xml:space="preserve"> and I pledge my life to Your service forever and ever.</w:t>
+      </w:r>
+    </w:p>
+    <w:p>
+      <w:pPr>
+        <w:shd w:val="solid" w:color="F5F5F5" w:fill="F5F5F5"/>
+        <w:spacing w:before="20" w:after="20"/>
+        <w:ind w:left="360"/>
+      </w:pPr>
+      <w:r>
+        <w:rPr>
+          <w:rFonts w:ascii="Consolas" w:eastAsia="Consolas" w:hAnsi="Consolas" w:cs="Consolas"/>
+          <w:sz w:val="18"/>
+          <w:szCs w:val="18"/>
+        </w:rPr>
+        <w:t>I love You, dear Father.</w:t>
+      </w:r>
+    </w:p>
+    <w:p>
+      <w:pPr>
+        <w:shd w:val="solid" w:color="F5F5F5" w:fill="F5F5F5"/>
+        <w:spacing w:before="20" w:after="20"/>
+        <w:ind w:left="360"/>
+      </w:pPr>
+      <w:r>
+        <w:rPr>
+          <w:rFonts w:ascii="Consolas" w:eastAsia="Consolas" w:hAnsi="Consolas" w:cs="Consolas"/>
+          <w:sz w:val="18"/>
+          <w:szCs w:val="18"/>
+        </w:rPr>
+        <w:t>I console You in these times, dear Father.</w:t>
+      </w:r>
+    </w:p>
+    <w:p>
+      <w:pPr>
+        <w:shd w:val="solid" w:color="F5F5F5" w:fill="F5F5F5"/>
+        <w:spacing w:before="20" w:after="20"/>
+        <w:ind w:left="360"/>
+      </w:pPr>
+      <w:r>
+        <w:rPr>
+          <w:rFonts w:ascii="Consolas" w:eastAsia="Consolas" w:hAnsi="Consolas" w:cs="Consolas"/>
+          <w:sz w:val="18"/>
+          <w:szCs w:val="18"/>
+        </w:rPr>
+        <w:t>I offer You the Body, Blood,</w:t>
+      </w:r>
+    </w:p>
+    <w:p>
+      <w:pPr>
+        <w:shd w:val="solid" w:color="F5F5F5" w:fill="F5F5F5"/>
+        <w:spacing w:before="20" w:after="20"/>
+        <w:ind w:left="360"/>
+      </w:pPr>
+      <w:r>
+        <w:rPr>
+          <w:rFonts w:ascii="Consolas" w:eastAsia="Consolas" w:hAnsi="Consolas" w:cs="Consolas"/>
+          <w:sz w:val="18"/>
+          <w:szCs w:val="18"/>
+        </w:rPr>
+        <w:t>Soul and Divinity of Your dearly beloved Son in atonement for the sins of the world and for the salvation of all Your children.</w:t>
+      </w:r>
+    </w:p>
+    <w:p>
+      <w:pPr>
+        <w:shd w:val="solid" w:color="F5F5F5" w:fill="F5F5F5"/>
+        <w:spacing w:before="20" w:after="20"/>
+        <w:ind w:left="360"/>
+      </w:pPr>
+      <w:r>
+        <w:rPr>
+          <w:rFonts w:ascii="Consolas" w:eastAsia="Consolas" w:hAnsi="Consolas" w:cs="Consolas"/>
+          <w:sz w:val="18"/>
+          <w:szCs w:val="18"/>
+        </w:rPr>
+        <w:t>Amen.</w:t>
+      </w:r>
+    </w:p>
+    <w:p>
+      <w:pPr>
+        <w:spacing w:after="80"/>
+      </w:pPr>
+    </w:p>
+    <w:p>
+      <w:pPr>
+        <w:spacing w:before="80" w:after="80"/>
+      </w:pPr>
+      <w:r>
+        <w:rPr>
+          <w:i/>
+          <w:iCs/>
+        </w:rPr>
+        <w:t xml:space="preserve">Go, </w:t>
+      </w:r>
+      <w:proofErr w:type="gramStart"/>
+      <w:r>
+        <w:rPr>
+          <w:i/>
+          <w:iCs/>
+        </w:rPr>
+        <w:t>My</w:t>
+      </w:r>
+      <w:proofErr w:type="gramEnd"/>
+      <w:r>
+        <w:rPr>
+          <w:i/>
+          <w:iCs/>
+        </w:rPr>
+        <w:t xml:space="preserve"> children and do not fear. Trust in Me, </w:t>
+      </w:r>
+      <w:proofErr w:type="gramStart"/>
+      <w:r>
+        <w:rPr>
+          <w:i/>
+          <w:iCs/>
+        </w:rPr>
+        <w:t>Your</w:t>
+      </w:r>
+      <w:proofErr w:type="gramEnd"/>
+      <w:r>
+        <w:rPr>
+          <w:i/>
+          <w:iCs/>
+        </w:rPr>
+        <w:t xml:space="preserve"> beloved Father who lovingly created each of you. I know every single soul, every part of you is known to Me. Not one of you is loved less than the other. Because of this I do not want to lose one soul. Not one. Please continue to pray My Divine Mercy Chaplet every day. One day, you will understand why this purification is needed. Your loving Father in Heaven - God of the Most High</w:t>
       </w:r>
     </w:p>
     <w:p>
@@ -4000,7 +4432,15 @@
         <w:spacing w:after="120"/>
       </w:pPr>
       <w:r>
-        <w:t>Crusade Prayer (79): For 2 Billion Lost Souls</w:t>
+        <w:t xml:space="preserve">Crusade Prayer (79): For 2 </w:t>
+      </w:r>
+      <w:proofErr w:type="gramStart"/>
+      <w:r>
+        <w:t>Billion</w:t>
+      </w:r>
+      <w:proofErr w:type="gramEnd"/>
+      <w:r>
+        <w:t xml:space="preserve"> Lost Souls</w:t>
       </w:r>
     </w:p>
     <w:p>
@@ -4022,7 +4462,23 @@
           <w:i/>
           <w:iCs/>
         </w:rPr>
-        <w:t>Crusade Prayer (79) for 2 Billion Lost Souls Thursday, September 27th, 2012 @ 09:00</w:t>
+        <w:t xml:space="preserve">Crusade Prayer (79) for 2 </w:t>
+      </w:r>
+      <w:proofErr w:type="gramStart"/>
+      <w:r>
+        <w:rPr>
+          <w:i/>
+          <w:iCs/>
+        </w:rPr>
+        <w:t>Billion</w:t>
+      </w:r>
+      <w:proofErr w:type="gramEnd"/>
+      <w:r>
+        <w:rPr>
+          <w:i/>
+          <w:iCs/>
+        </w:rPr>
+        <w:t xml:space="preserve"> Lost Souls Thursday, September 27th, 2012 @ 09:00</w:t>
       </w:r>
     </w:p>
     <w:p>
@@ -4076,13 +4532,23 @@
         <w:spacing w:before="20" w:after="20"/>
         <w:ind w:left="360"/>
       </w:pPr>
-      <w:r>
-        <w:rPr>
-          <w:rFonts w:ascii="Consolas" w:eastAsia="Consolas" w:hAnsi="Consolas" w:cs="Consolas"/>
-          <w:sz w:val="18"/>
-          <w:szCs w:val="18"/>
-        </w:rPr>
-        <w:t>so You can, through Your Mercy,</w:t>
+      <w:proofErr w:type="gramStart"/>
+      <w:r>
+        <w:rPr>
+          <w:rFonts w:ascii="Consolas" w:eastAsia="Consolas" w:hAnsi="Consolas" w:cs="Consolas"/>
+          <w:sz w:val="18"/>
+          <w:szCs w:val="18"/>
+        </w:rPr>
+        <w:t>so</w:t>
+      </w:r>
+      <w:proofErr w:type="gramEnd"/>
+      <w:r>
+        <w:rPr>
+          <w:rFonts w:ascii="Consolas" w:eastAsia="Consolas" w:hAnsi="Consolas" w:cs="Consolas"/>
+          <w:sz w:val="18"/>
+          <w:szCs w:val="18"/>
+        </w:rPr>
+        <w:t xml:space="preserve"> You can, through Your Mercy,</w:t>
       </w:r>
     </w:p>
     <w:p>
@@ -4136,28 +4602,48 @@
         <w:spacing w:before="20" w:after="20"/>
         <w:ind w:left="360"/>
       </w:pPr>
-      <w:r>
-        <w:rPr>
-          <w:rFonts w:ascii="Consolas" w:eastAsia="Consolas" w:hAnsi="Consolas" w:cs="Consolas"/>
-          <w:sz w:val="18"/>
-          <w:szCs w:val="18"/>
-        </w:rPr>
-        <w:t>so they will go to You and ask You to fill them with the Holy Spirit,</w:t>
-      </w:r>
-    </w:p>
-    <w:p>
-      <w:pPr>
-        <w:shd w:val="solid" w:color="F5F5F5" w:fill="F5F5F5"/>
-        <w:spacing w:before="20" w:after="20"/>
-        <w:ind w:left="360"/>
-      </w:pPr>
-      <w:r>
-        <w:rPr>
-          <w:rFonts w:ascii="Consolas" w:eastAsia="Consolas" w:hAnsi="Consolas" w:cs="Consolas"/>
-          <w:sz w:val="18"/>
-          <w:szCs w:val="18"/>
-        </w:rPr>
-        <w:t>so they can accept the Truth of Your Love and live with You and all of God’s family forever.</w:t>
+      <w:proofErr w:type="gramStart"/>
+      <w:r>
+        <w:rPr>
+          <w:rFonts w:ascii="Consolas" w:eastAsia="Consolas" w:hAnsi="Consolas" w:cs="Consolas"/>
+          <w:sz w:val="18"/>
+          <w:szCs w:val="18"/>
+        </w:rPr>
+        <w:t>so</w:t>
+      </w:r>
+      <w:proofErr w:type="gramEnd"/>
+      <w:r>
+        <w:rPr>
+          <w:rFonts w:ascii="Consolas" w:eastAsia="Consolas" w:hAnsi="Consolas" w:cs="Consolas"/>
+          <w:sz w:val="18"/>
+          <w:szCs w:val="18"/>
+        </w:rPr>
+        <w:t xml:space="preserve"> they will go to You and ask You to fill them with the Holy Spirit,</w:t>
+      </w:r>
+    </w:p>
+    <w:p>
+      <w:pPr>
+        <w:shd w:val="solid" w:color="F5F5F5" w:fill="F5F5F5"/>
+        <w:spacing w:before="20" w:after="20"/>
+        <w:ind w:left="360"/>
+      </w:pPr>
+      <w:proofErr w:type="gramStart"/>
+      <w:r>
+        <w:rPr>
+          <w:rFonts w:ascii="Consolas" w:eastAsia="Consolas" w:hAnsi="Consolas" w:cs="Consolas"/>
+          <w:sz w:val="18"/>
+          <w:szCs w:val="18"/>
+        </w:rPr>
+        <w:t>so</w:t>
+      </w:r>
+      <w:proofErr w:type="gramEnd"/>
+      <w:r>
+        <w:rPr>
+          <w:rFonts w:ascii="Consolas" w:eastAsia="Consolas" w:hAnsi="Consolas" w:cs="Consolas"/>
+          <w:sz w:val="18"/>
+          <w:szCs w:val="18"/>
+        </w:rPr>
+        <w:t xml:space="preserve"> they can accept the Truth of Your Love and live with You and all of God’s family forever.</w:t>
       </w:r>
     </w:p>
     <w:p>
@@ -4278,7 +4764,25 @@
           <w:sz w:val="18"/>
           <w:szCs w:val="18"/>
         </w:rPr>
-        <w:t>in honour of Your great Sacrifice, by Your Death on the Cross,</w:t>
+        <w:t xml:space="preserve">in </w:t>
+      </w:r>
+      <w:proofErr w:type="spellStart"/>
+      <w:r>
+        <w:rPr>
+          <w:rFonts w:ascii="Consolas" w:eastAsia="Consolas" w:hAnsi="Consolas" w:cs="Consolas"/>
+          <w:sz w:val="18"/>
+          <w:szCs w:val="18"/>
+        </w:rPr>
+        <w:t>honour</w:t>
+      </w:r>
+      <w:proofErr w:type="spellEnd"/>
+      <w:r>
+        <w:rPr>
+          <w:rFonts w:ascii="Consolas" w:eastAsia="Consolas" w:hAnsi="Consolas" w:cs="Consolas"/>
+          <w:sz w:val="18"/>
+          <w:szCs w:val="18"/>
+        </w:rPr>
+        <w:t xml:space="preserve"> of Your great Sacrifice, by Your Death on the Cross,</w:t>
       </w:r>
     </w:p>
     <w:p>
@@ -4691,7 +5195,25 @@
           <w:sz w:val="18"/>
           <w:szCs w:val="18"/>
         </w:rPr>
-        <w:t>When I criticise, help me to remain silent.</w:t>
+        <w:t xml:space="preserve">When I </w:t>
+      </w:r>
+      <w:proofErr w:type="spellStart"/>
+      <w:r>
+        <w:rPr>
+          <w:rFonts w:ascii="Consolas" w:eastAsia="Consolas" w:hAnsi="Consolas" w:cs="Consolas"/>
+          <w:sz w:val="18"/>
+          <w:szCs w:val="18"/>
+        </w:rPr>
+        <w:t>criticise</w:t>
+      </w:r>
+      <w:proofErr w:type="spellEnd"/>
+      <w:r>
+        <w:rPr>
+          <w:rFonts w:ascii="Consolas" w:eastAsia="Consolas" w:hAnsi="Consolas" w:cs="Consolas"/>
+          <w:sz w:val="18"/>
+          <w:szCs w:val="18"/>
+        </w:rPr>
+        <w:t>, help me to remain silent.</w:t>
       </w:r>
     </w:p>
     <w:p>
@@ -5130,114 +5652,226 @@
           <w:i/>
           <w:iCs/>
         </w:rPr>
-        <w:t>Thursday, April 11th, 2013 @ 21:20 - My dearly beloved daughter, you must move forward and concentrate on those poor souls who do not believe in God at all. I refer to those who have never been given the Truth about the Existence of God, their Creator. There are billions of people who have no knowledge of the Holy Trinity because it was hidden from them. These are the souls who will be granted great Mercy by Me and they need to be made aware of these, My Messages to the world. The other souls who concern Me are those who were lukewarm in their faith and who now refuse to accept the Truth of eternal life. Many people who are either unsure of their Creation, or the Existence of God, will soon be shown the Truth. Again I will show them great Mercy and My Love will touch their hearts and they will be saved. But then there are those who will continue to resist My Intervention. They will fight any attempt to be given the Truth, and the proof they will be given of My Mercy will be thrown back in My Face. Again, I will intervene and continue to fight for their souls. Finally, there are those who do know everything about Me and the fact that I Am the Messiah. No miracle or act of love will draw them to Me because they have abandoned themselves to Satan. These souls will be devoured by the beast and he will not let them go free because they do not see me as their Saviour. They still do not know the truth of the plan of the beast. In order to save them, you, My beloved followers, must give Me your allegiance by committing their souls to Me during your prayers and when you receive the Holy Eucharist. You must offer them to Me every day and for every soul you dedicate to My Mercy, I will save a hundred more. Do this every single day. At the end of every month you will be full of joy because you will know how many such souls have been given this Great Mercy. This is just another Gift I bless you with and the graces you will receive when you recite this Crusade Prayer will be in abundance.</w:t>
-      </w:r>
-    </w:p>
-    <w:p>
-      <w:pPr>
-        <w:shd w:val="solid" w:color="F5F5F5" w:fill="F5F5F5"/>
-        <w:spacing w:before="20" w:after="20"/>
-        <w:ind w:left="360"/>
-      </w:pPr>
-      <w:r>
-        <w:rPr>
-          <w:rFonts w:ascii="Consolas" w:eastAsia="Consolas" w:hAnsi="Consolas" w:cs="Consolas"/>
-          <w:sz w:val="18"/>
-          <w:szCs w:val="18"/>
-        </w:rPr>
-        <w:t>Dearest Jesus,</w:t>
-      </w:r>
-    </w:p>
-    <w:p>
-      <w:pPr>
-        <w:shd w:val="solid" w:color="F5F5F5" w:fill="F5F5F5"/>
-        <w:spacing w:before="20" w:after="20"/>
-        <w:ind w:left="360"/>
-      </w:pPr>
-      <w:r>
-        <w:rPr>
-          <w:rFonts w:ascii="Consolas" w:eastAsia="Consolas" w:hAnsi="Consolas" w:cs="Consolas"/>
-          <w:sz w:val="18"/>
-          <w:szCs w:val="18"/>
-        </w:rPr>
-        <w:t>I present to You the soul of my brother and sister,</w:t>
-      </w:r>
-    </w:p>
-    <w:p>
-      <w:pPr>
-        <w:shd w:val="solid" w:color="F5F5F5" w:fill="F5F5F5"/>
-        <w:spacing w:before="20" w:after="20"/>
-        <w:ind w:left="360"/>
-      </w:pPr>
-      <w:r>
-        <w:rPr>
-          <w:rFonts w:ascii="Consolas" w:eastAsia="Consolas" w:hAnsi="Consolas" w:cs="Consolas"/>
-          <w:sz w:val="18"/>
-          <w:szCs w:val="18"/>
-        </w:rPr>
-        <w:t>who has abandoned their soul to Satan.</w:t>
-      </w:r>
-    </w:p>
-    <w:p>
-      <w:pPr>
-        <w:shd w:val="solid" w:color="F5F5F5" w:fill="F5F5F5"/>
-        <w:spacing w:before="20" w:after="20"/>
-        <w:ind w:left="360"/>
-      </w:pPr>
-      <w:r>
-        <w:rPr>
-          <w:rFonts w:ascii="Consolas" w:eastAsia="Consolas" w:hAnsi="Consolas" w:cs="Consolas"/>
-          <w:sz w:val="18"/>
-          <w:szCs w:val="18"/>
-        </w:rPr>
-        <w:t>Take this soul and redeem it in Your Holy Eyes.</w:t>
-      </w:r>
-    </w:p>
-    <w:p>
-      <w:pPr>
-        <w:shd w:val="solid" w:color="F5F5F5" w:fill="F5F5F5"/>
-        <w:spacing w:before="20" w:after="20"/>
-        <w:ind w:left="360"/>
-      </w:pPr>
-      <w:r>
-        <w:rPr>
-          <w:rFonts w:ascii="Consolas" w:eastAsia="Consolas" w:hAnsi="Consolas" w:cs="Consolas"/>
-          <w:sz w:val="18"/>
-          <w:szCs w:val="18"/>
-        </w:rPr>
-        <w:t>Free this soul from slavery to the beast and bring it eternal salvation.</w:t>
-      </w:r>
-    </w:p>
-    <w:p>
-      <w:pPr>
-        <w:shd w:val="solid" w:color="F5F5F5" w:fill="F5F5F5"/>
-        <w:spacing w:before="20" w:after="20"/>
-        <w:ind w:left="360"/>
-      </w:pPr>
-      <w:r>
-        <w:rPr>
-          <w:rFonts w:ascii="Consolas" w:eastAsia="Consolas" w:hAnsi="Consolas" w:cs="Consolas"/>
-          <w:sz w:val="18"/>
-          <w:szCs w:val="18"/>
-        </w:rPr>
-        <w:t>Amen.</w:t>
-      </w:r>
-    </w:p>
-    <w:p>
-      <w:pPr>
-        <w:spacing w:after="80"/>
-      </w:pPr>
-    </w:p>
-    <w:p>
-      <w:pPr>
-        <w:spacing w:before="80" w:after="80"/>
-      </w:pPr>
+        <w:t xml:space="preserve">Thursday, April 11th, 2013 @ 21:20 - My dearly beloved daughter, you must move forward and concentrate on those poor souls who do not believe in God at all. I refer to those who have never been given the Truth about the Existence of God, their Creator. There are billions of people who have no knowledge of the Holy Trinity because it was hidden from them. These are the souls who will be granted great Mercy by </w:t>
+      </w:r>
+      <w:proofErr w:type="gramStart"/>
       <w:r>
         <w:rPr>
           <w:i/>
           <w:iCs/>
         </w:rPr>
-        <w:t>My Mercy will continue to be given to mankind, and especially, to every single soul who rejects the Word of God. I bless you, My loyal disciples, and I continue to pour upon you the Gift of the Holy Spirit. Your Jesus</w:t>
+        <w:t>Me</w:t>
+      </w:r>
+      <w:proofErr w:type="gramEnd"/>
+      <w:r>
+        <w:rPr>
+          <w:i/>
+          <w:iCs/>
+        </w:rPr>
+        <w:t xml:space="preserve"> and they need to be made aware of these, My Messages to the world. The other souls who concern Me are those who were lukewarm in their faith and who now refuse to accept the Truth of eternal life. Many people who are either unsure of their Creation, or the Existence of God, will soon be shown the Truth. </w:t>
+      </w:r>
+      <w:proofErr w:type="gramStart"/>
+      <w:r>
+        <w:rPr>
+          <w:i/>
+          <w:iCs/>
+        </w:rPr>
+        <w:t>Again</w:t>
+      </w:r>
+      <w:proofErr w:type="gramEnd"/>
+      <w:r>
+        <w:rPr>
+          <w:i/>
+          <w:iCs/>
+        </w:rPr>
+        <w:t xml:space="preserve"> I will show them great Mercy and My Love will touch their hearts and they will be saved. But then there are those who will continue to resist My Intervention. They will fight any attempt to be given the Truth, and the proof they will be given of My Mercy will be thrown back in My Face. Again, I will intervene and continue to fight for their souls. Finally, there are those who do know everything about Me and the fact that I Am the Messiah. No miracle or act of love will draw them to Me because they have abandoned themselves to Satan. These souls will be devoured by the </w:t>
+      </w:r>
+      <w:proofErr w:type="gramStart"/>
+      <w:r>
+        <w:rPr>
+          <w:i/>
+          <w:iCs/>
+        </w:rPr>
+        <w:t>beast</w:t>
+      </w:r>
+      <w:proofErr w:type="gramEnd"/>
+      <w:r>
+        <w:rPr>
+          <w:i/>
+          <w:iCs/>
+        </w:rPr>
+        <w:t xml:space="preserve"> and he will not let them go free because they do not see me as their Saviour. They still do not know the truth of the plan of the beast. </w:t>
+      </w:r>
+      <w:proofErr w:type="gramStart"/>
+      <w:r>
+        <w:rPr>
+          <w:i/>
+          <w:iCs/>
+        </w:rPr>
+        <w:t>In order to</w:t>
+      </w:r>
+      <w:proofErr w:type="gramEnd"/>
+      <w:r>
+        <w:rPr>
+          <w:i/>
+          <w:iCs/>
+        </w:rPr>
+        <w:t xml:space="preserve"> save them, you, </w:t>
+      </w:r>
+      <w:proofErr w:type="gramStart"/>
+      <w:r>
+        <w:rPr>
+          <w:i/>
+          <w:iCs/>
+        </w:rPr>
+        <w:t>My</w:t>
+      </w:r>
+      <w:proofErr w:type="gramEnd"/>
+      <w:r>
+        <w:rPr>
+          <w:i/>
+          <w:iCs/>
+        </w:rPr>
+        <w:t xml:space="preserve"> beloved followers, must give Me your allegiance by committing their souls to Me during your prayers and when you receive the Holy Eucharist. You must offer them to Me every day and for every soul you dedicate to My Mercy, I will save a hundred more. Do this every single day. At the end of every </w:t>
+      </w:r>
+      <w:proofErr w:type="gramStart"/>
+      <w:r>
+        <w:rPr>
+          <w:i/>
+          <w:iCs/>
+        </w:rPr>
+        <w:t>month</w:t>
+      </w:r>
+      <w:proofErr w:type="gramEnd"/>
+      <w:r>
+        <w:rPr>
+          <w:i/>
+          <w:iCs/>
+        </w:rPr>
+        <w:t xml:space="preserve"> you will be full of joy because you will know how many such souls have been given this Great Mercy. This is just another Gift I bless you with and the graces you will receive when you recite this Crusade Prayer will be in abundance.</w:t>
+      </w:r>
+    </w:p>
+    <w:p>
+      <w:pPr>
+        <w:shd w:val="solid" w:color="F5F5F5" w:fill="F5F5F5"/>
+        <w:spacing w:before="20" w:after="20"/>
+        <w:ind w:left="360"/>
+      </w:pPr>
+      <w:r>
+        <w:rPr>
+          <w:rFonts w:ascii="Consolas" w:eastAsia="Consolas" w:hAnsi="Consolas" w:cs="Consolas"/>
+          <w:sz w:val="18"/>
+          <w:szCs w:val="18"/>
+        </w:rPr>
+        <w:t>Dearest Jesus,</w:t>
+      </w:r>
+    </w:p>
+    <w:p>
+      <w:pPr>
+        <w:shd w:val="solid" w:color="F5F5F5" w:fill="F5F5F5"/>
+        <w:spacing w:before="20" w:after="20"/>
+        <w:ind w:left="360"/>
+      </w:pPr>
+      <w:r>
+        <w:rPr>
+          <w:rFonts w:ascii="Consolas" w:eastAsia="Consolas" w:hAnsi="Consolas" w:cs="Consolas"/>
+          <w:sz w:val="18"/>
+          <w:szCs w:val="18"/>
+        </w:rPr>
+        <w:t>I present to You the soul of my brother and sister,</w:t>
+      </w:r>
+    </w:p>
+    <w:p>
+      <w:pPr>
+        <w:shd w:val="solid" w:color="F5F5F5" w:fill="F5F5F5"/>
+        <w:spacing w:before="20" w:after="20"/>
+        <w:ind w:left="360"/>
+      </w:pPr>
+      <w:r>
+        <w:rPr>
+          <w:rFonts w:ascii="Consolas" w:eastAsia="Consolas" w:hAnsi="Consolas" w:cs="Consolas"/>
+          <w:sz w:val="18"/>
+          <w:szCs w:val="18"/>
+        </w:rPr>
+        <w:t>who has abandoned their soul to Satan.</w:t>
+      </w:r>
+    </w:p>
+    <w:p>
+      <w:pPr>
+        <w:shd w:val="solid" w:color="F5F5F5" w:fill="F5F5F5"/>
+        <w:spacing w:before="20" w:after="20"/>
+        <w:ind w:left="360"/>
+      </w:pPr>
+      <w:r>
+        <w:rPr>
+          <w:rFonts w:ascii="Consolas" w:eastAsia="Consolas" w:hAnsi="Consolas" w:cs="Consolas"/>
+          <w:sz w:val="18"/>
+          <w:szCs w:val="18"/>
+        </w:rPr>
+        <w:t>Take this soul and redeem it in Your Holy Eyes.</w:t>
+      </w:r>
+    </w:p>
+    <w:p>
+      <w:pPr>
+        <w:shd w:val="solid" w:color="F5F5F5" w:fill="F5F5F5"/>
+        <w:spacing w:before="20" w:after="20"/>
+        <w:ind w:left="360"/>
+      </w:pPr>
+      <w:r>
+        <w:rPr>
+          <w:rFonts w:ascii="Consolas" w:eastAsia="Consolas" w:hAnsi="Consolas" w:cs="Consolas"/>
+          <w:sz w:val="18"/>
+          <w:szCs w:val="18"/>
+        </w:rPr>
+        <w:t>Free this soul from slavery to the beast and bring it eternal salvation.</w:t>
+      </w:r>
+    </w:p>
+    <w:p>
+      <w:pPr>
+        <w:shd w:val="solid" w:color="F5F5F5" w:fill="F5F5F5"/>
+        <w:spacing w:before="20" w:after="20"/>
+        <w:ind w:left="360"/>
+      </w:pPr>
+      <w:r>
+        <w:rPr>
+          <w:rFonts w:ascii="Consolas" w:eastAsia="Consolas" w:hAnsi="Consolas" w:cs="Consolas"/>
+          <w:sz w:val="18"/>
+          <w:szCs w:val="18"/>
+        </w:rPr>
+        <w:t>Amen.</w:t>
+      </w:r>
+    </w:p>
+    <w:p>
+      <w:pPr>
+        <w:spacing w:after="80"/>
+      </w:pPr>
+    </w:p>
+    <w:p>
+      <w:pPr>
+        <w:spacing w:before="80" w:after="80"/>
+      </w:pPr>
+      <w:r>
+        <w:rPr>
+          <w:i/>
+          <w:iCs/>
+        </w:rPr>
+        <w:t xml:space="preserve">My Mercy will continue to be given to mankind, and especially, to every single soul who rejects the Word of God. I bless you, </w:t>
+      </w:r>
+      <w:proofErr w:type="gramStart"/>
+      <w:r>
+        <w:rPr>
+          <w:i/>
+          <w:iCs/>
+        </w:rPr>
+        <w:t>My</w:t>
+      </w:r>
+      <w:proofErr w:type="gramEnd"/>
+      <w:r>
+        <w:rPr>
+          <w:i/>
+          <w:iCs/>
+        </w:rPr>
+        <w:t xml:space="preserve"> loyal disciples, and I continue to pour upon you the Gift of the Holy Spirit. Your Jesus</w:t>
       </w:r>
     </w:p>
     <w:p>
@@ -5328,7 +5962,25 @@
           <w:sz w:val="18"/>
           <w:szCs w:val="18"/>
         </w:rPr>
-        <w:t>through this Prayer, save all those I come into contact with.</w:t>
+        <w:t xml:space="preserve">through this Prayer, save all those I </w:t>
+      </w:r>
+      <w:proofErr w:type="gramStart"/>
+      <w:r>
+        <w:rPr>
+          <w:rFonts w:ascii="Consolas" w:eastAsia="Consolas" w:hAnsi="Consolas" w:cs="Consolas"/>
+          <w:sz w:val="18"/>
+          <w:szCs w:val="18"/>
+        </w:rPr>
+        <w:t>come into contact with</w:t>
+      </w:r>
+      <w:proofErr w:type="gramEnd"/>
+      <w:r>
+        <w:rPr>
+          <w:rFonts w:ascii="Consolas" w:eastAsia="Consolas" w:hAnsi="Consolas" w:cs="Consolas"/>
+          <w:sz w:val="18"/>
+          <w:szCs w:val="18"/>
+        </w:rPr>
+        <w:t>.</w:t>
       </w:r>
     </w:p>
     <w:p>
@@ -5454,7 +6106,25 @@
           <w:sz w:val="18"/>
           <w:szCs w:val="18"/>
         </w:rPr>
-        <w:t>I consecrate my children (name of child/children here) before your Son,</w:t>
+        <w:t xml:space="preserve">I consecrate my children (name of child/children here) before your </w:t>
+      </w:r>
+      <w:proofErr w:type="gramStart"/>
+      <w:r>
+        <w:rPr>
+          <w:rFonts w:ascii="Consolas" w:eastAsia="Consolas" w:hAnsi="Consolas" w:cs="Consolas"/>
+          <w:sz w:val="18"/>
+          <w:szCs w:val="18"/>
+        </w:rPr>
+        <w:t>Son</w:t>
+      </w:r>
+      <w:proofErr w:type="gramEnd"/>
+      <w:r>
+        <w:rPr>
+          <w:rFonts w:ascii="Consolas" w:eastAsia="Consolas" w:hAnsi="Consolas" w:cs="Consolas"/>
+          <w:sz w:val="18"/>
+          <w:szCs w:val="18"/>
+        </w:rPr>
+        <w:t>,</w:t>
       </w:r>
     </w:p>
     <w:p>
@@ -5777,7 +6447,25 @@
           <w:sz w:val="18"/>
           <w:szCs w:val="18"/>
         </w:rPr>
-        <w:t>Dear Jesus I ask You to consecrate me, my family,</w:t>
+        <w:t xml:space="preserve">Dear </w:t>
+      </w:r>
+      <w:proofErr w:type="gramStart"/>
+      <w:r>
+        <w:rPr>
+          <w:rFonts w:ascii="Consolas" w:eastAsia="Consolas" w:hAnsi="Consolas" w:cs="Consolas"/>
+          <w:sz w:val="18"/>
+          <w:szCs w:val="18"/>
+        </w:rPr>
+        <w:t>Jesus</w:t>
+      </w:r>
+      <w:proofErr w:type="gramEnd"/>
+      <w:r>
+        <w:rPr>
+          <w:rFonts w:ascii="Consolas" w:eastAsia="Consolas" w:hAnsi="Consolas" w:cs="Consolas"/>
+          <w:sz w:val="18"/>
+          <w:szCs w:val="18"/>
+        </w:rPr>
+        <w:t xml:space="preserve"> I ask You to consecrate me, my family,</w:t>
       </w:r>
     </w:p>
     <w:p>
@@ -5923,7 +6611,23 @@
           <w:i/>
           <w:iCs/>
         </w:rPr>
-        <w:t>I now give all of you a special Gift, blessed by my Son, so that all souls will be granted immunity from the fires of Hell and be granted salvation. My Son desires that every soul be saved, no matter how grievous their sin. I ask that you now begin the Novena of Salvation. You must begin this immediately and continue it, as I instruct you to, to the end of time. You must recite this Prayer for a full seven consecutive days during one calendar month, commencing on Mondays, in the morning time. You must recite it three times during each of the seven days and on one of these days you must fast. By fasting you are requested to eat only one main meal during the day and then bread and water only at the other two meal times. This is the prayer you must say for each of the seven days. (Prayer on next page…)</w:t>
+        <w:t xml:space="preserve">I now give all of you a special Gift, blessed by my Son, so that all souls will be granted immunity from the fires of Hell and be granted salvation. My Son desires that every soul be saved, no matter how grievous their sin. I ask that you now begin the Novena of Salvation. You must begin this immediately and continue it, as I instruct you to, to the end of time. You must recite this Prayer for a full seven consecutive days during one calendar month, commencing on Mondays, in the morning time. You must recite it three times during each of the seven days and on one of these days you must fast. By fasting you are requested to eat only one main meal during the day and then bread and water only at the other two </w:t>
+      </w:r>
+      <w:proofErr w:type="gramStart"/>
+      <w:r>
+        <w:rPr>
+          <w:i/>
+          <w:iCs/>
+        </w:rPr>
+        <w:t>meal times</w:t>
+      </w:r>
+      <w:proofErr w:type="gramEnd"/>
+      <w:r>
+        <w:rPr>
+          <w:i/>
+          <w:iCs/>
+        </w:rPr>
+        <w:t>. This is the prayer you must say for each of the seven days. (Prayer on next page…)</w:t>
       </w:r>
     </w:p>
     <w:p>
@@ -6287,7 +6991,23 @@
           <w:i/>
           <w:iCs/>
         </w:rPr>
-        <w:t>Peace be yours dear children and remember that without love for God you can never find true peace. Your Beloved Mother - Mother of Salvation</w:t>
+        <w:t xml:space="preserve">Peace be </w:t>
+      </w:r>
+      <w:proofErr w:type="gramStart"/>
+      <w:r>
+        <w:rPr>
+          <w:i/>
+          <w:iCs/>
+        </w:rPr>
+        <w:t>yours</w:t>
+      </w:r>
+      <w:proofErr w:type="gramEnd"/>
+      <w:r>
+        <w:rPr>
+          <w:i/>
+          <w:iCs/>
+        </w:rPr>
+        <w:t xml:space="preserve"> dear children and remember that without love for God you can never find true peace. Your Beloved Mother - Mother of Salvation</w:t>
       </w:r>
     </w:p>
     <w:p>
@@ -6474,7 +7194,25 @@
           <w:sz w:val="18"/>
           <w:szCs w:val="18"/>
         </w:rPr>
-        <w:t>If You Exist let me feel Your Love so I can see the Truth.</w:t>
+        <w:t xml:space="preserve">If You Exist let </w:t>
+      </w:r>
+      <w:proofErr w:type="gramStart"/>
+      <w:r>
+        <w:rPr>
+          <w:rFonts w:ascii="Consolas" w:eastAsia="Consolas" w:hAnsi="Consolas" w:cs="Consolas"/>
+          <w:sz w:val="18"/>
+          <w:szCs w:val="18"/>
+        </w:rPr>
+        <w:t>me</w:t>
+      </w:r>
+      <w:proofErr w:type="gramEnd"/>
+      <w:r>
+        <w:rPr>
+          <w:rFonts w:ascii="Consolas" w:eastAsia="Consolas" w:hAnsi="Consolas" w:cs="Consolas"/>
+          <w:sz w:val="18"/>
+          <w:szCs w:val="18"/>
+        </w:rPr>
+        <w:t xml:space="preserve"> feel Your Love so I can see the Truth.</w:t>
       </w:r>
     </w:p>
     <w:p>
@@ -6595,13 +7333,23 @@
         <w:spacing w:before="20" w:after="20"/>
         <w:ind w:left="360"/>
       </w:pPr>
-      <w:r>
-        <w:rPr>
-          <w:rFonts w:ascii="Consolas" w:eastAsia="Consolas" w:hAnsi="Consolas" w:cs="Consolas"/>
-          <w:sz w:val="18"/>
-          <w:szCs w:val="18"/>
-        </w:rPr>
-        <w:t>Jesus I feel lost.</w:t>
+      <w:proofErr w:type="gramStart"/>
+      <w:r>
+        <w:rPr>
+          <w:rFonts w:ascii="Consolas" w:eastAsia="Consolas" w:hAnsi="Consolas" w:cs="Consolas"/>
+          <w:sz w:val="18"/>
+          <w:szCs w:val="18"/>
+        </w:rPr>
+        <w:t>Jesus</w:t>
+      </w:r>
+      <w:proofErr w:type="gramEnd"/>
+      <w:r>
+        <w:rPr>
+          <w:rFonts w:ascii="Consolas" w:eastAsia="Consolas" w:hAnsi="Consolas" w:cs="Consolas"/>
+          <w:sz w:val="18"/>
+          <w:szCs w:val="18"/>
+        </w:rPr>
+        <w:t xml:space="preserve"> I feel lost.</w:t>
       </w:r>
     </w:p>
     <w:p>
@@ -6881,7 +7629,25 @@
           <w:sz w:val="18"/>
           <w:szCs w:val="18"/>
         </w:rPr>
-        <w:t>Allow Your Precious Blood to flow over my heart that we can be united as one.</w:t>
+        <w:t xml:space="preserve">Allow Your Precious Blood to flow over my heart that we can be </w:t>
+      </w:r>
+      <w:proofErr w:type="gramStart"/>
+      <w:r>
+        <w:rPr>
+          <w:rFonts w:ascii="Consolas" w:eastAsia="Consolas" w:hAnsi="Consolas" w:cs="Consolas"/>
+          <w:sz w:val="18"/>
+          <w:szCs w:val="18"/>
+        </w:rPr>
+        <w:t>united as one</w:t>
+      </w:r>
+      <w:proofErr w:type="gramEnd"/>
+      <w:r>
+        <w:rPr>
+          <w:rFonts w:ascii="Consolas" w:eastAsia="Consolas" w:hAnsi="Consolas" w:cs="Consolas"/>
+          <w:sz w:val="18"/>
+          <w:szCs w:val="18"/>
+        </w:rPr>
+        <w:t>.</w:t>
       </w:r>
     </w:p>
     <w:p>
@@ -6947,7 +7713,25 @@
           <w:sz w:val="18"/>
           <w:szCs w:val="18"/>
         </w:rPr>
-        <w:t>please flood my soul with the sign of Your Love so that I can recognise You for Who You are.</w:t>
+        <w:t xml:space="preserve">please flood my soul with the sign of Your Love so that I can </w:t>
+      </w:r>
+      <w:proofErr w:type="spellStart"/>
+      <w:r>
+        <w:rPr>
+          <w:rFonts w:ascii="Consolas" w:eastAsia="Consolas" w:hAnsi="Consolas" w:cs="Consolas"/>
+          <w:sz w:val="18"/>
+          <w:szCs w:val="18"/>
+        </w:rPr>
+        <w:t>recognise</w:t>
+      </w:r>
+      <w:proofErr w:type="spellEnd"/>
+      <w:r>
+        <w:rPr>
+          <w:rFonts w:ascii="Consolas" w:eastAsia="Consolas" w:hAnsi="Consolas" w:cs="Consolas"/>
+          <w:sz w:val="18"/>
+          <w:szCs w:val="18"/>
+        </w:rPr>
+        <w:t xml:space="preserve"> You for Who You are.</w:t>
       </w:r>
     </w:p>
     <w:p>
@@ -7327,7 +8111,25 @@
           <w:sz w:val="18"/>
           <w:szCs w:val="18"/>
         </w:rPr>
-        <w:t>Give me the graces and protect me with Your Armour of Strength to stand up to the evil acts,</w:t>
+        <w:t xml:space="preserve">Give me the graces and protect me with Your </w:t>
+      </w:r>
+      <w:proofErr w:type="spellStart"/>
+      <w:r>
+        <w:rPr>
+          <w:rFonts w:ascii="Consolas" w:eastAsia="Consolas" w:hAnsi="Consolas" w:cs="Consolas"/>
+          <w:sz w:val="18"/>
+          <w:szCs w:val="18"/>
+        </w:rPr>
+        <w:t>Armour</w:t>
+      </w:r>
+      <w:proofErr w:type="spellEnd"/>
+      <w:r>
+        <w:rPr>
+          <w:rFonts w:ascii="Consolas" w:eastAsia="Consolas" w:hAnsi="Consolas" w:cs="Consolas"/>
+          <w:sz w:val="18"/>
+          <w:szCs w:val="18"/>
+        </w:rPr>
+        <w:t xml:space="preserve"> of Strength to stand up to the evil acts,</w:t>
       </w:r>
     </w:p>
     <w:p>
@@ -7357,7 +8159,25 @@
           <w:sz w:val="18"/>
           <w:szCs w:val="18"/>
         </w:rPr>
-        <w:t>I beg for Your Mercy and pledge my allegiance to Your Holy Name at all times.</w:t>
+        <w:t xml:space="preserve">I beg for Your Mercy and </w:t>
+      </w:r>
+      <w:proofErr w:type="gramStart"/>
+      <w:r>
+        <w:rPr>
+          <w:rFonts w:ascii="Consolas" w:eastAsia="Consolas" w:hAnsi="Consolas" w:cs="Consolas"/>
+          <w:sz w:val="18"/>
+          <w:szCs w:val="18"/>
+        </w:rPr>
+        <w:t>pledge my allegiance to Your Holy Name at all times</w:t>
+      </w:r>
+      <w:proofErr w:type="gramEnd"/>
+      <w:r>
+        <w:rPr>
+          <w:rFonts w:ascii="Consolas" w:eastAsia="Consolas" w:hAnsi="Consolas" w:cs="Consolas"/>
+          <w:sz w:val="18"/>
+          <w:szCs w:val="18"/>
+        </w:rPr>
+        <w:t>.</w:t>
       </w:r>
     </w:p>
     <w:p>
@@ -7579,7 +8399,25 @@
           <w:sz w:val="18"/>
           <w:szCs w:val="18"/>
         </w:rPr>
-        <w:t>May we offer our humble sacrifices and accept trials and tribulations as a means to gain the salvation of all souls during The Warning.</w:t>
+        <w:t xml:space="preserve">May we offer our humble sacrifices and accept trials and tribulations </w:t>
+      </w:r>
+      <w:proofErr w:type="gramStart"/>
+      <w:r>
+        <w:rPr>
+          <w:rFonts w:ascii="Consolas" w:eastAsia="Consolas" w:hAnsi="Consolas" w:cs="Consolas"/>
+          <w:sz w:val="18"/>
+          <w:szCs w:val="18"/>
+        </w:rPr>
+        <w:t>as a means to</w:t>
+      </w:r>
+      <w:proofErr w:type="gramEnd"/>
+      <w:r>
+        <w:rPr>
+          <w:rFonts w:ascii="Consolas" w:eastAsia="Consolas" w:hAnsi="Consolas" w:cs="Consolas"/>
+          <w:sz w:val="18"/>
+          <w:szCs w:val="18"/>
+        </w:rPr>
+        <w:t xml:space="preserve"> gain the salvation of all souls during The Warning.</w:t>
       </w:r>
     </w:p>
     <w:p>
@@ -7852,7 +8690,25 @@
           <w:sz w:val="18"/>
           <w:szCs w:val="18"/>
         </w:rPr>
-        <w:t>Heavenly Father help me to become little, as a child,</w:t>
+        <w:t xml:space="preserve">Heavenly Father </w:t>
+      </w:r>
+      <w:proofErr w:type="gramStart"/>
+      <w:r>
+        <w:rPr>
+          <w:rFonts w:ascii="Consolas" w:eastAsia="Consolas" w:hAnsi="Consolas" w:cs="Consolas"/>
+          <w:sz w:val="18"/>
+          <w:szCs w:val="18"/>
+        </w:rPr>
+        <w:t>help</w:t>
+      </w:r>
+      <w:proofErr w:type="gramEnd"/>
+      <w:r>
+        <w:rPr>
+          <w:rFonts w:ascii="Consolas" w:eastAsia="Consolas" w:hAnsi="Consolas" w:cs="Consolas"/>
+          <w:sz w:val="18"/>
+          <w:szCs w:val="18"/>
+        </w:rPr>
+        <w:t xml:space="preserve"> me to become little, as a child,</w:t>
       </w:r>
     </w:p>
     <w:p>
@@ -7882,7 +8738,25 @@
           <w:sz w:val="18"/>
           <w:szCs w:val="18"/>
         </w:rPr>
-        <w:t>I ask for your graces to fall upon me so I can respond to your call to save all of your children.</w:t>
+        <w:t xml:space="preserve">I ask for your graces to fall upon me so I can respond to your call to save </w:t>
+      </w:r>
+      <w:proofErr w:type="gramStart"/>
+      <w:r>
+        <w:rPr>
+          <w:rFonts w:ascii="Consolas" w:eastAsia="Consolas" w:hAnsi="Consolas" w:cs="Consolas"/>
+          <w:sz w:val="18"/>
+          <w:szCs w:val="18"/>
+        </w:rPr>
+        <w:t>all of</w:t>
+      </w:r>
+      <w:proofErr w:type="gramEnd"/>
+      <w:r>
+        <w:rPr>
+          <w:rFonts w:ascii="Consolas" w:eastAsia="Consolas" w:hAnsi="Consolas" w:cs="Consolas"/>
+          <w:sz w:val="18"/>
+          <w:szCs w:val="18"/>
+        </w:rPr>
+        <w:t xml:space="preserve"> your children.</w:t>
       </w:r>
     </w:p>
     <w:p>
@@ -7948,7 +8822,25 @@
           <w:sz w:val="18"/>
           <w:szCs w:val="18"/>
         </w:rPr>
-        <w:t>O Jesus help me to see the truth of your Holy Word at all times and remain loyal to your teachings no matter how much I am forced to reject you.</w:t>
+        <w:t xml:space="preserve">O Jesus help me to </w:t>
+      </w:r>
+      <w:proofErr w:type="gramStart"/>
+      <w:r>
+        <w:rPr>
+          <w:rFonts w:ascii="Consolas" w:eastAsia="Consolas" w:hAnsi="Consolas" w:cs="Consolas"/>
+          <w:sz w:val="18"/>
+          <w:szCs w:val="18"/>
+        </w:rPr>
+        <w:t>see the truth of your Holy Word at all times</w:t>
+      </w:r>
+      <w:proofErr w:type="gramEnd"/>
+      <w:r>
+        <w:rPr>
+          <w:rFonts w:ascii="Consolas" w:eastAsia="Consolas" w:hAnsi="Consolas" w:cs="Consolas"/>
+          <w:sz w:val="18"/>
+          <w:szCs w:val="18"/>
+        </w:rPr>
+        <w:t xml:space="preserve"> and remain loyal to your teachings no matter how much I am forced to reject you.</w:t>
       </w:r>
     </w:p>
     <w:p>
@@ -8216,7 +9108,25 @@
           <w:sz w:val="18"/>
           <w:szCs w:val="18"/>
         </w:rPr>
-        <w:t>Jesus forgive me, for I have sinned.</w:t>
+        <w:t xml:space="preserve">Jesus </w:t>
+      </w:r>
+      <w:proofErr w:type="gramStart"/>
+      <w:r>
+        <w:rPr>
+          <w:rFonts w:ascii="Consolas" w:eastAsia="Consolas" w:hAnsi="Consolas" w:cs="Consolas"/>
+          <w:sz w:val="18"/>
+          <w:szCs w:val="18"/>
+        </w:rPr>
+        <w:t>forgive</w:t>
+      </w:r>
+      <w:proofErr w:type="gramEnd"/>
+      <w:r>
+        <w:rPr>
+          <w:rFonts w:ascii="Consolas" w:eastAsia="Consolas" w:hAnsi="Consolas" w:cs="Consolas"/>
+          <w:sz w:val="18"/>
+          <w:szCs w:val="18"/>
+        </w:rPr>
+        <w:t xml:space="preserve"> me, for I have sinned.</w:t>
       </w:r>
     </w:p>
     <w:p>
@@ -8538,7 +9448,25 @@
           <w:sz w:val="18"/>
           <w:szCs w:val="18"/>
         </w:rPr>
-        <w:t>take me under Your Refuge to my Father and bring me Eternal Salvation.</w:t>
+        <w:t xml:space="preserve">take me under Your Refuge to my </w:t>
+      </w:r>
+      <w:proofErr w:type="gramStart"/>
+      <w:r>
+        <w:rPr>
+          <w:rFonts w:ascii="Consolas" w:eastAsia="Consolas" w:hAnsi="Consolas" w:cs="Consolas"/>
+          <w:sz w:val="18"/>
+          <w:szCs w:val="18"/>
+        </w:rPr>
+        <w:t>Father</w:t>
+      </w:r>
+      <w:proofErr w:type="gramEnd"/>
+      <w:r>
+        <w:rPr>
+          <w:rFonts w:ascii="Consolas" w:eastAsia="Consolas" w:hAnsi="Consolas" w:cs="Consolas"/>
+          <w:sz w:val="18"/>
+          <w:szCs w:val="18"/>
+        </w:rPr>
+        <w:t xml:space="preserve"> and bring me Eternal Salvation.</w:t>
       </w:r>
     </w:p>
     <w:p>
@@ -8608,7 +9536,7 @@
       </w:r>
     </w:p>
     <w:sectPr>
-      <w:pgSz w:w="11906" w:h="16838"/>
+      <w:pgSz w:w="11906" w:h="16838" w:code="9"/>
       <w:pgMar w:top="720" w:right="720" w:bottom="720" w:left="720" w:header="708" w:footer="708" w:gutter="0"/>
       <w:cols w:space="720"/>
       <w:docGrid w:linePitch="360"/>

</xml_diff>